<commit_message>
Inventory Issue Return BOQ
</commit_message>
<xml_diff>
--- a/APLOS/POPResources/Templates/InventoryIssueReturn20204.docx
+++ b/APLOS/POPResources/Templates/InventoryIssueReturn20204.docx
@@ -1,6 +1,6 @@
 
 <file path=word/document.xml><?xml version="1.0" encoding="utf-8"?>
-<w:document xmlns:wpc="http://schemas.microsoft.com/office/word/2010/wordprocessingCanvas" xmlns:mc="http://schemas.openxmlformats.org/markup-compatibility/2006" xmlns:o="urn:schemas-microsoft-com:office:office" xmlns:r="http://schemas.openxmlformats.org/officeDocument/2006/relationships" xmlns:m="http://schemas.openxmlformats.org/officeDocument/2006/math" xmlns:v="urn:schemas-microsoft-com:vml" xmlns:wp14="http://schemas.microsoft.com/office/word/2010/wordprocessingDrawing" xmlns:wp="http://schemas.openxmlformats.org/drawingml/2006/wordprocessingDrawing" xmlns:w10="urn:schemas-microsoft-com:office:word" xmlns:w="http://schemas.openxmlformats.org/wordprocessingml/2006/main" xmlns:w14="http://schemas.microsoft.com/office/word/2010/wordml" xmlns:wpg="http://schemas.microsoft.com/office/word/2010/wordprocessingGroup" xmlns:wpi="http://schemas.microsoft.com/office/word/2010/wordprocessingInk" xmlns:wne="http://schemas.microsoft.com/office/word/2006/wordml" xmlns:wps="http://schemas.microsoft.com/office/word/2010/wordprocessingShape" mc:Ignorable="w14 wp14">
+<w:document xmlns:wpc="http://schemas.microsoft.com/office/word/2010/wordprocessingCanvas" xmlns:cx="http://schemas.microsoft.com/office/drawing/2014/chartex" xmlns:cx1="http://schemas.microsoft.com/office/drawing/2015/9/8/chartex" xmlns:cx2="http://schemas.microsoft.com/office/drawing/2015/10/21/chartex" xmlns:cx3="http://schemas.microsoft.com/office/drawing/2016/5/9/chartex" xmlns:cx4="http://schemas.microsoft.com/office/drawing/2016/5/10/chartex" xmlns:cx5="http://schemas.microsoft.com/office/drawing/2016/5/11/chartex" xmlns:cx6="http://schemas.microsoft.com/office/drawing/2016/5/12/chartex" xmlns:cx7="http://schemas.microsoft.com/office/drawing/2016/5/13/chartex" xmlns:cx8="http://schemas.microsoft.com/office/drawing/2016/5/14/chartex" xmlns:mc="http://schemas.openxmlformats.org/markup-compatibility/2006" xmlns:aink="http://schemas.microsoft.com/office/drawing/2016/ink" xmlns:am3d="http://schemas.microsoft.com/office/drawing/2017/model3d" xmlns:o="urn:schemas-microsoft-com:office:office" xmlns:oel="http://schemas.microsoft.com/office/2019/extlst" xmlns:r="http://schemas.openxmlformats.org/officeDocument/2006/relationships" xmlns:m="http://schemas.openxmlformats.org/officeDocument/2006/math" xmlns:v="urn:schemas-microsoft-com:vml" xmlns:wp14="http://schemas.microsoft.com/office/word/2010/wordprocessingDrawing" xmlns:wp="http://schemas.openxmlformats.org/drawingml/2006/wordprocessingDrawing" xmlns:w10="urn:schemas-microsoft-com:office:word" xmlns:w="http://schemas.openxmlformats.org/wordprocessingml/2006/main" xmlns:w14="http://schemas.microsoft.com/office/word/2010/wordml" xmlns:w15="http://schemas.microsoft.com/office/word/2012/wordml" xmlns:w16cex="http://schemas.microsoft.com/office/word/2018/wordml/cex" xmlns:w16cid="http://schemas.microsoft.com/office/word/2016/wordml/cid" xmlns:w16="http://schemas.microsoft.com/office/word/2018/wordml" xmlns:w16du="http://schemas.microsoft.com/office/word/2023/wordml/word16du" xmlns:w16sdtdh="http://schemas.microsoft.com/office/word/2020/wordml/sdtdatahash" xmlns:w16sdtfl="http://schemas.microsoft.com/office/word/2024/wordml/sdtformatlock" xmlns:w16se="http://schemas.microsoft.com/office/word/2015/wordml/symex" xmlns:wpg="http://schemas.microsoft.com/office/word/2010/wordprocessingGroup" xmlns:wpi="http://schemas.microsoft.com/office/word/2010/wordprocessingInk" xmlns:wne="http://schemas.microsoft.com/office/word/2006/wordml" xmlns:wps="http://schemas.microsoft.com/office/word/2010/wordprocessingShape" mc:Ignorable="w14 w15 w16se w16cid w16 w16cex w16sdtdh w16sdtfl w16du wp14">
   <w:body>
     <w:p>
       <w:pPr>
@@ -104,7 +104,6 @@
               </w:rPr>
               <w:t>{</w:t>
             </w:r>
-            <w:proofErr w:type="spellStart"/>
             <w:r>
               <w:rPr>
                 <w:rFonts w:ascii="Tahoma" w:hAnsi="Tahoma" w:cs="Tahoma"/>
@@ -113,9 +112,8 @@
                 <w:szCs w:val="16"/>
                 <w:highlight w:val="white"/>
               </w:rPr>
-              <w:t>IssueNo</w:t>
-            </w:r>
-            <w:proofErr w:type="spellEnd"/>
+              <w:t>IssueReturnNo</w:t>
+            </w:r>
             <w:r>
               <w:rPr>
                 <w:rFonts w:ascii="Tahoma" w:eastAsia="Arial" w:hAnsi="Tahoma" w:cs="Tahoma"/>
@@ -185,7 +183,6 @@
               </w:rPr>
               <w:t>{</w:t>
             </w:r>
-            <w:proofErr w:type="spellStart"/>
             <w:r>
               <w:rPr>
                 <w:rFonts w:ascii="Tahoma" w:hAnsi="Tahoma" w:cs="Tahoma"/>
@@ -195,7 +192,6 @@
               </w:rPr>
               <w:t>IssueType</w:t>
             </w:r>
-            <w:proofErr w:type="spellEnd"/>
             <w:r>
               <w:rPr>
                 <w:rFonts w:ascii="Tahoma" w:eastAsia="Arial" w:hAnsi="Tahoma" w:cs="Tahoma"/>
@@ -352,27 +348,7 @@
                 <w:sz w:val="16"/>
                 <w:szCs w:val="16"/>
               </w:rPr>
-              <w:t>{</w:t>
-            </w:r>
-            <w:proofErr w:type="spellStart"/>
-            <w:r>
-              <w:rPr>
-                <w:rFonts w:ascii="Tahoma" w:eastAsia="Times New Roman" w:hAnsi="Tahoma" w:cs="Tahoma"/>
-                <w:color w:val="000000"/>
-                <w:sz w:val="16"/>
-                <w:szCs w:val="16"/>
-              </w:rPr>
-              <w:t>poDate</w:t>
-            </w:r>
-            <w:proofErr w:type="spellEnd"/>
-            <w:r>
-              <w:rPr>
-                <w:rFonts w:ascii="Tahoma" w:eastAsia="Times New Roman" w:hAnsi="Tahoma" w:cs="Tahoma"/>
-                <w:color w:val="000000"/>
-                <w:sz w:val="16"/>
-                <w:szCs w:val="16"/>
-              </w:rPr>
-              <w:t>}</w:t>
+              <w:t>{poDate}</w:t>
             </w:r>
           </w:p>
           <w:p>
@@ -419,10 +395,11 @@
                 <w:sz w:val="16"/>
                 <w:szCs w:val="16"/>
               </w:rPr>
-              <w:t>{</w:t>
-            </w:r>
-            <w:proofErr w:type="spellStart"/>
-            <w:r>
+              <w:t>{materialItems}</w:t>
+            </w:r>
+          </w:p>
+          <w:p>
+            <w:pPr>
               <w:rPr>
                 <w:rFonts w:ascii="Tahoma" w:eastAsia="Arial" w:hAnsi="Tahoma" w:cs="Tahoma"/>
                 <w:b/>
@@ -430,9 +407,7 @@
                 <w:sz w:val="16"/>
                 <w:szCs w:val="16"/>
               </w:rPr>
-              <w:t>materialItems</w:t>
-            </w:r>
-            <w:proofErr w:type="spellEnd"/>
+            </w:pPr>
             <w:r>
               <w:rPr>
                 <w:rFonts w:ascii="Tahoma" w:eastAsia="Arial" w:hAnsi="Tahoma" w:cs="Tahoma"/>
@@ -441,50 +416,7 @@
                 <w:sz w:val="16"/>
                 <w:szCs w:val="16"/>
               </w:rPr>
-              <w:t>}</w:t>
-            </w:r>
-          </w:p>
-          <w:p>
-            <w:pPr>
-              <w:rPr>
-                <w:rFonts w:ascii="Tahoma" w:eastAsia="Arial" w:hAnsi="Tahoma" w:cs="Tahoma"/>
-                <w:b/>
-                <w:bCs/>
-                <w:sz w:val="16"/>
-                <w:szCs w:val="16"/>
-              </w:rPr>
-            </w:pPr>
-            <w:r>
-              <w:rPr>
-                <w:rFonts w:ascii="Tahoma" w:eastAsia="Arial" w:hAnsi="Tahoma" w:cs="Tahoma"/>
-                <w:b/>
-                <w:bCs/>
-                <w:sz w:val="16"/>
-                <w:szCs w:val="16"/>
-              </w:rPr>
-              <w:t>{</w:t>
-            </w:r>
-            <w:proofErr w:type="spellStart"/>
-            <w:r>
-              <w:rPr>
-                <w:rFonts w:ascii="Tahoma" w:eastAsia="Arial" w:hAnsi="Tahoma" w:cs="Tahoma"/>
-                <w:b/>
-                <w:bCs/>
-                <w:sz w:val="16"/>
-                <w:szCs w:val="16"/>
-              </w:rPr>
-              <w:t>ServiceItems</w:t>
-            </w:r>
-            <w:proofErr w:type="spellEnd"/>
-            <w:r>
-              <w:rPr>
-                <w:rFonts w:ascii="Tahoma" w:eastAsia="Arial" w:hAnsi="Tahoma" w:cs="Tahoma"/>
-                <w:b/>
-                <w:bCs/>
-                <w:sz w:val="16"/>
-                <w:szCs w:val="16"/>
-              </w:rPr>
-              <w:t>}</w:t>
+              <w:t>{ServiceItems}</w:t>
             </w:r>
           </w:p>
           <w:p>
@@ -528,7 +460,6 @@
             <w:pPr>
               <w:rPr>
                 <w:rFonts w:ascii="Tahoma" w:hAnsi="Tahoma" w:cs="Tahoma"/>
-                <w:b/>
                 <w:sz w:val="16"/>
                 <w:szCs w:val="16"/>
                 <w:u w:val="single"/>
@@ -543,9 +474,28 @@
                 <w:szCs w:val="16"/>
                 <w:u w:val="single"/>
               </w:rPr>
-              <w:t xml:space="preserve">KINDLY SIGN </w:t>
-            </w:r>
-            <w:proofErr w:type="gramStart"/>
+              <w:t xml:space="preserve">KINDLY SIGN THIS </w:t>
+            </w:r>
+            <w:r>
+              <w:rPr>
+                <w:rFonts w:ascii="Tahoma" w:hAnsi="Tahoma" w:cs="Tahoma"/>
+                <w:b/>
+                <w:bCs/>
+                <w:sz w:val="16"/>
+                <w:szCs w:val="16"/>
+                <w:u w:val="single"/>
+              </w:rPr>
+              <w:t>INVENTORY RECEIVE</w:t>
+            </w:r>
+            <w:r>
+              <w:rPr>
+                <w:rFonts w:ascii="Tahoma" w:hAnsi="Tahoma" w:cs="Tahoma"/>
+                <w:sz w:val="16"/>
+                <w:szCs w:val="16"/>
+                <w:u w:val="single"/>
+              </w:rPr>
+              <w:t xml:space="preserve"> </w:t>
+            </w:r>
             <w:r>
               <w:rPr>
                 <w:rFonts w:ascii="Tahoma" w:eastAsia="Arial" w:hAnsi="Tahoma" w:cs="Tahoma"/>
@@ -555,28 +505,7 @@
                 <w:szCs w:val="16"/>
                 <w:u w:val="single"/>
               </w:rPr>
-              <w:t xml:space="preserve">THIS </w:t>
-            </w:r>
-            <w:r>
-              <w:rPr>
-                <w:rFonts w:ascii="Tahoma" w:hAnsi="Tahoma" w:cs="Tahoma"/>
-                <w:b/>
-                <w:sz w:val="16"/>
-                <w:szCs w:val="16"/>
-                <w:u w:val="single"/>
-              </w:rPr>
-              <w:t xml:space="preserve"> Inventory</w:t>
-            </w:r>
-            <w:proofErr w:type="gramEnd"/>
-            <w:r>
-              <w:rPr>
-                <w:rFonts w:ascii="Tahoma" w:hAnsi="Tahoma" w:cs="Tahoma"/>
-                <w:b/>
-                <w:sz w:val="16"/>
-                <w:szCs w:val="16"/>
-                <w:u w:val="single"/>
-              </w:rPr>
-              <w:t xml:space="preserve"> Issue Return</w:t>
+              <w:t>ORDER AND SEND US BACK BY EMAI</w:t>
             </w:r>
             <w:r>
               <w:rPr>
@@ -587,22 +516,25 @@
                 <w:szCs w:val="16"/>
                 <w:u w:val="single"/>
               </w:rPr>
-              <w:t xml:space="preserve"> AND MAIL  US BACK ON +91-11-45020030/+91-11-25227023.</w:t>
+              <w:t>L</w:t>
+            </w:r>
+            <w:r>
+              <w:rPr>
+                <w:rFonts w:ascii="Tahoma" w:eastAsia="Arial" w:hAnsi="Tahoma" w:cs="Tahoma"/>
+                <w:b/>
+                <w:bCs/>
+                <w:sz w:val="16"/>
+                <w:szCs w:val="16"/>
+                <w:u w:val="single"/>
+              </w:rPr>
+              <w:t>.</w:t>
             </w:r>
           </w:p>
-          <w:p>
-            <w:pPr>
-              <w:rPr>
-                <w:rFonts w:ascii="Tahoma" w:hAnsi="Tahoma" w:cs="Tahoma"/>
-                <w:sz w:val="16"/>
-                <w:szCs w:val="16"/>
-              </w:rPr>
-            </w:pPr>
-          </w:p>
+          <w:p/>
           <w:tbl>
             <w:tblPr>
               <w:tblStyle w:val="TableGrid"/>
-              <w:tblpPr w:leftFromText="180" w:rightFromText="180" w:vertAnchor="text" w:horzAnchor="page" w:tblpXSpec="center" w:tblpY="142"/>
+              <w:tblpPr w:leftFromText="180" w:rightFromText="180" w:vertAnchor="text" w:horzAnchor="margin" w:tblpY="80"/>
               <w:tblOverlap w:val="never"/>
               <w:tblW w:w="0" w:type="auto"/>
               <w:tblBorders>
@@ -616,16 +548,15 @@
               <w:tblLook w:val="04A0" w:firstRow="1" w:lastRow="0" w:firstColumn="1" w:lastColumn="0" w:noHBand="0" w:noVBand="1"/>
             </w:tblPr>
             <w:tblGrid>
-              <w:gridCol w:w="5561"/>
-              <w:gridCol w:w="5562"/>
+              <w:gridCol w:w="2787"/>
             </w:tblGrid>
             <w:tr>
               <w:trPr>
-                <w:trHeight w:val="63"/>
+                <w:trHeight w:val="1166"/>
               </w:trPr>
               <w:tc>
                 <w:tcPr>
-                  <w:tcW w:w="5561" w:type="dxa"/>
+                  <w:tcW w:w="2787" w:type="dxa"/>
                 </w:tcPr>
                 <w:p>
                   <w:pPr>
@@ -670,62 +601,35 @@
                 <w:p>
                   <w:pPr>
                     <w:jc w:val="center"/>
+                  </w:pPr>
+                  <w:r>
                     <w:rPr>
-                      <w:rFonts w:ascii="Tahoma" w:eastAsia="Arial" w:hAnsi="Tahoma" w:cs="Tahoma"/>
+                      <w:rFonts w:ascii="Tahoma" w:hAnsi="Tahoma" w:cs="Tahoma"/>
+                      <w:b/>
+                      <w:color w:val="000000" w:themeColor="text1"/>
+                      <w:sz w:val="16"/>
+                      <w:szCs w:val="16"/>
+                    </w:rPr>
+                    <w:t>Auburn</w:t>
+                  </w:r>
+                  <w:r>
+                    <w:rPr>
+                      <w:rFonts w:ascii="Tahoma" w:hAnsi="Tahoma" w:cs="Tahoma"/>
                       <w:b/>
                       <w:bCs/>
                       <w:sz w:val="16"/>
                       <w:szCs w:val="16"/>
+                      <w:shd w:val="clear" w:color="auto" w:fill="FFFFFF"/>
                     </w:rPr>
-                  </w:pPr>
-                  <w:r>
-                    <w:rPr>
-                      <w:rFonts w:ascii="Tahoma" w:eastAsia="Arial" w:hAnsi="Tahoma" w:cs="Tahoma"/>
-                      <w:b/>
-                      <w:bCs/>
-                      <w:sz w:val="16"/>
-                      <w:szCs w:val="16"/>
-                    </w:rPr>
-                    <w:t xml:space="preserve">For ODYSSEY </w:t>
-                  </w:r>
-                  <w:proofErr w:type="gramStart"/>
-                  <w:r>
-                    <w:rPr>
-                      <w:rFonts w:ascii="Tahoma" w:eastAsia="Arial" w:hAnsi="Tahoma" w:cs="Tahoma"/>
-                      <w:b/>
-                      <w:bCs/>
-                      <w:sz w:val="16"/>
-                      <w:szCs w:val="16"/>
-                    </w:rPr>
-                    <w:t>CRAFT(</w:t>
-                  </w:r>
-                  <w:proofErr w:type="gramEnd"/>
-                  <w:r>
-                    <w:rPr>
-                      <w:rFonts w:ascii="Tahoma" w:eastAsia="Arial" w:hAnsi="Tahoma" w:cs="Tahoma"/>
-                      <w:b/>
-                      <w:bCs/>
-                      <w:sz w:val="16"/>
-                      <w:szCs w:val="16"/>
-                    </w:rPr>
-                    <w:t>PVT.) LTD.</w:t>
+                    <w:t xml:space="preserve"> Design Private Limited</w:t>
                   </w:r>
                 </w:p>
                 <w:p>
                   <w:pPr>
+                    <w:jc w:val="center"/>
                     <w:rPr>
                       <w:rFonts w:ascii="Tahoma" w:eastAsia="Arial" w:hAnsi="Tahoma" w:cs="Tahoma"/>
                       <w:b/>
-                      <w:bCs/>
-                      <w:sz w:val="16"/>
-                      <w:szCs w:val="16"/>
-                    </w:rPr>
-                  </w:pPr>
-                </w:p>
-                <w:p>
-                  <w:pPr>
-                    <w:rPr>
-                      <w:rFonts w:ascii="Tahoma" w:eastAsia="Arial" w:hAnsi="Tahoma" w:cs="Tahoma"/>
                       <w:bCs/>
                       <w:sz w:val="16"/>
                       <w:szCs w:val="16"/>
@@ -741,116 +645,6 @@
                       <w:bCs/>
                       <w:sz w:val="16"/>
                       <w:szCs w:val="16"/>
-                      <w:u w:val="single"/>
-                    </w:rPr>
-                  </w:pPr>
-                  <w:r>
-                    <w:rPr>
-                      <w:rFonts w:ascii="Tahoma" w:eastAsia="Arial" w:hAnsi="Tahoma" w:cs="Tahoma"/>
-                      <w:bCs/>
-                      <w:sz w:val="16"/>
-                      <w:szCs w:val="16"/>
-                    </w:rPr>
-                    <w:t>Authorized Signature</w:t>
-                  </w:r>
-                </w:p>
-              </w:tc>
-              <w:tc>
-                <w:tcPr>
-                  <w:tcW w:w="5562" w:type="dxa"/>
-                </w:tcPr>
-                <w:p>
-                  <w:pPr>
-                    <w:jc w:val="center"/>
-                    <w:rPr>
-                      <w:rFonts w:ascii="Tahoma" w:eastAsia="Arial" w:hAnsi="Tahoma" w:cs="Tahoma"/>
-                      <w:b/>
-                      <w:bCs/>
-                      <w:sz w:val="16"/>
-                      <w:szCs w:val="16"/>
-                      <w:u w:val="single"/>
-                    </w:rPr>
-                  </w:pPr>
-                </w:p>
-                <w:p>
-                  <w:pPr>
-                    <w:jc w:val="center"/>
-                    <w:rPr>
-                      <w:rFonts w:ascii="Tahoma" w:eastAsia="Arial" w:hAnsi="Tahoma" w:cs="Tahoma"/>
-                      <w:b/>
-                      <w:bCs/>
-                      <w:sz w:val="16"/>
-                      <w:szCs w:val="16"/>
-                    </w:rPr>
-                  </w:pPr>
-                  <w:r>
-                    <w:rPr>
-                      <w:rFonts w:ascii="Tahoma" w:eastAsia="Arial" w:hAnsi="Tahoma" w:cs="Tahoma"/>
-                      <w:b/>
-                      <w:bCs/>
-                      <w:sz w:val="16"/>
-                      <w:szCs w:val="16"/>
-                    </w:rPr>
-                    <w:t>For {</w:t>
-                  </w:r>
-                  <w:proofErr w:type="spellStart"/>
-                  <w:r>
-                    <w:rPr>
-                      <w:rFonts w:ascii="Tahoma" w:eastAsia="Arial" w:hAnsi="Tahoma" w:cs="Tahoma"/>
-                      <w:b/>
-                      <w:bCs/>
-                      <w:sz w:val="16"/>
-                      <w:szCs w:val="16"/>
-                    </w:rPr>
-                    <w:t>VendorName</w:t>
-                  </w:r>
-                  <w:proofErr w:type="spellEnd"/>
-                  <w:r>
-                    <w:rPr>
-                      <w:rFonts w:ascii="Tahoma" w:eastAsia="Arial" w:hAnsi="Tahoma" w:cs="Tahoma"/>
-                      <w:b/>
-                      <w:bCs/>
-                      <w:sz w:val="16"/>
-                      <w:szCs w:val="16"/>
-                    </w:rPr>
-                    <w:t>}</w:t>
-                  </w:r>
-                </w:p>
-                <w:p>
-                  <w:pPr>
-                    <w:rPr>
-                      <w:rFonts w:ascii="Tahoma" w:eastAsia="Arial" w:hAnsi="Tahoma" w:cs="Tahoma"/>
-                      <w:b/>
-                      <w:bCs/>
-                      <w:sz w:val="16"/>
-                      <w:szCs w:val="16"/>
-                      <w:u w:val="single"/>
-                    </w:rPr>
-                  </w:pPr>
-                </w:p>
-                <w:p>
-                  <w:pPr>
-                    <w:jc w:val="center"/>
-                    <w:rPr>
-                      <w:rFonts w:ascii="Tahoma" w:eastAsia="Arial" w:hAnsi="Tahoma" w:cs="Tahoma"/>
-                      <w:b/>
-                      <w:bCs/>
-                      <w:sz w:val="16"/>
-                      <w:szCs w:val="16"/>
-                      <w:u w:val="single"/>
-                    </w:rPr>
-                  </w:pPr>
-                </w:p>
-                <w:p>
-                  <w:pPr>
-                    <w:jc w:val="center"/>
-                    <w:rPr>
-                      <w:rFonts w:ascii="Tahoma" w:eastAsia="Arial" w:hAnsi="Tahoma" w:cs="Tahoma"/>
-                      <w:b/>
-                      <w:bCs/>
-                      <w:sz w:val="16"/>
-                      <w:szCs w:val="16"/>
-                      <w:u w:val="single"/>
                     </w:rPr>
                   </w:pPr>
                 </w:p>
@@ -871,7 +665,7 @@
                       <w:sz w:val="16"/>
                       <w:szCs w:val="16"/>
                     </w:rPr>
-                    <w:t>Signature With Stamp</w:t>
+                    <w:t>Authorized Signature</w:t>
                   </w:r>
                 </w:p>
               </w:tc>
@@ -1028,7 +822,7 @@
                       </mc:Choice>
                       <mc:Fallback>
                         <w:pict>
-                          <v:line id="Straight Connector 5" o:spid="_x0000_s1026" style="position:absolute;flip:x;z-index:251661312;visibility:visible;mso-wrap-style:square;mso-width-percent:0;mso-height-percent:0;mso-wrap-distance-left:9pt;mso-wrap-distance-top:0;mso-wrap-distance-right:9pt;mso-wrap-distance-bottom:0;mso-position-horizontal:absolute;mso-position-horizontal-relative:text;mso-position-vertical:absolute;mso-position-vertical-relative:text;mso-width-percent:0;mso-height-percent:0;mso-width-relative:margin;mso-height-relative:margin" from="30.2pt,8.35pt" to="139.75pt,8.35pt" o:gfxdata="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" strokecolor="black [3213]" strokeweight=".5pt">
+                          <v:line w14:anchorId="346EE6C3" id="Straight Connector 5" o:spid="_x0000_s1026" style="position:absolute;flip:x;z-index:251661312;visibility:visible;mso-wrap-style:square;mso-width-percent:0;mso-height-percent:0;mso-wrap-distance-left:9pt;mso-wrap-distance-top:0;mso-wrap-distance-right:9pt;mso-wrap-distance-bottom:0;mso-position-horizontal:absolute;mso-position-horizontal-relative:text;mso-position-vertical:absolute;mso-position-vertical-relative:text;mso-width-percent:0;mso-height-percent:0;mso-width-relative:margin;mso-height-relative:margin" from="30.2pt,8.35pt" to="139.75pt,8.35pt" o:gfxdata="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" strokecolor="black [3213]" strokeweight=".5pt">
                             <v:stroke joinstyle="miter"/>
                           </v:line>
                         </w:pict>
@@ -1044,7 +838,6 @@
                     </w:rPr>
                     <w:t>{</w:t>
                   </w:r>
-                  <w:proofErr w:type="spellStart"/>
                   <w:r>
                     <w:rPr>
                       <w:rFonts w:ascii="Tahoma" w:hAnsi="Tahoma" w:cs="Tahoma"/>
@@ -1055,7 +848,6 @@
                     </w:rPr>
                     <w:t>AddedBy</w:t>
                   </w:r>
-                  <w:proofErr w:type="spellEnd"/>
                   <w:r>
                     <w:rPr>
                       <w:rFonts w:ascii="Tahoma" w:eastAsia="Arial" w:hAnsi="Tahoma" w:cs="Tahoma"/>
@@ -1150,7 +942,7 @@
                       </mc:Choice>
                       <mc:Fallback>
                         <w:pict>
-                          <v:line id="Straight Connector 6" o:spid="_x0000_s1026" style="position:absolute;z-index:251662336;visibility:visible;mso-wrap-style:square;mso-width-percent:0;mso-wrap-distance-left:9pt;mso-wrap-distance-top:0;mso-wrap-distance-right:9pt;mso-wrap-distance-bottom:0;mso-position-horizontal:absolute;mso-position-horizontal-relative:text;mso-position-vertical:absolute;mso-position-vertical-relative:text;mso-width-percent:0;mso-width-relative:margin" from="23.5pt,8.35pt" to="143.7pt,8.35pt" o:gfxdata="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" strokecolor="black [3213]" strokeweight=".5pt">
+                          <v:line w14:anchorId="516ADA37" id="Straight Connector 6" o:spid="_x0000_s1026" style="position:absolute;z-index:251662336;visibility:visible;mso-wrap-style:square;mso-width-percent:0;mso-wrap-distance-left:9pt;mso-wrap-distance-top:0;mso-wrap-distance-right:9pt;mso-wrap-distance-bottom:0;mso-position-horizontal:absolute;mso-position-horizontal-relative:text;mso-position-vertical:absolute;mso-position-vertical-relative:text;mso-width-percent:0;mso-width-relative:margin" from="23.5pt,8.35pt" to="143.7pt,8.35pt" o:gfxdata="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" strokecolor="black [3213]" strokeweight=".5pt">
                             <v:stroke joinstyle="miter"/>
                           </v:line>
                         </w:pict>
@@ -1166,7 +958,6 @@
                     </w:rPr>
                     <w:t xml:space="preserve">       {</w:t>
                   </w:r>
-                  <w:proofErr w:type="spellStart"/>
                   <w:r>
                     <w:rPr>
                       <w:rFonts w:ascii="Tahoma" w:hAnsi="Tahoma" w:cs="Tahoma"/>
@@ -1177,7 +968,6 @@
                     </w:rPr>
                     <w:t>CheckedByName</w:t>
                   </w:r>
-                  <w:proofErr w:type="spellEnd"/>
                   <w:r>
                     <w:rPr>
                       <w:rFonts w:ascii="Tahoma" w:eastAsia="Arial" w:hAnsi="Tahoma" w:cs="Tahoma"/>
@@ -1269,7 +1059,7 @@
                       </mc:Choice>
                       <mc:Fallback>
                         <w:pict>
-                          <v:line id="Straight Connector 7" o:spid="_x0000_s1026" style="position:absolute;z-index:251663360;visibility:visible;mso-wrap-style:square;mso-wrap-distance-left:9pt;mso-wrap-distance-top:0;mso-wrap-distance-right:9pt;mso-wrap-distance-bottom:0;mso-position-horizontal:absolute;mso-position-horizontal-relative:text;mso-position-vertical:absolute;mso-position-vertical-relative:text" from="31.2pt,8.35pt" to="143.25pt,8.35pt" o:gfxdata="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" strokecolor="black [3213]" strokeweight=".5pt">
+                          <v:line w14:anchorId="7D57E655" id="Straight Connector 7" o:spid="_x0000_s1026" style="position:absolute;z-index:251663360;visibility:visible;mso-wrap-style:square;mso-wrap-distance-left:9pt;mso-wrap-distance-top:0;mso-wrap-distance-right:9pt;mso-wrap-distance-bottom:0;mso-position-horizontal:absolute;mso-position-horizontal-relative:text;mso-position-vertical:absolute;mso-position-vertical-relative:text" from="31.2pt,8.35pt" to="143.25pt,8.35pt" o:gfxdata="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" strokecolor="black [3213]" strokeweight=".5pt">
                             <v:stroke joinstyle="miter"/>
                           </v:line>
                         </w:pict>
@@ -1285,7 +1075,6 @@
                     </w:rPr>
                     <w:t xml:space="preserve">           {</w:t>
                   </w:r>
-                  <w:proofErr w:type="spellStart"/>
                   <w:r>
                     <w:rPr>
                       <w:rFonts w:ascii="Tahoma" w:hAnsi="Tahoma" w:cs="Tahoma"/>
@@ -1296,7 +1085,6 @@
                     </w:rPr>
                     <w:t>AuthorizedByName</w:t>
                   </w:r>
-                  <w:proofErr w:type="spellEnd"/>
                   <w:r>
                     <w:rPr>
                       <w:rFonts w:ascii="Tahoma" w:eastAsia="Arial" w:hAnsi="Tahoma" w:cs="Tahoma"/>
@@ -1518,7 +1306,7 @@
           </mc:Choice>
           <mc:Fallback>
             <w:pict>
-              <v:shapetype id="_x0000_t176" coordsize="21600,21600" o:spt="176" adj="2700" path="m@0,qx0@0l0@2qy@0,21600l@1,21600qx21600@2l21600@0qy@1,xe">
+              <v:shapetype w14:anchorId="7136B2F5" id="_x0000_t176" coordsize="21600,21600" o:spt="176" adj="2700" path="m@0,qx0@0l0@2qy@0,21600l@1,21600qx21600@2l21600@0qy@1,xe">
                 <v:stroke joinstyle="miter"/>
                 <v:formulas>
                   <v:f eqn="val #0"/>
@@ -1534,7 +1322,7 @@
                 </v:formulas>
                 <v:path gradientshapeok="t" limo="10800,10800" o:connecttype="custom" o:connectlocs="@8,0;0,@9;@8,@7;@6,@9" textboxrect="@3,@3,@4,@5"/>
               </v:shapetype>
-              <v:shape id="Flowchart: Alternate Process 1" o:spid="_x0000_s1026" type="#_x0000_t176" style="position:absolute;margin-left:3.75pt;margin-top:.8pt;width:289.5pt;height:21.75pt;z-index:251659264;visibility:visible;mso-wrap-style:square;mso-height-percent:0;mso-wrap-distance-left:9pt;mso-wrap-distance-top:0;mso-wrap-distance-right:9pt;mso-wrap-distance-bottom:0;mso-position-horizontal:absolute;mso-position-horizontal-relative:text;mso-position-vertical:absolute;mso-position-vertical-relative:text;mso-height-percent:0;mso-height-relative:margin;v-text-anchor:middle" o:gfxdata="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" fillcolor="white [3201]" strokecolor="white [3212]" strokeweight="1pt">
+              <v:shape id="Flowchart: Alternate Process 1" o:spid="_x0000_s1026" type="#_x0000_t176" style="position:absolute;margin-left:3.75pt;margin-top:.8pt;width:289.5pt;height:21.75pt;z-index:251659264;visibility:visible;mso-wrap-style:square;mso-height-percent:0;mso-wrap-distance-left:9pt;mso-wrap-distance-top:0;mso-wrap-distance-right:9pt;mso-wrap-distance-bottom:0;mso-position-horizontal:absolute;mso-position-horizontal-relative:text;mso-position-vertical:absolute;mso-position-vertical-relative:text;mso-height-percent:0;mso-height-relative:margin;v-text-anchor:middle" o:gfxdata="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" fillcolor="white [3201]" strokecolor="white [3212]" strokeweight="1pt">
                 <v:textbox>
                   <w:txbxContent>
                     <w:p>
@@ -1577,12 +1365,8 @@
       </w:pPr>
     </w:p>
     <w:sectPr>
-      <w:headerReference w:type="even" r:id="rId9"/>
-      <w:headerReference w:type="default" r:id="rId10"/>
-      <w:footerReference w:type="even" r:id="rId11"/>
-      <w:footerReference w:type="default" r:id="rId12"/>
-      <w:headerReference w:type="first" r:id="rId13"/>
-      <w:footerReference w:type="first" r:id="rId14"/>
+      <w:headerReference w:type="default" r:id="rId8"/>
+      <w:footerReference w:type="default" r:id="rId9"/>
       <w:pgSz w:w="20160" w:h="12240" w:orient="landscape" w:code="5"/>
       <w:pgMar w:top="1800" w:right="1440" w:bottom="1800" w:left="1440" w:header="0" w:footer="144" w:gutter="0"/>
       <w:cols w:space="720"/>
@@ -1593,7 +1377,7 @@
 </file>
 
 <file path=word/endnotes.xml><?xml version="1.0" encoding="utf-8"?>
-<w:endnotes xmlns:wpc="http://schemas.microsoft.com/office/word/2010/wordprocessingCanvas" xmlns:mc="http://schemas.openxmlformats.org/markup-compatibility/2006" xmlns:o="urn:schemas-microsoft-com:office:office" xmlns:r="http://schemas.openxmlformats.org/officeDocument/2006/relationships" xmlns:m="http://schemas.openxmlformats.org/officeDocument/2006/math" xmlns:v="urn:schemas-microsoft-com:vml" xmlns:wp14="http://schemas.microsoft.com/office/word/2010/wordprocessingDrawing" xmlns:wp="http://schemas.openxmlformats.org/drawingml/2006/wordprocessingDrawing" xmlns:w10="urn:schemas-microsoft-com:office:word" xmlns:w="http://schemas.openxmlformats.org/wordprocessingml/2006/main" xmlns:w14="http://schemas.microsoft.com/office/word/2010/wordml" xmlns:wpg="http://schemas.microsoft.com/office/word/2010/wordprocessingGroup" xmlns:wpi="http://schemas.microsoft.com/office/word/2010/wordprocessingInk" xmlns:wne="http://schemas.microsoft.com/office/word/2006/wordml" xmlns:wps="http://schemas.microsoft.com/office/word/2010/wordprocessingShape" mc:Ignorable="w14 wp14">
+<w:endnotes xmlns:wpc="http://schemas.microsoft.com/office/word/2010/wordprocessingCanvas" xmlns:cx="http://schemas.microsoft.com/office/drawing/2014/chartex" xmlns:cx1="http://schemas.microsoft.com/office/drawing/2015/9/8/chartex" xmlns:cx2="http://schemas.microsoft.com/office/drawing/2015/10/21/chartex" xmlns:cx3="http://schemas.microsoft.com/office/drawing/2016/5/9/chartex" xmlns:cx4="http://schemas.microsoft.com/office/drawing/2016/5/10/chartex" xmlns:cx5="http://schemas.microsoft.com/office/drawing/2016/5/11/chartex" xmlns:cx6="http://schemas.microsoft.com/office/drawing/2016/5/12/chartex" xmlns:cx7="http://schemas.microsoft.com/office/drawing/2016/5/13/chartex" xmlns:cx8="http://schemas.microsoft.com/office/drawing/2016/5/14/chartex" xmlns:mc="http://schemas.openxmlformats.org/markup-compatibility/2006" xmlns:aink="http://schemas.microsoft.com/office/drawing/2016/ink" xmlns:am3d="http://schemas.microsoft.com/office/drawing/2017/model3d" xmlns:o="urn:schemas-microsoft-com:office:office" xmlns:oel="http://schemas.microsoft.com/office/2019/extlst" xmlns:r="http://schemas.openxmlformats.org/officeDocument/2006/relationships" xmlns:m="http://schemas.openxmlformats.org/officeDocument/2006/math" xmlns:v="urn:schemas-microsoft-com:vml" xmlns:wp14="http://schemas.microsoft.com/office/word/2010/wordprocessingDrawing" xmlns:wp="http://schemas.openxmlformats.org/drawingml/2006/wordprocessingDrawing" xmlns:w10="urn:schemas-microsoft-com:office:word" xmlns:w="http://schemas.openxmlformats.org/wordprocessingml/2006/main" xmlns:w14="http://schemas.microsoft.com/office/word/2010/wordml" xmlns:w15="http://schemas.microsoft.com/office/word/2012/wordml" xmlns:w16cex="http://schemas.microsoft.com/office/word/2018/wordml/cex" xmlns:w16cid="http://schemas.microsoft.com/office/word/2016/wordml/cid" xmlns:w16="http://schemas.microsoft.com/office/word/2018/wordml" xmlns:w16du="http://schemas.microsoft.com/office/word/2023/wordml/word16du" xmlns:w16sdtdh="http://schemas.microsoft.com/office/word/2020/wordml/sdtdatahash" xmlns:w16sdtfl="http://schemas.microsoft.com/office/word/2024/wordml/sdtformatlock" xmlns:w16se="http://schemas.microsoft.com/office/word/2015/wordml/symex" xmlns:wpg="http://schemas.microsoft.com/office/word/2010/wordprocessingGroup" xmlns:wpi="http://schemas.microsoft.com/office/word/2010/wordprocessingInk" xmlns:wne="http://schemas.microsoft.com/office/word/2006/wordml" xmlns:wps="http://schemas.microsoft.com/office/word/2010/wordprocessingShape" mc:Ignorable="w14 w15 w16se w16cid w16 w16cex w16sdtdh w16sdtfl w16du wp14">
   <w:endnote w:type="separator" w:id="-1">
     <w:p>
       <w:r>
@@ -1612,17 +1396,7 @@
 </file>
 
 <file path=word/footer1.xml><?xml version="1.0" encoding="utf-8"?>
-<w:ftr xmlns:wpc="http://schemas.microsoft.com/office/word/2010/wordprocessingCanvas" xmlns:mc="http://schemas.openxmlformats.org/markup-compatibility/2006" xmlns:o="urn:schemas-microsoft-com:office:office" xmlns:r="http://schemas.openxmlformats.org/officeDocument/2006/relationships" xmlns:m="http://schemas.openxmlformats.org/officeDocument/2006/math" xmlns:v="urn:schemas-microsoft-com:vml" xmlns:wp14="http://schemas.microsoft.com/office/word/2010/wordprocessingDrawing" xmlns:wp="http://schemas.openxmlformats.org/drawingml/2006/wordprocessingDrawing" xmlns:w10="urn:schemas-microsoft-com:office:word" xmlns:w="http://schemas.openxmlformats.org/wordprocessingml/2006/main" xmlns:w14="http://schemas.microsoft.com/office/word/2010/wordml" xmlns:wpg="http://schemas.microsoft.com/office/word/2010/wordprocessingGroup" xmlns:wpi="http://schemas.microsoft.com/office/word/2010/wordprocessingInk" xmlns:wne="http://schemas.microsoft.com/office/word/2006/wordml" xmlns:wps="http://schemas.microsoft.com/office/word/2010/wordprocessingShape" mc:Ignorable="w14 wp14">
-  <w:p>
-    <w:pPr>
-      <w:pStyle w:val="Footer"/>
-    </w:pPr>
-  </w:p>
-</w:ftr>
-</file>
-
-<file path=word/footer2.xml><?xml version="1.0" encoding="utf-8"?>
-<w:ftr xmlns:wpc="http://schemas.microsoft.com/office/word/2010/wordprocessingCanvas" xmlns:mc="http://schemas.openxmlformats.org/markup-compatibility/2006" xmlns:o="urn:schemas-microsoft-com:office:office" xmlns:r="http://schemas.openxmlformats.org/officeDocument/2006/relationships" xmlns:m="http://schemas.openxmlformats.org/officeDocument/2006/math" xmlns:v="urn:schemas-microsoft-com:vml" xmlns:wp14="http://schemas.microsoft.com/office/word/2010/wordprocessingDrawing" xmlns:wp="http://schemas.openxmlformats.org/drawingml/2006/wordprocessingDrawing" xmlns:w10="urn:schemas-microsoft-com:office:word" xmlns:w="http://schemas.openxmlformats.org/wordprocessingml/2006/main" xmlns:w14="http://schemas.microsoft.com/office/word/2010/wordml" xmlns:wpg="http://schemas.microsoft.com/office/word/2010/wordprocessingGroup" xmlns:wpi="http://schemas.microsoft.com/office/word/2010/wordprocessingInk" xmlns:wne="http://schemas.microsoft.com/office/word/2006/wordml" xmlns:wps="http://schemas.microsoft.com/office/word/2010/wordprocessingShape" mc:Ignorable="w14 wp14">
+<w:ftr xmlns:wpc="http://schemas.microsoft.com/office/word/2010/wordprocessingCanvas" xmlns:cx="http://schemas.microsoft.com/office/drawing/2014/chartex" xmlns:cx1="http://schemas.microsoft.com/office/drawing/2015/9/8/chartex" xmlns:cx2="http://schemas.microsoft.com/office/drawing/2015/10/21/chartex" xmlns:cx3="http://schemas.microsoft.com/office/drawing/2016/5/9/chartex" xmlns:cx4="http://schemas.microsoft.com/office/drawing/2016/5/10/chartex" xmlns:cx5="http://schemas.microsoft.com/office/drawing/2016/5/11/chartex" xmlns:cx6="http://schemas.microsoft.com/office/drawing/2016/5/12/chartex" xmlns:cx7="http://schemas.microsoft.com/office/drawing/2016/5/13/chartex" xmlns:cx8="http://schemas.microsoft.com/office/drawing/2016/5/14/chartex" xmlns:mc="http://schemas.openxmlformats.org/markup-compatibility/2006" xmlns:aink="http://schemas.microsoft.com/office/drawing/2016/ink" xmlns:am3d="http://schemas.microsoft.com/office/drawing/2017/model3d" xmlns:o="urn:schemas-microsoft-com:office:office" xmlns:oel="http://schemas.microsoft.com/office/2019/extlst" xmlns:r="http://schemas.openxmlformats.org/officeDocument/2006/relationships" xmlns:m="http://schemas.openxmlformats.org/officeDocument/2006/math" xmlns:v="urn:schemas-microsoft-com:vml" xmlns:wp14="http://schemas.microsoft.com/office/word/2010/wordprocessingDrawing" xmlns:wp="http://schemas.openxmlformats.org/drawingml/2006/wordprocessingDrawing" xmlns:w10="urn:schemas-microsoft-com:office:word" xmlns:w="http://schemas.openxmlformats.org/wordprocessingml/2006/main" xmlns:w14="http://schemas.microsoft.com/office/word/2010/wordml" xmlns:w15="http://schemas.microsoft.com/office/word/2012/wordml" xmlns:w16cex="http://schemas.microsoft.com/office/word/2018/wordml/cex" xmlns:w16cid="http://schemas.microsoft.com/office/word/2016/wordml/cid" xmlns:w16="http://schemas.microsoft.com/office/word/2018/wordml" xmlns:w16du="http://schemas.microsoft.com/office/word/2023/wordml/word16du" xmlns:w16sdtdh="http://schemas.microsoft.com/office/word/2020/wordml/sdtdatahash" xmlns:w16sdtfl="http://schemas.microsoft.com/office/word/2024/wordml/sdtformatlock" xmlns:w16se="http://schemas.microsoft.com/office/word/2015/wordml/symex" xmlns:wpg="http://schemas.microsoft.com/office/word/2010/wordprocessingGroup" xmlns:wpi="http://schemas.microsoft.com/office/word/2010/wordprocessingInk" xmlns:wne="http://schemas.microsoft.com/office/word/2006/wordml" xmlns:wps="http://schemas.microsoft.com/office/word/2010/wordprocessingShape" mc:Ignorable="w14 w15 w16se w16cid w16 w16cex w16sdtdh w16sdtfl w16du wp14">
   <w:sdt>
     <w:sdtPr>
       <w:id w:val="931942158"/>
@@ -1669,18 +1443,8 @@
 </w:ftr>
 </file>
 
-<file path=word/footer3.xml><?xml version="1.0" encoding="utf-8"?>
-<w:ftr xmlns:wpc="http://schemas.microsoft.com/office/word/2010/wordprocessingCanvas" xmlns:mc="http://schemas.openxmlformats.org/markup-compatibility/2006" xmlns:o="urn:schemas-microsoft-com:office:office" xmlns:r="http://schemas.openxmlformats.org/officeDocument/2006/relationships" xmlns:m="http://schemas.openxmlformats.org/officeDocument/2006/math" xmlns:v="urn:schemas-microsoft-com:vml" xmlns:wp14="http://schemas.microsoft.com/office/word/2010/wordprocessingDrawing" xmlns:wp="http://schemas.openxmlformats.org/drawingml/2006/wordprocessingDrawing" xmlns:w10="urn:schemas-microsoft-com:office:word" xmlns:w="http://schemas.openxmlformats.org/wordprocessingml/2006/main" xmlns:w14="http://schemas.microsoft.com/office/word/2010/wordml" xmlns:wpg="http://schemas.microsoft.com/office/word/2010/wordprocessingGroup" xmlns:wpi="http://schemas.microsoft.com/office/word/2010/wordprocessingInk" xmlns:wne="http://schemas.microsoft.com/office/word/2006/wordml" xmlns:wps="http://schemas.microsoft.com/office/word/2010/wordprocessingShape" mc:Ignorable="w14 wp14">
-  <w:p>
-    <w:pPr>
-      <w:pStyle w:val="Footer"/>
-    </w:pPr>
-  </w:p>
-</w:ftr>
-</file>
-
 <file path=word/footnotes.xml><?xml version="1.0" encoding="utf-8"?>
-<w:footnotes xmlns:wpc="http://schemas.microsoft.com/office/word/2010/wordprocessingCanvas" xmlns:mc="http://schemas.openxmlformats.org/markup-compatibility/2006" xmlns:o="urn:schemas-microsoft-com:office:office" xmlns:r="http://schemas.openxmlformats.org/officeDocument/2006/relationships" xmlns:m="http://schemas.openxmlformats.org/officeDocument/2006/math" xmlns:v="urn:schemas-microsoft-com:vml" xmlns:wp14="http://schemas.microsoft.com/office/word/2010/wordprocessingDrawing" xmlns:wp="http://schemas.openxmlformats.org/drawingml/2006/wordprocessingDrawing" xmlns:w10="urn:schemas-microsoft-com:office:word" xmlns:w="http://schemas.openxmlformats.org/wordprocessingml/2006/main" xmlns:w14="http://schemas.microsoft.com/office/word/2010/wordml" xmlns:wpg="http://schemas.microsoft.com/office/word/2010/wordprocessingGroup" xmlns:wpi="http://schemas.microsoft.com/office/word/2010/wordprocessingInk" xmlns:wne="http://schemas.microsoft.com/office/word/2006/wordml" xmlns:wps="http://schemas.microsoft.com/office/word/2010/wordprocessingShape" mc:Ignorable="w14 wp14">
+<w:footnotes xmlns:wpc="http://schemas.microsoft.com/office/word/2010/wordprocessingCanvas" xmlns:cx="http://schemas.microsoft.com/office/drawing/2014/chartex" xmlns:cx1="http://schemas.microsoft.com/office/drawing/2015/9/8/chartex" xmlns:cx2="http://schemas.microsoft.com/office/drawing/2015/10/21/chartex" xmlns:cx3="http://schemas.microsoft.com/office/drawing/2016/5/9/chartex" xmlns:cx4="http://schemas.microsoft.com/office/drawing/2016/5/10/chartex" xmlns:cx5="http://schemas.microsoft.com/office/drawing/2016/5/11/chartex" xmlns:cx6="http://schemas.microsoft.com/office/drawing/2016/5/12/chartex" xmlns:cx7="http://schemas.microsoft.com/office/drawing/2016/5/13/chartex" xmlns:cx8="http://schemas.microsoft.com/office/drawing/2016/5/14/chartex" xmlns:mc="http://schemas.openxmlformats.org/markup-compatibility/2006" xmlns:aink="http://schemas.microsoft.com/office/drawing/2016/ink" xmlns:am3d="http://schemas.microsoft.com/office/drawing/2017/model3d" xmlns:o="urn:schemas-microsoft-com:office:office" xmlns:oel="http://schemas.microsoft.com/office/2019/extlst" xmlns:r="http://schemas.openxmlformats.org/officeDocument/2006/relationships" xmlns:m="http://schemas.openxmlformats.org/officeDocument/2006/math" xmlns:v="urn:schemas-microsoft-com:vml" xmlns:wp14="http://schemas.microsoft.com/office/word/2010/wordprocessingDrawing" xmlns:wp="http://schemas.openxmlformats.org/drawingml/2006/wordprocessingDrawing" xmlns:w10="urn:schemas-microsoft-com:office:word" xmlns:w="http://schemas.openxmlformats.org/wordprocessingml/2006/main" xmlns:w14="http://schemas.microsoft.com/office/word/2010/wordml" xmlns:w15="http://schemas.microsoft.com/office/word/2012/wordml" xmlns:w16cex="http://schemas.microsoft.com/office/word/2018/wordml/cex" xmlns:w16cid="http://schemas.microsoft.com/office/word/2016/wordml/cid" xmlns:w16="http://schemas.microsoft.com/office/word/2018/wordml" xmlns:w16du="http://schemas.microsoft.com/office/word/2023/wordml/word16du" xmlns:w16sdtdh="http://schemas.microsoft.com/office/word/2020/wordml/sdtdatahash" xmlns:w16sdtfl="http://schemas.microsoft.com/office/word/2024/wordml/sdtformatlock" xmlns:w16se="http://schemas.microsoft.com/office/word/2015/wordml/symex" xmlns:wpg="http://schemas.microsoft.com/office/word/2010/wordprocessingGroup" xmlns:wpi="http://schemas.microsoft.com/office/word/2010/wordprocessingInk" xmlns:wne="http://schemas.microsoft.com/office/word/2006/wordml" xmlns:wps="http://schemas.microsoft.com/office/word/2010/wordprocessingShape" mc:Ignorable="w14 w15 w16se w16cid w16 w16cex w16sdtdh w16sdtfl w16du wp14">
   <w:footnote w:type="separator" w:id="-1">
     <w:p>
       <w:r>
@@ -1699,161 +1463,234 @@
 </file>
 
 <file path=word/header1.xml><?xml version="1.0" encoding="utf-8"?>
-<w:hdr xmlns:wpc="http://schemas.microsoft.com/office/word/2010/wordprocessingCanvas" xmlns:mc="http://schemas.openxmlformats.org/markup-compatibility/2006" xmlns:o="urn:schemas-microsoft-com:office:office" xmlns:r="http://schemas.openxmlformats.org/officeDocument/2006/relationships" xmlns:m="http://schemas.openxmlformats.org/officeDocument/2006/math" xmlns:v="urn:schemas-microsoft-com:vml" xmlns:wp14="http://schemas.microsoft.com/office/word/2010/wordprocessingDrawing" xmlns:wp="http://schemas.openxmlformats.org/drawingml/2006/wordprocessingDrawing" xmlns:w10="urn:schemas-microsoft-com:office:word" xmlns:w="http://schemas.openxmlformats.org/wordprocessingml/2006/main" xmlns:w14="http://schemas.microsoft.com/office/word/2010/wordml" xmlns:wpg="http://schemas.microsoft.com/office/word/2010/wordprocessingGroup" xmlns:wpi="http://schemas.microsoft.com/office/word/2010/wordprocessingInk" xmlns:wne="http://schemas.microsoft.com/office/word/2006/wordml" xmlns:wps="http://schemas.microsoft.com/office/word/2010/wordprocessingShape" mc:Ignorable="w14 wp14">
-  <w:p>
-    <w:pPr>
-      <w:pStyle w:val="Header"/>
-    </w:pPr>
-  </w:p>
-</w:hdr>
-</file>
-
-<file path=word/header2.xml><?xml version="1.0" encoding="utf-8"?>
-<w:hdr xmlns:wpc="http://schemas.microsoft.com/office/word/2010/wordprocessingCanvas" xmlns:mc="http://schemas.openxmlformats.org/markup-compatibility/2006" xmlns:o="urn:schemas-microsoft-com:office:office" xmlns:r="http://schemas.openxmlformats.org/officeDocument/2006/relationships" xmlns:m="http://schemas.openxmlformats.org/officeDocument/2006/math" xmlns:v="urn:schemas-microsoft-com:vml" xmlns:wp14="http://schemas.microsoft.com/office/word/2010/wordprocessingDrawing" xmlns:wp="http://schemas.openxmlformats.org/drawingml/2006/wordprocessingDrawing" xmlns:w10="urn:schemas-microsoft-com:office:word" xmlns:w="http://schemas.openxmlformats.org/wordprocessingml/2006/main" xmlns:w14="http://schemas.microsoft.com/office/word/2010/wordml" xmlns:wpg="http://schemas.microsoft.com/office/word/2010/wordprocessingGroup" xmlns:wpi="http://schemas.microsoft.com/office/word/2010/wordprocessingInk" xmlns:wne="http://schemas.microsoft.com/office/word/2006/wordml" xmlns:wps="http://schemas.microsoft.com/office/word/2010/wordprocessingShape" mc:Ignorable="w14 wp14">
+<w:hdr xmlns:wpc="http://schemas.microsoft.com/office/word/2010/wordprocessingCanvas" xmlns:cx="http://schemas.microsoft.com/office/drawing/2014/chartex" xmlns:cx1="http://schemas.microsoft.com/office/drawing/2015/9/8/chartex" xmlns:cx2="http://schemas.microsoft.com/office/drawing/2015/10/21/chartex" xmlns:cx3="http://schemas.microsoft.com/office/drawing/2016/5/9/chartex" xmlns:cx4="http://schemas.microsoft.com/office/drawing/2016/5/10/chartex" xmlns:cx5="http://schemas.microsoft.com/office/drawing/2016/5/11/chartex" xmlns:cx6="http://schemas.microsoft.com/office/drawing/2016/5/12/chartex" xmlns:cx7="http://schemas.microsoft.com/office/drawing/2016/5/13/chartex" xmlns:cx8="http://schemas.microsoft.com/office/drawing/2016/5/14/chartex" xmlns:mc="http://schemas.openxmlformats.org/markup-compatibility/2006" xmlns:aink="http://schemas.microsoft.com/office/drawing/2016/ink" xmlns:am3d="http://schemas.microsoft.com/office/drawing/2017/model3d" xmlns:o="urn:schemas-microsoft-com:office:office" xmlns:oel="http://schemas.microsoft.com/office/2019/extlst" xmlns:r="http://schemas.openxmlformats.org/officeDocument/2006/relationships" xmlns:m="http://schemas.openxmlformats.org/officeDocument/2006/math" xmlns:v="urn:schemas-microsoft-com:vml" xmlns:wp14="http://schemas.microsoft.com/office/word/2010/wordprocessingDrawing" xmlns:wp="http://schemas.openxmlformats.org/drawingml/2006/wordprocessingDrawing" xmlns:w10="urn:schemas-microsoft-com:office:word" xmlns:w="http://schemas.openxmlformats.org/wordprocessingml/2006/main" xmlns:w14="http://schemas.microsoft.com/office/word/2010/wordml" xmlns:w15="http://schemas.microsoft.com/office/word/2012/wordml" xmlns:w16cex="http://schemas.microsoft.com/office/word/2018/wordml/cex" xmlns:w16cid="http://schemas.microsoft.com/office/word/2016/wordml/cid" xmlns:w16="http://schemas.microsoft.com/office/word/2018/wordml" xmlns:w16du="http://schemas.microsoft.com/office/word/2023/wordml/word16du" xmlns:w16sdtdh="http://schemas.microsoft.com/office/word/2020/wordml/sdtdatahash" xmlns:w16sdtfl="http://schemas.microsoft.com/office/word/2024/wordml/sdtformatlock" xmlns:w16se="http://schemas.microsoft.com/office/word/2015/wordml/symex" xmlns:wpg="http://schemas.microsoft.com/office/word/2010/wordprocessingGroup" xmlns:wpi="http://schemas.microsoft.com/office/word/2010/wordprocessingInk" xmlns:wne="http://schemas.microsoft.com/office/word/2006/wordml" xmlns:wps="http://schemas.microsoft.com/office/word/2010/wordprocessingShape" mc:Ignorable="w14 w15 w16se w16cid w16 w16cex w16sdtdh w16sdtfl w16du wp14">
   <w:p>
     <w:pPr>
       <w:pStyle w:val="Header"/>
       <w:jc w:val="right"/>
     </w:pPr>
+  </w:p>
+  <w:p>
+    <w:pPr>
+      <w:pStyle w:val="Header"/>
+    </w:pPr>
     <w:r>
       <w:rPr>
-        <w:rFonts w:ascii="Arial" w:eastAsia="Arial" w:hAnsi="Arial" w:cs="Arial"/>
-        <w:b/>
-        <w:bCs/>
         <w:noProof/>
-        <w:sz w:val="23"/>
-        <w:szCs w:val="23"/>
+        <w:color w:val="000000" w:themeColor="text1"/>
       </w:rPr>
       <mc:AlternateContent>
         <mc:Choice Requires="wps">
           <w:drawing>
-            <wp:anchor distT="45720" distB="45720" distL="114300" distR="114300" simplePos="0" relativeHeight="251663360" behindDoc="1" locked="0" layoutInCell="1" allowOverlap="1" wp14:anchorId="1C3CD568" wp14:editId="1F2A4257">
+            <wp:anchor distT="0" distB="0" distL="114300" distR="114300" simplePos="0" relativeHeight="251660800" behindDoc="0" locked="0" layoutInCell="1" allowOverlap="1" wp14:anchorId="022F97B8" wp14:editId="6DF03CFC">
               <wp:simplePos x="0" y="0"/>
-              <wp:positionH relativeFrom="page">
-                <wp:posOffset>9925050</wp:posOffset>
+              <wp:positionH relativeFrom="column">
+                <wp:posOffset>8656320</wp:posOffset>
               </wp:positionH>
               <wp:positionV relativeFrom="paragraph">
-                <wp:posOffset>95250</wp:posOffset>
+                <wp:posOffset>45085</wp:posOffset>
               </wp:positionV>
-              <wp:extent cx="2114550" cy="666750"/>
-              <wp:effectExtent l="0" t="0" r="0" b="0"/>
+              <wp:extent cx="2201594" cy="808892"/>
+              <wp:effectExtent l="0" t="0" r="27305" b="10795"/>
               <wp:wrapNone/>
-              <wp:docPr id="11" name="Text Box 2"/>
-              <wp:cNvGraphicFramePr>
-                <a:graphicFrameLocks xmlns:a="http://schemas.openxmlformats.org/drawingml/2006/main"/>
-              </wp:cNvGraphicFramePr>
+              <wp:docPr id="8" name="Rectangle 8"/>
+              <wp:cNvGraphicFramePr/>
               <a:graphic xmlns:a="http://schemas.openxmlformats.org/drawingml/2006/main">
                 <a:graphicData uri="http://schemas.microsoft.com/office/word/2010/wordprocessingShape">
                   <wps:wsp>
-                    <wps:cNvSpPr txBox="1">
-                      <a:spLocks noChangeArrowheads="1"/>
-                    </wps:cNvSpPr>
-                    <wps:spPr bwMode="auto">
+                    <wps:cNvSpPr/>
+                    <wps:spPr>
                       <a:xfrm>
                         <a:off x="0" y="0"/>
-                        <a:ext cx="2114550" cy="666750"/>
+                        <a:ext cx="2201594" cy="808892"/>
                       </a:xfrm>
                       <a:prstGeom prst="rect">
                         <a:avLst/>
                       </a:prstGeom>
-                      <a:noFill/>
-                      <a:ln w="9525">
-                        <a:noFill/>
-                        <a:miter lim="800000"/>
-                        <a:headEnd/>
-                        <a:tailEnd/>
+                      <a:ln>
+                        <a:solidFill>
+                          <a:schemeClr val="bg1"/>
+                        </a:solidFill>
                       </a:ln>
                     </wps:spPr>
+                    <wps:style>
+                      <a:lnRef idx="2">
+                        <a:schemeClr val="accent5"/>
+                      </a:lnRef>
+                      <a:fillRef idx="1">
+                        <a:schemeClr val="lt1"/>
+                      </a:fillRef>
+                      <a:effectRef idx="0">
+                        <a:schemeClr val="accent5"/>
+                      </a:effectRef>
+                      <a:fontRef idx="minor">
+                        <a:schemeClr val="dk1"/>
+                      </a:fontRef>
+                    </wps:style>
                     <wps:txbx>
                       <w:txbxContent>
                         <w:p>
                           <w:pPr>
-                            <w:spacing w:line="278" w:lineRule="auto"/>
-                            <w:ind w:right="40"/>
+                            <w:jc w:val="both"/>
                             <w:rPr>
-                              <w:rFonts w:ascii="Tahoma" w:eastAsia="Arial" w:hAnsi="Tahoma" w:cs="Tahoma"/>
+                              <w:rFonts w:ascii="Tahoma" w:eastAsia="Times New Roman" w:hAnsi="Tahoma" w:cs="Tahoma"/>
+                              <w:color w:val="000000"/>
+                              <w:sz w:val="16"/>
+                              <w:szCs w:val="16"/>
+                              <w:lang w:val="en-IN" w:eastAsia="en-IN"/>
+                            </w:rPr>
+                          </w:pPr>
+                          <w:bookmarkStart w:id="0" w:name="_Hlk85459252"/>
+                          <w:r>
+                            <w:rPr>
+                              <w:rFonts w:ascii="Tahoma" w:eastAsia="Times New Roman" w:hAnsi="Tahoma" w:cs="Tahoma"/>
+                              <w:color w:val="000000"/>
+                              <w:sz w:val="16"/>
+                              <w:szCs w:val="16"/>
+                              <w:lang w:val="en-IN" w:eastAsia="en-IN"/>
+                            </w:rPr>
+                            <w:t>Plot No 615, on Ranchi Tata Road</w:t>
+                          </w:r>
+                        </w:p>
+                        <w:p>
+                          <w:pPr>
+                            <w:jc w:val="both"/>
+                            <w:rPr>
+                              <w:rFonts w:ascii="Tahoma" w:eastAsia="Times New Roman" w:hAnsi="Tahoma" w:cs="Tahoma"/>
+                              <w:color w:val="000000"/>
+                              <w:sz w:val="16"/>
+                              <w:szCs w:val="16"/>
+                              <w:lang w:val="en-IN" w:eastAsia="en-IN"/>
+                            </w:rPr>
+                          </w:pPr>
+                          <w:r>
+                            <w:rPr>
+                              <w:rFonts w:ascii="Tahoma" w:eastAsia="Times New Roman" w:hAnsi="Tahoma" w:cs="Tahoma"/>
+                              <w:color w:val="000000"/>
+                              <w:sz w:val="16"/>
+                              <w:szCs w:val="16"/>
+                              <w:lang w:val="en-IN" w:eastAsia="en-IN"/>
+                            </w:rPr>
+                            <w:t>Vill-Panch, Thana-Bundu, Ranchi Jharkhand</w:t>
+                          </w:r>
+                        </w:p>
+                        <w:p>
+                          <w:pPr>
+                            <w:jc w:val="both"/>
+                            <w:rPr>
+                              <w:rFonts w:ascii="Tahoma" w:eastAsia="Times New Roman" w:hAnsi="Tahoma" w:cs="Tahoma"/>
+                              <w:color w:val="000000"/>
+                              <w:sz w:val="16"/>
+                              <w:szCs w:val="16"/>
+                              <w:lang w:val="en-IN" w:eastAsia="en-IN"/>
+                            </w:rPr>
+                          </w:pPr>
+                          <w:r>
+                            <w:rPr>
+                              <w:rFonts w:ascii="Tahoma" w:eastAsia="Times New Roman" w:hAnsi="Tahoma" w:cs="Tahoma"/>
+                              <w:color w:val="000000"/>
+                              <w:sz w:val="16"/>
+                              <w:szCs w:val="16"/>
+                              <w:lang w:val="en-IN" w:eastAsia="en-IN"/>
+                            </w:rPr>
+                            <w:t>PIN CODE- 835204</w:t>
+                          </w:r>
+                        </w:p>
+                        <w:p>
+                          <w:pPr>
+                            <w:shd w:val="clear" w:color="auto" w:fill="FFFFFF"/>
+                            <w:rPr>
+                              <w:rFonts w:ascii="Tahoma" w:eastAsia="Times New Roman" w:hAnsi="Tahoma" w:cs="Tahoma"/>
+                              <w:color w:val="000000"/>
+                              <w:sz w:val="16"/>
+                              <w:szCs w:val="16"/>
+                              <w:lang w:val="en-IN" w:eastAsia="en-IN"/>
+                            </w:rPr>
+                          </w:pPr>
+                          <w:r>
+                            <w:rPr>
+                              <w:rFonts w:ascii="Tahoma" w:eastAsia="Times New Roman" w:hAnsi="Tahoma" w:cs="Tahoma"/>
+                              <w:color w:val="000000"/>
+                              <w:sz w:val="16"/>
+                              <w:szCs w:val="16"/>
+                              <w:lang w:val="en-IN" w:eastAsia="en-IN"/>
+                            </w:rPr>
+                            <w:t>GST: 20AATCA6942P1Z3</w:t>
+                          </w:r>
+                        </w:p>
+                        <w:p>
+                          <w:pPr>
+                            <w:shd w:val="clear" w:color="auto" w:fill="FFFFFF"/>
+                            <w:rPr>
+                              <w:rFonts w:ascii="Tahoma" w:eastAsia="Times New Roman" w:hAnsi="Tahoma" w:cs="Tahoma"/>
+                              <w:color w:val="000000"/>
+                              <w:sz w:val="16"/>
+                              <w:szCs w:val="16"/>
+                              <w:lang w:val="en-IN" w:eastAsia="en-IN"/>
+                            </w:rPr>
+                          </w:pPr>
+                          <w:r>
+                            <w:rPr>
+                              <w:rFonts w:ascii="Tahoma" w:eastAsia="Times New Roman" w:hAnsi="Tahoma" w:cs="Tahoma"/>
+                              <w:color w:val="003366"/>
+                              <w:sz w:val="18"/>
+                              <w:szCs w:val="18"/>
+                            </w:rPr>
+                            <w:t>Website:</w:t>
+                          </w:r>
+                          <w:hyperlink r:id="rId1" w:history="1">
+                            <w:r>
+                              <w:rPr>
+                                <w:rStyle w:val="Hyperlink"/>
+                                <w:rFonts w:ascii="Tahoma" w:eastAsia="Times New Roman" w:hAnsi="Tahoma" w:cs="Tahoma"/>
+                                <w:i/>
+                                <w:iCs/>
+                                <w:sz w:val="18"/>
+                                <w:szCs w:val="18"/>
+                              </w:rPr>
+                              <w:t>www.auburn-design.com</w:t>
+                            </w:r>
+                          </w:hyperlink>
+                          <w:r>
+                            <w:rPr>
+                              <w:rFonts w:ascii="Tahoma" w:eastAsia="Times New Roman" w:hAnsi="Tahoma" w:cs="Tahoma"/>
+                              <w:color w:val="000000"/>
+                              <w:sz w:val="16"/>
+                              <w:szCs w:val="16"/>
+                              <w:lang w:val="en-IN" w:eastAsia="en-IN"/>
+                            </w:rPr>
+                            <w:br/>
+                          </w:r>
+                        </w:p>
+                        <w:bookmarkEnd w:id="0"/>
+                        <w:p>
+                          <w:pPr>
+                            <w:shd w:val="clear" w:color="auto" w:fill="FFFFFF"/>
+                            <w:jc w:val="right"/>
+                            <w:rPr>
+                              <w:rFonts w:ascii="Tahoma" w:eastAsia="Times New Roman" w:hAnsi="Tahoma" w:cs="Tahoma"/>
+                              <w:color w:val="222222"/>
                               <w:sz w:val="16"/>
                               <w:szCs w:val="16"/>
                             </w:rPr>
                           </w:pPr>
-                          <w:proofErr w:type="spellStart"/>
-                          <w:proofErr w:type="gramStart"/>
-                          <w:r>
-                            <w:rPr>
-                              <w:rFonts w:ascii="Tahoma" w:eastAsia="Arial" w:hAnsi="Tahoma" w:cs="Tahoma"/>
-                              <w:sz w:val="16"/>
-                              <w:szCs w:val="16"/>
-                            </w:rPr>
-                            <w:t>Mouchak</w:t>
-                          </w:r>
-                          <w:proofErr w:type="spellEnd"/>
-                          <w:r>
-                            <w:rPr>
-                              <w:rFonts w:ascii="Tahoma" w:eastAsia="Arial" w:hAnsi="Tahoma" w:cs="Tahoma"/>
-                              <w:sz w:val="16"/>
-                              <w:szCs w:val="16"/>
-                            </w:rPr>
-                            <w:t xml:space="preserve"> (1751), </w:t>
-                          </w:r>
-                          <w:proofErr w:type="spellStart"/>
-                          <w:r>
-                            <w:rPr>
-                              <w:rFonts w:ascii="Tahoma" w:eastAsia="Arial" w:hAnsi="Tahoma" w:cs="Tahoma"/>
-                              <w:sz w:val="16"/>
-                              <w:szCs w:val="16"/>
-                            </w:rPr>
-                            <w:t>Kaliakair</w:t>
-                          </w:r>
-                          <w:proofErr w:type="spellEnd"/>
-                          <w:r>
-                            <w:rPr>
-                              <w:rFonts w:ascii="Tahoma" w:eastAsia="Arial" w:hAnsi="Tahoma" w:cs="Tahoma"/>
-                              <w:sz w:val="16"/>
-                              <w:szCs w:val="16"/>
-                            </w:rPr>
-                            <w:t>.</w:t>
-                          </w:r>
-                          <w:proofErr w:type="gramEnd"/>
                         </w:p>
                         <w:p>
                           <w:pPr>
-                            <w:spacing w:line="278" w:lineRule="auto"/>
-                            <w:ind w:right="40"/>
+                            <w:jc w:val="right"/>
                             <w:rPr>
-                              <w:rFonts w:ascii="Arial" w:eastAsia="Arial" w:hAnsi="Arial" w:cs="Arial"/>
+                              <w:rFonts w:ascii="Tahoma" w:hAnsi="Tahoma" w:cs="Tahoma"/>
                               <w:sz w:val="16"/>
                               <w:szCs w:val="16"/>
                             </w:rPr>
                           </w:pPr>
-                          <w:proofErr w:type="spellStart"/>
-                          <w:proofErr w:type="gramStart"/>
-                          <w:r>
-                            <w:rPr>
-                              <w:rFonts w:ascii="Tahoma" w:eastAsia="Arial" w:hAnsi="Tahoma" w:cs="Tahoma"/>
-                              <w:sz w:val="16"/>
-                              <w:szCs w:val="16"/>
-                            </w:rPr>
-                            <w:t>Gazipur</w:t>
-                          </w:r>
-                          <w:proofErr w:type="spellEnd"/>
-                          <w:r>
-                            <w:rPr>
-                              <w:rFonts w:ascii="Tahoma" w:eastAsia="Arial" w:hAnsi="Tahoma" w:cs="Tahoma"/>
-                              <w:sz w:val="16"/>
-                              <w:szCs w:val="16"/>
-                            </w:rPr>
-                            <w:t>, Dhaka, Bangladesh.</w:t>
-                          </w:r>
-                          <w:proofErr w:type="gramEnd"/>
-                        </w:p>
-                        <w:p>
-                          <w:pPr>
-                            <w:jc w:val="right"/>
-                          </w:pPr>
                         </w:p>
                       </w:txbxContent>
                     </wps:txbx>
-                    <wps:bodyPr rot="0" vert="horz" wrap="square" lIns="91440" tIns="45720" rIns="91440" bIns="45720" anchor="t" anchorCtr="0">
+                    <wps:bodyPr rot="0" spcFirstLastPara="0" vertOverflow="overflow" horzOverflow="overflow" vert="horz" wrap="square" lIns="91440" tIns="45720" rIns="91440" bIns="45720" numCol="1" spcCol="0" rtlCol="0" fromWordArt="0" anchor="ctr" anchorCtr="0" forceAA="0" compatLnSpc="1">
+                      <a:prstTxWarp prst="textNoShape">
+                        <a:avLst/>
+                      </a:prstTxWarp>
                       <a:noAutofit/>
                     </wps:bodyPr>
                   </wps:wsp>
@@ -1870,247 +1707,291 @@
         </mc:Choice>
         <mc:Fallback>
           <w:pict>
-            <v:shapetype id="_x0000_t202" coordsize="21600,21600" o:spt="202" path="m,l,21600r21600,l21600,xe">
-              <v:stroke joinstyle="miter"/>
-              <v:path gradientshapeok="t" o:connecttype="rect"/>
-            </v:shapetype>
-            <v:shape id="Text Box 2" o:spid="_x0000_s1027" type="#_x0000_t202" style="position:absolute;left:0;text-align:left;margin-left:781.5pt;margin-top:7.5pt;width:166.5pt;height:52.5pt;z-index:-251653120;visibility:visible;mso-wrap-style:square;mso-width-percent:0;mso-height-percent:0;mso-wrap-distance-left:9pt;mso-wrap-distance-top:3.6pt;mso-wrap-distance-right:9pt;mso-wrap-distance-bottom:3.6pt;mso-position-horizontal:absolute;mso-position-horizontal-relative:page;mso-position-vertical:absolute;mso-position-vertical-relative:text;mso-width-percent:0;mso-height-percent:0;mso-width-relative:margin;mso-height-relative:margin;v-text-anchor:top" o:gfxdata="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" filled="f" stroked="f">
+            <v:rect w14:anchorId="022F97B8" id="Rectangle 8" o:spid="_x0000_s1027" style="position:absolute;margin-left:681.6pt;margin-top:3.55pt;width:173.35pt;height:63.7pt;z-index:251660800;visibility:visible;mso-wrap-style:square;mso-width-percent:0;mso-height-percent:0;mso-wrap-distance-left:9pt;mso-wrap-distance-top:0;mso-wrap-distance-right:9pt;mso-wrap-distance-bottom:0;mso-position-horizontal:absolute;mso-position-horizontal-relative:text;mso-position-vertical:absolute;mso-position-vertical-relative:text;mso-width-percent:0;mso-height-percent:0;mso-width-relative:margin;mso-height-relative:margin;v-text-anchor:middle" o:gfxdata="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" fillcolor="white [3201]" strokecolor="white [3212]" strokeweight="1pt">
               <v:textbox>
                 <w:txbxContent>
                   <w:p>
                     <w:pPr>
-                      <w:spacing w:line="278" w:lineRule="auto"/>
-                      <w:ind w:right="40"/>
+                      <w:jc w:val="both"/>
                       <w:rPr>
-                        <w:rFonts w:ascii="Tahoma" w:eastAsia="Arial" w:hAnsi="Tahoma" w:cs="Tahoma"/>
+                        <w:rFonts w:ascii="Tahoma" w:eastAsia="Times New Roman" w:hAnsi="Tahoma" w:cs="Tahoma"/>
+                        <w:color w:val="000000"/>
+                        <w:sz w:val="16"/>
+                        <w:szCs w:val="16"/>
+                        <w:lang w:val="en-IN" w:eastAsia="en-IN"/>
+                      </w:rPr>
+                    </w:pPr>
+                    <w:bookmarkStart w:id="1" w:name="_Hlk85459252"/>
+                    <w:r>
+                      <w:rPr>
+                        <w:rFonts w:ascii="Tahoma" w:eastAsia="Times New Roman" w:hAnsi="Tahoma" w:cs="Tahoma"/>
+                        <w:color w:val="000000"/>
+                        <w:sz w:val="16"/>
+                        <w:szCs w:val="16"/>
+                        <w:lang w:val="en-IN" w:eastAsia="en-IN"/>
+                      </w:rPr>
+                      <w:t>Plot No 615, on Ranchi Tata Road</w:t>
+                    </w:r>
+                  </w:p>
+                  <w:p>
+                    <w:pPr>
+                      <w:jc w:val="both"/>
+                      <w:rPr>
+                        <w:rFonts w:ascii="Tahoma" w:eastAsia="Times New Roman" w:hAnsi="Tahoma" w:cs="Tahoma"/>
+                        <w:color w:val="000000"/>
+                        <w:sz w:val="16"/>
+                        <w:szCs w:val="16"/>
+                        <w:lang w:val="en-IN" w:eastAsia="en-IN"/>
+                      </w:rPr>
+                    </w:pPr>
+                    <w:r>
+                      <w:rPr>
+                        <w:rFonts w:ascii="Tahoma" w:eastAsia="Times New Roman" w:hAnsi="Tahoma" w:cs="Tahoma"/>
+                        <w:color w:val="000000"/>
+                        <w:sz w:val="16"/>
+                        <w:szCs w:val="16"/>
+                        <w:lang w:val="en-IN" w:eastAsia="en-IN"/>
+                      </w:rPr>
+                      <w:t>Vill-Panch, Thana-Bundu, Ranchi Jharkhand</w:t>
+                    </w:r>
+                  </w:p>
+                  <w:p>
+                    <w:pPr>
+                      <w:jc w:val="both"/>
+                      <w:rPr>
+                        <w:rFonts w:ascii="Tahoma" w:eastAsia="Times New Roman" w:hAnsi="Tahoma" w:cs="Tahoma"/>
+                        <w:color w:val="000000"/>
+                        <w:sz w:val="16"/>
+                        <w:szCs w:val="16"/>
+                        <w:lang w:val="en-IN" w:eastAsia="en-IN"/>
+                      </w:rPr>
+                    </w:pPr>
+                    <w:r>
+                      <w:rPr>
+                        <w:rFonts w:ascii="Tahoma" w:eastAsia="Times New Roman" w:hAnsi="Tahoma" w:cs="Tahoma"/>
+                        <w:color w:val="000000"/>
+                        <w:sz w:val="16"/>
+                        <w:szCs w:val="16"/>
+                        <w:lang w:val="en-IN" w:eastAsia="en-IN"/>
+                      </w:rPr>
+                      <w:t>PIN CODE- 835204</w:t>
+                    </w:r>
+                  </w:p>
+                  <w:p>
+                    <w:pPr>
+                      <w:shd w:val="clear" w:color="auto" w:fill="FFFFFF"/>
+                      <w:rPr>
+                        <w:rFonts w:ascii="Tahoma" w:eastAsia="Times New Roman" w:hAnsi="Tahoma" w:cs="Tahoma"/>
+                        <w:color w:val="000000"/>
+                        <w:sz w:val="16"/>
+                        <w:szCs w:val="16"/>
+                        <w:lang w:val="en-IN" w:eastAsia="en-IN"/>
+                      </w:rPr>
+                    </w:pPr>
+                    <w:r>
+                      <w:rPr>
+                        <w:rFonts w:ascii="Tahoma" w:eastAsia="Times New Roman" w:hAnsi="Tahoma" w:cs="Tahoma"/>
+                        <w:color w:val="000000"/>
+                        <w:sz w:val="16"/>
+                        <w:szCs w:val="16"/>
+                        <w:lang w:val="en-IN" w:eastAsia="en-IN"/>
+                      </w:rPr>
+                      <w:t>GST: 20AATCA6942P1Z3</w:t>
+                    </w:r>
+                  </w:p>
+                  <w:p>
+                    <w:pPr>
+                      <w:shd w:val="clear" w:color="auto" w:fill="FFFFFF"/>
+                      <w:rPr>
+                        <w:rFonts w:ascii="Tahoma" w:eastAsia="Times New Roman" w:hAnsi="Tahoma" w:cs="Tahoma"/>
+                        <w:color w:val="000000"/>
+                        <w:sz w:val="16"/>
+                        <w:szCs w:val="16"/>
+                        <w:lang w:val="en-IN" w:eastAsia="en-IN"/>
+                      </w:rPr>
+                    </w:pPr>
+                    <w:r>
+                      <w:rPr>
+                        <w:rFonts w:ascii="Tahoma" w:eastAsia="Times New Roman" w:hAnsi="Tahoma" w:cs="Tahoma"/>
+                        <w:color w:val="003366"/>
+                        <w:sz w:val="18"/>
+                        <w:szCs w:val="18"/>
+                      </w:rPr>
+                      <w:t>Website:</w:t>
+                    </w:r>
+                    <w:hyperlink r:id="rId2" w:history="1">
+                      <w:r>
+                        <w:rPr>
+                          <w:rStyle w:val="Hyperlink"/>
+                          <w:rFonts w:ascii="Tahoma" w:eastAsia="Times New Roman" w:hAnsi="Tahoma" w:cs="Tahoma"/>
+                          <w:i/>
+                          <w:iCs/>
+                          <w:sz w:val="18"/>
+                          <w:szCs w:val="18"/>
+                        </w:rPr>
+                        <w:t>www.auburn-design.com</w:t>
+                      </w:r>
+                    </w:hyperlink>
+                    <w:r>
+                      <w:rPr>
+                        <w:rFonts w:ascii="Tahoma" w:eastAsia="Times New Roman" w:hAnsi="Tahoma" w:cs="Tahoma"/>
+                        <w:color w:val="000000"/>
+                        <w:sz w:val="16"/>
+                        <w:szCs w:val="16"/>
+                        <w:lang w:val="en-IN" w:eastAsia="en-IN"/>
+                      </w:rPr>
+                      <w:br/>
+                    </w:r>
+                  </w:p>
+                  <w:bookmarkEnd w:id="1"/>
+                  <w:p>
+                    <w:pPr>
+                      <w:shd w:val="clear" w:color="auto" w:fill="FFFFFF"/>
+                      <w:jc w:val="right"/>
+                      <w:rPr>
+                        <w:rFonts w:ascii="Tahoma" w:eastAsia="Times New Roman" w:hAnsi="Tahoma" w:cs="Tahoma"/>
+                        <w:color w:val="222222"/>
                         <w:sz w:val="16"/>
                         <w:szCs w:val="16"/>
                       </w:rPr>
                     </w:pPr>
-                    <w:proofErr w:type="spellStart"/>
-                    <w:proofErr w:type="gramStart"/>
-                    <w:r>
-                      <w:rPr>
-                        <w:rFonts w:ascii="Tahoma" w:eastAsia="Arial" w:hAnsi="Tahoma" w:cs="Tahoma"/>
-                        <w:sz w:val="16"/>
-                        <w:szCs w:val="16"/>
-                      </w:rPr>
-                      <w:t>Mouchak</w:t>
-                    </w:r>
-                    <w:proofErr w:type="spellEnd"/>
-                    <w:r>
-                      <w:rPr>
-                        <w:rFonts w:ascii="Tahoma" w:eastAsia="Arial" w:hAnsi="Tahoma" w:cs="Tahoma"/>
-                        <w:sz w:val="16"/>
-                        <w:szCs w:val="16"/>
-                      </w:rPr>
-                      <w:t xml:space="preserve"> (1751), </w:t>
-                    </w:r>
-                    <w:proofErr w:type="spellStart"/>
-                    <w:r>
-                      <w:rPr>
-                        <w:rFonts w:ascii="Tahoma" w:eastAsia="Arial" w:hAnsi="Tahoma" w:cs="Tahoma"/>
-                        <w:sz w:val="16"/>
-                        <w:szCs w:val="16"/>
-                      </w:rPr>
-                      <w:t>Kaliakair</w:t>
-                    </w:r>
-                    <w:proofErr w:type="spellEnd"/>
-                    <w:r>
-                      <w:rPr>
-                        <w:rFonts w:ascii="Tahoma" w:eastAsia="Arial" w:hAnsi="Tahoma" w:cs="Tahoma"/>
-                        <w:sz w:val="16"/>
-                        <w:szCs w:val="16"/>
-                      </w:rPr>
-                      <w:t>.</w:t>
-                    </w:r>
-                    <w:proofErr w:type="gramEnd"/>
                   </w:p>
                   <w:p>
                     <w:pPr>
-                      <w:spacing w:line="278" w:lineRule="auto"/>
-                      <w:ind w:right="40"/>
+                      <w:jc w:val="right"/>
                       <w:rPr>
-                        <w:rFonts w:ascii="Arial" w:eastAsia="Arial" w:hAnsi="Arial" w:cs="Arial"/>
+                        <w:rFonts w:ascii="Tahoma" w:hAnsi="Tahoma" w:cs="Tahoma"/>
                         <w:sz w:val="16"/>
                         <w:szCs w:val="16"/>
                       </w:rPr>
                     </w:pPr>
-                    <w:proofErr w:type="spellStart"/>
-                    <w:proofErr w:type="gramStart"/>
-                    <w:r>
-                      <w:rPr>
-                        <w:rFonts w:ascii="Tahoma" w:eastAsia="Arial" w:hAnsi="Tahoma" w:cs="Tahoma"/>
-                        <w:sz w:val="16"/>
-                        <w:szCs w:val="16"/>
-                      </w:rPr>
-                      <w:t>Gazipur</w:t>
-                    </w:r>
-                    <w:proofErr w:type="spellEnd"/>
-                    <w:r>
-                      <w:rPr>
-                        <w:rFonts w:ascii="Tahoma" w:eastAsia="Arial" w:hAnsi="Tahoma" w:cs="Tahoma"/>
-                        <w:sz w:val="16"/>
-                        <w:szCs w:val="16"/>
-                      </w:rPr>
-                      <w:t>, Dhaka, Bangladesh.</w:t>
-                    </w:r>
-                    <w:proofErr w:type="gramEnd"/>
-                  </w:p>
-                  <w:p>
-                    <w:pPr>
-                      <w:jc w:val="right"/>
-                    </w:pPr>
                   </w:p>
                 </w:txbxContent>
               </v:textbox>
-              <w10:wrap anchorx="page"/>
-            </v:shape>
+            </v:rect>
           </w:pict>
         </mc:Fallback>
       </mc:AlternateContent>
     </w:r>
-  </w:p>
-  <w:p>
-    <w:pPr>
-      <w:pStyle w:val="Header"/>
-    </w:pPr>
     <w:r>
       <w:rPr>
-        <w:rFonts w:ascii="Arial Narrow" w:hAnsi="Arial Narrow" w:cs="Arial"/>
         <w:noProof/>
-        <w:sz w:val="20"/>
-        <w:szCs w:val="20"/>
+        <w:color w:val="000000" w:themeColor="text1"/>
       </w:rPr>
       <mc:AlternateContent>
-        <mc:Choice Requires="wps">
+        <mc:Choice Requires="wpg">
           <w:drawing>
-            <wp:anchor distT="0" distB="0" distL="114300" distR="114300" simplePos="0" relativeHeight="251661312" behindDoc="0" locked="0" layoutInCell="1" allowOverlap="1" wp14:anchorId="0AE7290E" wp14:editId="5DC1B72F">
+            <wp:anchor distT="0" distB="0" distL="114300" distR="114300" simplePos="0" relativeHeight="251658752" behindDoc="0" locked="0" layoutInCell="1" allowOverlap="1" wp14:anchorId="26269EEE" wp14:editId="35F5E44D">
               <wp:simplePos x="0" y="0"/>
               <wp:positionH relativeFrom="column">
-                <wp:posOffset>47625</wp:posOffset>
+                <wp:posOffset>0</wp:posOffset>
               </wp:positionH>
               <wp:positionV relativeFrom="paragraph">
-                <wp:posOffset>591185</wp:posOffset>
+                <wp:posOffset>29845</wp:posOffset>
               </wp:positionV>
-              <wp:extent cx="2298700" cy="238125"/>
+              <wp:extent cx="1878037" cy="900332"/>
               <wp:effectExtent l="0" t="0" r="0" b="0"/>
               <wp:wrapNone/>
-              <wp:docPr id="217" name="Text Box 2"/>
-              <wp:cNvGraphicFramePr>
-                <a:graphicFrameLocks xmlns:a="http://schemas.openxmlformats.org/drawingml/2006/main"/>
-              </wp:cNvGraphicFramePr>
+              <wp:docPr id="116141549" name="Group 116141549"/>
+              <wp:cNvGraphicFramePr/>
               <a:graphic xmlns:a="http://schemas.openxmlformats.org/drawingml/2006/main">
-                <a:graphicData uri="http://schemas.microsoft.com/office/word/2010/wordprocessingShape">
-                  <wps:wsp>
-                    <wps:cNvSpPr txBox="1">
-                      <a:spLocks noChangeArrowheads="1"/>
-                    </wps:cNvSpPr>
-                    <wps:spPr bwMode="auto">
+                <a:graphicData uri="http://schemas.microsoft.com/office/word/2010/wordprocessingGroup">
+                  <wpg:wgp>
+                    <wpg:cNvGrpSpPr/>
+                    <wpg:grpSpPr>
                       <a:xfrm>
                         <a:off x="0" y="0"/>
-                        <a:ext cx="2298700" cy="238125"/>
+                        <a:ext cx="1878037" cy="900332"/>
+                        <a:chOff x="0" y="0"/>
+                        <a:chExt cx="1878037" cy="900332"/>
                       </a:xfrm>
-                      <a:prstGeom prst="rect">
-                        <a:avLst/>
-                      </a:prstGeom>
-                      <a:noFill/>
-                      <a:ln w="9525">
+                    </wpg:grpSpPr>
+                    <pic:pic xmlns:pic="http://schemas.openxmlformats.org/drawingml/2006/picture">
+                      <pic:nvPicPr>
+                        <pic:cNvPr id="1981879464" name="Picture2"/>
+                        <pic:cNvPicPr>
+                          <a:picLocks noChangeAspect="1"/>
+                        </pic:cNvPicPr>
+                      </pic:nvPicPr>
+                      <pic:blipFill rotWithShape="1">
+                        <a:blip r:embed="rId3">
+                          <a:extLst>
+                            <a:ext uri="{28A0092B-C50C-407E-A947-70E740481C1C}">
+                              <a14:useLocalDpi xmlns:a14="http://schemas.microsoft.com/office/drawing/2010/main" val="0"/>
+                            </a:ext>
+                          </a:extLst>
+                        </a:blip>
+                        <a:srcRect l="14503" t="11166" r="13488" b="24648"/>
+                        <a:stretch/>
+                      </pic:blipFill>
+                      <pic:spPr bwMode="auto">
+                        <a:xfrm>
+                          <a:off x="182880" y="0"/>
+                          <a:ext cx="1381760" cy="759460"/>
+                        </a:xfrm>
+                        <a:prstGeom prst="rect">
+                          <a:avLst/>
+                        </a:prstGeom>
                         <a:noFill/>
-                        <a:miter lim="800000"/>
-                        <a:headEnd/>
-                        <a:tailEnd/>
-                      </a:ln>
-                    </wps:spPr>
-                    <wps:txbx>
-                      <w:txbxContent>
-                        <w:p>
-                          <w:pPr>
-                            <w:spacing w:line="278" w:lineRule="auto"/>
-                            <w:ind w:right="40"/>
-                            <w:jc w:val="both"/>
-                            <w:rPr>
-                              <w:rFonts w:ascii="Tahoma" w:eastAsia="Arial" w:hAnsi="Tahoma" w:cs="Tahoma"/>
-                              <w:b/>
-                              <w:sz w:val="16"/>
-                              <w:szCs w:val="16"/>
-                            </w:rPr>
-                          </w:pPr>
-                          <w:proofErr w:type="spellStart"/>
-                          <w:r>
-                            <w:rPr>
-                              <w:rFonts w:ascii="Tahoma" w:eastAsia="Arial" w:hAnsi="Tahoma" w:cs="Tahoma"/>
-                              <w:b/>
-                              <w:sz w:val="16"/>
-                              <w:szCs w:val="16"/>
-                            </w:rPr>
-                            <w:t>Sadma</w:t>
-                          </w:r>
-                          <w:proofErr w:type="spellEnd"/>
-                          <w:r>
-                            <w:rPr>
-                              <w:rFonts w:ascii="Tahoma" w:eastAsia="Arial" w:hAnsi="Tahoma" w:cs="Tahoma"/>
-                              <w:b/>
-                              <w:sz w:val="16"/>
-                              <w:szCs w:val="16"/>
-                            </w:rPr>
-                            <w:t xml:space="preserve"> </w:t>
-                          </w:r>
-                          <w:r>
-                            <w:rPr>
-                              <w:rFonts w:ascii="Tahoma" w:hAnsi="Tahoma" w:cs="Tahoma"/>
-                              <w:b/>
-                              <w:bCs/>
-                              <w:sz w:val="16"/>
-                              <w:szCs w:val="16"/>
-                            </w:rPr>
-                            <w:t>(</w:t>
-                          </w:r>
-                          <w:proofErr w:type="spellStart"/>
-                          <w:r>
-                            <w:rPr>
-                              <w:rFonts w:ascii="Tahoma" w:eastAsia="Arial" w:hAnsi="Tahoma" w:cs="Tahoma"/>
-                              <w:b/>
-                              <w:sz w:val="16"/>
-                              <w:szCs w:val="16"/>
-                            </w:rPr>
-                            <w:t>Sadma</w:t>
-                          </w:r>
-                          <w:proofErr w:type="spellEnd"/>
-                          <w:r>
-                            <w:rPr>
-                              <w:rFonts w:ascii="Tahoma" w:eastAsia="Arial" w:hAnsi="Tahoma" w:cs="Tahoma"/>
-                              <w:b/>
-                              <w:sz w:val="16"/>
-                              <w:szCs w:val="16"/>
-                            </w:rPr>
-                            <w:t xml:space="preserve"> Fashion Wear Ltd)</w:t>
-                          </w:r>
-                        </w:p>
-                        <w:p>
-                          <w:pPr>
-                            <w:rPr>
-                              <w:sz w:val="20"/>
-                              <w:szCs w:val="20"/>
-                            </w:rPr>
-                          </w:pPr>
-                          <w:r>
-                            <w:rPr>
-                              <w:rFonts w:ascii="Arial,Bold" w:hAnsi="Arial,Bold" w:cs="Arial,Bold"/>
-                              <w:b/>
-                              <w:bCs/>
-                              <w:sz w:val="20"/>
-                              <w:szCs w:val="20"/>
-                            </w:rPr>
-                            <w:t>)</w:t>
-                          </w:r>
-                        </w:p>
-                      </w:txbxContent>
-                    </wps:txbx>
-                    <wps:bodyPr rot="0" vert="horz" wrap="square" lIns="91440" tIns="45720" rIns="91440" bIns="45720" anchor="t" anchorCtr="0">
-                      <a:noAutofit/>
-                    </wps:bodyPr>
-                  </wps:wsp>
+                        <a:ln>
+                          <a:noFill/>
+                        </a:ln>
+                        <a:extLst>
+                          <a:ext uri="{53640926-AAD7-44D8-BBD7-CCE9431645EC}">
+                            <a14:shadowObscured xmlns:a14="http://schemas.microsoft.com/office/drawing/2010/main"/>
+                          </a:ext>
+                        </a:extLst>
+                      </pic:spPr>
+                    </pic:pic>
+                    <wps:wsp>
+                      <wps:cNvPr id="114379704" name="Text Box 2"/>
+                      <wps:cNvSpPr txBox="1">
+                        <a:spLocks noChangeArrowheads="1"/>
+                      </wps:cNvSpPr>
+                      <wps:spPr bwMode="auto">
+                        <a:xfrm>
+                          <a:off x="0" y="661181"/>
+                          <a:ext cx="1878037" cy="239151"/>
+                        </a:xfrm>
+                        <a:prstGeom prst="rect">
+                          <a:avLst/>
+                        </a:prstGeom>
+                        <a:noFill/>
+                        <a:ln w="9525">
+                          <a:noFill/>
+                          <a:miter lim="800000"/>
+                          <a:headEnd/>
+                          <a:tailEnd/>
+                        </a:ln>
+                      </wps:spPr>
+                      <wps:txbx>
+                        <w:txbxContent>
+                          <w:p>
+                            <w:pPr>
+                              <w:rPr>
+                                <w:rFonts w:ascii="Tahoma" w:hAnsi="Tahoma" w:cs="Tahoma"/>
+                                <w:sz w:val="16"/>
+                                <w:szCs w:val="16"/>
+                                <w:lang w:val="en-IN"/>
+                              </w:rPr>
+                            </w:pPr>
+                            <w:r>
+                              <w:rPr>
+                                <w:rFonts w:ascii="Tahoma" w:hAnsi="Tahoma" w:cs="Tahoma"/>
+                                <w:sz w:val="16"/>
+                                <w:szCs w:val="16"/>
+                                <w:lang w:val="en-IN"/>
+                              </w:rPr>
+                              <w:t>AUBURN DESIGN PRIVATE LIMITED</w:t>
+                            </w:r>
+                          </w:p>
+                        </w:txbxContent>
+                      </wps:txbx>
+                      <wps:bodyPr rot="0" vert="horz" wrap="square" lIns="91440" tIns="45720" rIns="91440" bIns="45720" anchor="t" anchorCtr="0">
+                        <a:noAutofit/>
+                      </wps:bodyPr>
+                    </wps:wsp>
+                  </wpg:wgp>
                 </a:graphicData>
               </a:graphic>
             </wp:anchor>
@@ -2118,150 +1999,63 @@
         </mc:Choice>
         <mc:Fallback>
           <w:pict>
-            <v:shape id="_x0000_s1028" type="#_x0000_t202" style="position:absolute;margin-left:3.75pt;margin-top:46.55pt;width:181pt;height:18.75pt;z-index:251661312;visibility:visible;mso-wrap-style:square;mso-wrap-distance-left:9pt;mso-wrap-distance-top:0;mso-wrap-distance-right:9pt;mso-wrap-distance-bottom:0;mso-position-horizontal:absolute;mso-position-horizontal-relative:text;mso-position-vertical:absolute;mso-position-vertical-relative:text;v-text-anchor:top" o:gfxdata="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" filled="f" stroked="f">
-              <v:textbox>
-                <w:txbxContent>
-                  <w:p>
-                    <w:pPr>
-                      <w:spacing w:line="278" w:lineRule="auto"/>
-                      <w:ind w:right="40"/>
-                      <w:jc w:val="both"/>
-                      <w:rPr>
-                        <w:rFonts w:ascii="Tahoma" w:eastAsia="Arial" w:hAnsi="Tahoma" w:cs="Tahoma"/>
-                        <w:b/>
-                        <w:sz w:val="16"/>
-                        <w:szCs w:val="16"/>
-                      </w:rPr>
-                    </w:pPr>
-                    <w:proofErr w:type="spellStart"/>
-                    <w:r>
-                      <w:rPr>
-                        <w:rFonts w:ascii="Tahoma" w:eastAsia="Arial" w:hAnsi="Tahoma" w:cs="Tahoma"/>
-                        <w:b/>
-                        <w:sz w:val="16"/>
-                        <w:szCs w:val="16"/>
-                      </w:rPr>
-                      <w:t>Sadma</w:t>
-                    </w:r>
-                    <w:proofErr w:type="spellEnd"/>
-                    <w:r>
-                      <w:rPr>
-                        <w:rFonts w:ascii="Tahoma" w:eastAsia="Arial" w:hAnsi="Tahoma" w:cs="Tahoma"/>
-                        <w:b/>
-                        <w:sz w:val="16"/>
-                        <w:szCs w:val="16"/>
-                      </w:rPr>
-                      <w:t xml:space="preserve"> </w:t>
-                    </w:r>
-                    <w:r>
-                      <w:rPr>
-                        <w:rFonts w:ascii="Tahoma" w:hAnsi="Tahoma" w:cs="Tahoma"/>
-                        <w:b/>
-                        <w:bCs/>
-                        <w:sz w:val="16"/>
-                        <w:szCs w:val="16"/>
-                      </w:rPr>
-                      <w:t>(</w:t>
-                    </w:r>
-                    <w:proofErr w:type="spellStart"/>
-                    <w:r>
-                      <w:rPr>
-                        <w:rFonts w:ascii="Tahoma" w:eastAsia="Arial" w:hAnsi="Tahoma" w:cs="Tahoma"/>
-                        <w:b/>
-                        <w:sz w:val="16"/>
-                        <w:szCs w:val="16"/>
-                      </w:rPr>
-                      <w:t>Sadma</w:t>
-                    </w:r>
-                    <w:proofErr w:type="spellEnd"/>
-                    <w:r>
-                      <w:rPr>
-                        <w:rFonts w:ascii="Tahoma" w:eastAsia="Arial" w:hAnsi="Tahoma" w:cs="Tahoma"/>
-                        <w:b/>
-                        <w:sz w:val="16"/>
-                        <w:szCs w:val="16"/>
-                      </w:rPr>
-                      <w:t xml:space="preserve"> Fashion Wear Ltd)</w:t>
-                    </w:r>
-                  </w:p>
-                  <w:p>
-                    <w:pPr>
-                      <w:rPr>
-                        <w:sz w:val="20"/>
-                        <w:szCs w:val="20"/>
-                      </w:rPr>
-                    </w:pPr>
-                    <w:r>
-                      <w:rPr>
-                        <w:rFonts w:ascii="Arial,Bold" w:hAnsi="Arial,Bold" w:cs="Arial,Bold"/>
-                        <w:b/>
-                        <w:bCs/>
-                        <w:sz w:val="20"/>
-                        <w:szCs w:val="20"/>
-                      </w:rPr>
-                      <w:t>)</w:t>
-                    </w:r>
-                  </w:p>
-                </w:txbxContent>
-              </v:textbox>
-            </v:shape>
+            <v:group w14:anchorId="26269EEE" id="Group 116141549" o:spid="_x0000_s1028" style="position:absolute;margin-left:0;margin-top:2.35pt;width:147.9pt;height:70.9pt;z-index:251658752" coordsize="18780,9003" o:gfxdata="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">
+              <v:shapetype id="_x0000_t75" coordsize="21600,21600" o:spt="75" o:preferrelative="t" path="m@4@5l@4@11@9@11@9@5xe" filled="f" stroked="f">
+                <v:stroke joinstyle="miter"/>
+                <v:formulas>
+                  <v:f eqn="if lineDrawn pixelLineWidth 0"/>
+                  <v:f eqn="sum @0 1 0"/>
+                  <v:f eqn="sum 0 0 @1"/>
+                  <v:f eqn="prod @2 1 2"/>
+                  <v:f eqn="prod @3 21600 pixelWidth"/>
+                  <v:f eqn="prod @3 21600 pixelHeight"/>
+                  <v:f eqn="sum @0 0 1"/>
+                  <v:f eqn="prod @6 1 2"/>
+                  <v:f eqn="prod @7 21600 pixelWidth"/>
+                  <v:f eqn="sum @8 21600 0"/>
+                  <v:f eqn="prod @7 21600 pixelHeight"/>
+                  <v:f eqn="sum @10 21600 0"/>
+                </v:formulas>
+                <v:path o:extrusionok="f" gradientshapeok="t" o:connecttype="rect"/>
+                <o:lock v:ext="edit" aspectratio="t"/>
+              </v:shapetype>
+              <v:shape id="Picture2" o:spid="_x0000_s1029" type="#_x0000_t75" style="position:absolute;left:1828;width:13818;height:7594;visibility:visible;mso-wrap-style:square" o:gfxdata="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">
+                <v:imagedata r:id="rId4" o:title="" croptop="7318f" cropbottom="16153f" cropleft="9505f" cropright="8839f"/>
+              </v:shape>
+              <v:shapetype id="_x0000_t202" coordsize="21600,21600" o:spt="202" path="m,l,21600r21600,l21600,xe">
+                <v:stroke joinstyle="miter"/>
+                <v:path gradientshapeok="t" o:connecttype="rect"/>
+              </v:shapetype>
+              <v:shape id="Text Box 2" o:spid="_x0000_s1030" type="#_x0000_t202" style="position:absolute;top:6611;width:18780;height:2392;visibility:visible;mso-wrap-style:square;v-text-anchor:top" o:gfxdata="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" filled="f" stroked="f">
+                <v:textbox>
+                  <w:txbxContent>
+                    <w:p>
+                      <w:pPr>
+                        <w:rPr>
+                          <w:rFonts w:ascii="Tahoma" w:hAnsi="Tahoma" w:cs="Tahoma"/>
+                          <w:sz w:val="16"/>
+                          <w:szCs w:val="16"/>
+                          <w:lang w:val="en-IN"/>
+                        </w:rPr>
+                      </w:pPr>
+                      <w:r>
+                        <w:rPr>
+                          <w:rFonts w:ascii="Tahoma" w:hAnsi="Tahoma" w:cs="Tahoma"/>
+                          <w:sz w:val="16"/>
+                          <w:szCs w:val="16"/>
+                          <w:lang w:val="en-IN"/>
+                        </w:rPr>
+                        <w:t>AUBURN DESIGN PRIVATE LIMITED</w:t>
+                      </w:r>
+                    </w:p>
+                  </w:txbxContent>
+                </v:textbox>
+              </v:shape>
+            </v:group>
           </w:pict>
         </mc:Fallback>
       </mc:AlternateContent>
     </w:r>
-    <w:r>
-      <w:rPr>
-        <w:rFonts w:ascii="Arial" w:eastAsia="Arial" w:hAnsi="Arial" w:cs="Arial"/>
-        <w:b/>
-        <w:bCs/>
-        <w:noProof/>
-        <w:sz w:val="23"/>
-        <w:szCs w:val="23"/>
-      </w:rPr>
-      <w:drawing>
-        <wp:inline distT="0" distB="0" distL="0" distR="0" wp14:anchorId="2A4548C3" wp14:editId="36BACCBE">
-          <wp:extent cx="2057400" cy="590550"/>
-          <wp:effectExtent l="0" t="0" r="0" b="0"/>
-          <wp:docPr id="8" name="Picture 8"/>
-          <wp:cNvGraphicFramePr>
-            <a:graphicFrameLocks xmlns:a="http://schemas.openxmlformats.org/drawingml/2006/main" noChangeAspect="1"/>
-          </wp:cNvGraphicFramePr>
-          <a:graphic xmlns:a="http://schemas.openxmlformats.org/drawingml/2006/main">
-            <a:graphicData uri="http://schemas.openxmlformats.org/drawingml/2006/picture">
-              <pic:pic xmlns:pic="http://schemas.openxmlformats.org/drawingml/2006/picture">
-                <pic:nvPicPr>
-                  <pic:cNvPr id="0" name="download.png"/>
-                  <pic:cNvPicPr/>
-                </pic:nvPicPr>
-                <pic:blipFill>
-                  <a:blip r:embed="rId1">
-                    <a:extLst>
-                      <a:ext uri="{28A0092B-C50C-407E-A947-70E740481C1C}">
-                        <a14:useLocalDpi xmlns:a14="http://schemas.microsoft.com/office/drawing/2010/main" val="0"/>
-                      </a:ext>
-                    </a:extLst>
-                  </a:blip>
-                  <a:stretch>
-                    <a:fillRect/>
-                  </a:stretch>
-                </pic:blipFill>
-                <pic:spPr>
-                  <a:xfrm>
-                    <a:off x="0" y="0"/>
-                    <a:ext cx="2057400" cy="590550"/>
-                  </a:xfrm>
-                  <a:prstGeom prst="rect">
-                    <a:avLst/>
-                  </a:prstGeom>
-                </pic:spPr>
-              </pic:pic>
-            </a:graphicData>
-          </a:graphic>
-        </wp:inline>
-      </w:drawing>
-    </w:r>
-    <w:bookmarkStart w:id="0" w:name="_GoBack"/>
-    <w:bookmarkEnd w:id="0"/>
   </w:p>
   <w:p>
     <w:pPr>
@@ -2287,7 +2081,7 @@
                   <pic:cNvPicPr/>
                 </pic:nvPicPr>
                 <pic:blipFill>
-                  <a:blip r:embed="rId2">
+                  <a:blip r:embed="rId5">
                     <a:extLst>
                       <a:ext uri="{28A0092B-C50C-407E-A947-70E740481C1C}">
                         <a14:useLocalDpi xmlns:a14="http://schemas.microsoft.com/office/drawing/2010/main" val="0"/>
@@ -2328,19 +2122,9 @@
 </w:hdr>
 </file>
 
-<file path=word/header3.xml><?xml version="1.0" encoding="utf-8"?>
-<w:hdr xmlns:wpc="http://schemas.microsoft.com/office/word/2010/wordprocessingCanvas" xmlns:mc="http://schemas.openxmlformats.org/markup-compatibility/2006" xmlns:o="urn:schemas-microsoft-com:office:office" xmlns:r="http://schemas.openxmlformats.org/officeDocument/2006/relationships" xmlns:m="http://schemas.openxmlformats.org/officeDocument/2006/math" xmlns:v="urn:schemas-microsoft-com:vml" xmlns:wp14="http://schemas.microsoft.com/office/word/2010/wordprocessingDrawing" xmlns:wp="http://schemas.openxmlformats.org/drawingml/2006/wordprocessingDrawing" xmlns:w10="urn:schemas-microsoft-com:office:word" xmlns:w="http://schemas.openxmlformats.org/wordprocessingml/2006/main" xmlns:w14="http://schemas.microsoft.com/office/word/2010/wordml" xmlns:wpg="http://schemas.microsoft.com/office/word/2010/wordprocessingGroup" xmlns:wpi="http://schemas.microsoft.com/office/word/2010/wordprocessingInk" xmlns:wne="http://schemas.microsoft.com/office/word/2006/wordml" xmlns:wps="http://schemas.microsoft.com/office/word/2010/wordprocessingShape" mc:Ignorable="w14 wp14">
-  <w:p>
-    <w:pPr>
-      <w:pStyle w:val="Header"/>
-    </w:pPr>
-  </w:p>
-</w:hdr>
-</file>
-
 <file path=word/numbering.xml><?xml version="1.0" encoding="utf-8"?>
-<w:numbering xmlns:wpc="http://schemas.microsoft.com/office/word/2010/wordprocessingCanvas" xmlns:mc="http://schemas.openxmlformats.org/markup-compatibility/2006" xmlns:o="urn:schemas-microsoft-com:office:office" xmlns:r="http://schemas.openxmlformats.org/officeDocument/2006/relationships" xmlns:m="http://schemas.openxmlformats.org/officeDocument/2006/math" xmlns:v="urn:schemas-microsoft-com:vml" xmlns:wp14="http://schemas.microsoft.com/office/word/2010/wordprocessingDrawing" xmlns:wp="http://schemas.openxmlformats.org/drawingml/2006/wordprocessingDrawing" xmlns:w10="urn:schemas-microsoft-com:office:word" xmlns:w="http://schemas.openxmlformats.org/wordprocessingml/2006/main" xmlns:w14="http://schemas.microsoft.com/office/word/2010/wordml" xmlns:wpg="http://schemas.microsoft.com/office/word/2010/wordprocessingGroup" xmlns:wpi="http://schemas.microsoft.com/office/word/2010/wordprocessingInk" xmlns:wne="http://schemas.microsoft.com/office/word/2006/wordml" xmlns:wps="http://schemas.microsoft.com/office/word/2010/wordprocessingShape" mc:Ignorable="w14 wp14">
-  <w:abstractNum w:abstractNumId="0">
+<w:numbering xmlns:wpc="http://schemas.microsoft.com/office/word/2010/wordprocessingCanvas" xmlns:cx="http://schemas.microsoft.com/office/drawing/2014/chartex" xmlns:cx1="http://schemas.microsoft.com/office/drawing/2015/9/8/chartex" xmlns:cx2="http://schemas.microsoft.com/office/drawing/2015/10/21/chartex" xmlns:cx3="http://schemas.microsoft.com/office/drawing/2016/5/9/chartex" xmlns:cx4="http://schemas.microsoft.com/office/drawing/2016/5/10/chartex" xmlns:cx5="http://schemas.microsoft.com/office/drawing/2016/5/11/chartex" xmlns:cx6="http://schemas.microsoft.com/office/drawing/2016/5/12/chartex" xmlns:cx7="http://schemas.microsoft.com/office/drawing/2016/5/13/chartex" xmlns:cx8="http://schemas.microsoft.com/office/drawing/2016/5/14/chartex" xmlns:mc="http://schemas.openxmlformats.org/markup-compatibility/2006" xmlns:aink="http://schemas.microsoft.com/office/drawing/2016/ink" xmlns:am3d="http://schemas.microsoft.com/office/drawing/2017/model3d" xmlns:o="urn:schemas-microsoft-com:office:office" xmlns:oel="http://schemas.microsoft.com/office/2019/extlst" xmlns:r="http://schemas.openxmlformats.org/officeDocument/2006/relationships" xmlns:m="http://schemas.openxmlformats.org/officeDocument/2006/math" xmlns:v="urn:schemas-microsoft-com:vml" xmlns:wp14="http://schemas.microsoft.com/office/word/2010/wordprocessingDrawing" xmlns:wp="http://schemas.openxmlformats.org/drawingml/2006/wordprocessingDrawing" xmlns:w10="urn:schemas-microsoft-com:office:word" xmlns:w="http://schemas.openxmlformats.org/wordprocessingml/2006/main" xmlns:w14="http://schemas.microsoft.com/office/word/2010/wordml" xmlns:w15="http://schemas.microsoft.com/office/word/2012/wordml" xmlns:w16cex="http://schemas.microsoft.com/office/word/2018/wordml/cex" xmlns:w16cid="http://schemas.microsoft.com/office/word/2016/wordml/cid" xmlns:w16="http://schemas.microsoft.com/office/word/2018/wordml" xmlns:w16du="http://schemas.microsoft.com/office/word/2023/wordml/word16du" xmlns:w16sdtdh="http://schemas.microsoft.com/office/word/2020/wordml/sdtdatahash" xmlns:w16sdtfl="http://schemas.microsoft.com/office/word/2024/wordml/sdtformatlock" xmlns:w16se="http://schemas.microsoft.com/office/word/2015/wordml/symex" xmlns:wpg="http://schemas.microsoft.com/office/word/2010/wordprocessingGroup" xmlns:wpi="http://schemas.microsoft.com/office/word/2010/wordprocessingInk" xmlns:wne="http://schemas.microsoft.com/office/word/2006/wordml" xmlns:wps="http://schemas.microsoft.com/office/word/2010/wordprocessingShape" mc:Ignorable="w14 w15 w16se w16cid w16 w16cex w16sdtdh w16sdtfl w16du wp14">
+  <w:abstractNum w:abstractNumId="0" w15:restartNumberingAfterBreak="0">
     <w:nsid w:val="19365752"/>
     <w:multiLevelType w:val="hybridMultilevel"/>
     <w:tmpl w:val="DFA0A576"/>
@@ -2429,7 +2213,7 @@
       </w:pPr>
     </w:lvl>
   </w:abstractNum>
-  <w:abstractNum w:abstractNumId="1">
+  <w:abstractNum w:abstractNumId="1" w15:restartNumberingAfterBreak="0">
     <w:nsid w:val="19495CFF"/>
     <w:multiLevelType w:val="hybridMultilevel"/>
     <w:tmpl w:val="79CC075A"/>
@@ -2480,7 +2264,7 @@
       <w:lvlJc w:val="left"/>
     </w:lvl>
   </w:abstractNum>
-  <w:abstractNum w:abstractNumId="2">
+  <w:abstractNum w:abstractNumId="2" w15:restartNumberingAfterBreak="0">
     <w:nsid w:val="66334873"/>
     <w:multiLevelType w:val="hybridMultilevel"/>
     <w:tmpl w:val="71B6F7D8"/>
@@ -2531,7 +2315,7 @@
       <w:lvlJc w:val="left"/>
     </w:lvl>
   </w:abstractNum>
-  <w:abstractNum w:abstractNumId="3">
+  <w:abstractNum w:abstractNumId="3" w15:restartNumberingAfterBreak="0">
     <w:nsid w:val="74B0DC51"/>
     <w:multiLevelType w:val="hybridMultilevel"/>
     <w:tmpl w:val="22FA3D1C"/>
@@ -2582,23 +2366,23 @@
       <w:lvlJc w:val="left"/>
     </w:lvl>
   </w:abstractNum>
-  <w:num w:numId="1">
+  <w:num w:numId="1" w16cid:durableId="344358829">
     <w:abstractNumId w:val="2"/>
   </w:num>
-  <w:num w:numId="2">
+  <w:num w:numId="2" w16cid:durableId="374352048">
     <w:abstractNumId w:val="3"/>
   </w:num>
-  <w:num w:numId="3">
+  <w:num w:numId="3" w16cid:durableId="423842457">
     <w:abstractNumId w:val="1"/>
   </w:num>
-  <w:num w:numId="4">
+  <w:num w:numId="4" w16cid:durableId="1175656388">
     <w:abstractNumId w:val="0"/>
   </w:num>
 </w:numbering>
 </file>
 
 <file path=word/styles.xml><?xml version="1.0" encoding="utf-8"?>
-<w:styles xmlns:mc="http://schemas.openxmlformats.org/markup-compatibility/2006" xmlns:r="http://schemas.openxmlformats.org/officeDocument/2006/relationships" xmlns:w="http://schemas.openxmlformats.org/wordprocessingml/2006/main" xmlns:w14="http://schemas.microsoft.com/office/word/2010/wordml" mc:Ignorable="w14">
+<w:styles xmlns:mc="http://schemas.openxmlformats.org/markup-compatibility/2006" xmlns:r="http://schemas.openxmlformats.org/officeDocument/2006/relationships" xmlns:w="http://schemas.openxmlformats.org/wordprocessingml/2006/main" xmlns:w14="http://schemas.microsoft.com/office/word/2010/wordml" xmlns:w15="http://schemas.microsoft.com/office/word/2012/wordml" xmlns:w16cex="http://schemas.microsoft.com/office/word/2018/wordml/cex" xmlns:w16cid="http://schemas.microsoft.com/office/word/2016/wordml/cid" xmlns:w16="http://schemas.microsoft.com/office/word/2018/wordml" xmlns:w16du="http://schemas.microsoft.com/office/word/2023/wordml/word16du" xmlns:w16sdtdh="http://schemas.microsoft.com/office/word/2020/wordml/sdtdatahash" xmlns:w16sdtfl="http://schemas.microsoft.com/office/word/2024/wordml/sdtformatlock" xmlns:w16se="http://schemas.microsoft.com/office/word/2015/wordml/symex" mc:Ignorable="w14 w15 w16se w16cid w16 w16cex w16sdtdh w16sdtfl w16du">
   <w:docDefaults>
     <w:rPrDefault>
       <w:rPr>
@@ -2610,144 +2394,383 @@
     </w:rPrDefault>
     <w:pPrDefault/>
   </w:docDefaults>
-  <w:latentStyles w:defLockedState="0" w:defUIPriority="99" w:defSemiHidden="1" w:defUnhideWhenUsed="1" w:defQFormat="0" w:count="267">
-    <w:lsdException w:name="Normal" w:semiHidden="0" w:uiPriority="0" w:unhideWhenUsed="0" w:qFormat="1"/>
-    <w:lsdException w:name="heading 1" w:semiHidden="0" w:uiPriority="9" w:unhideWhenUsed="0" w:qFormat="1"/>
-    <w:lsdException w:name="heading 2" w:uiPriority="9" w:qFormat="1"/>
-    <w:lsdException w:name="heading 3" w:uiPriority="9" w:qFormat="1"/>
-    <w:lsdException w:name="heading 4" w:uiPriority="9" w:qFormat="1"/>
-    <w:lsdException w:name="heading 5" w:uiPriority="9" w:qFormat="1"/>
-    <w:lsdException w:name="heading 6" w:uiPriority="9" w:qFormat="1"/>
-    <w:lsdException w:name="heading 7" w:uiPriority="9" w:qFormat="1"/>
-    <w:lsdException w:name="heading 8" w:uiPriority="9" w:qFormat="1"/>
-    <w:lsdException w:name="heading 9" w:uiPriority="9" w:qFormat="1"/>
-    <w:lsdException w:name="toc 1" w:uiPriority="39"/>
-    <w:lsdException w:name="toc 2" w:uiPriority="39"/>
-    <w:lsdException w:name="toc 3" w:uiPriority="39"/>
-    <w:lsdException w:name="toc 4" w:uiPriority="39"/>
-    <w:lsdException w:name="toc 5" w:uiPriority="39"/>
-    <w:lsdException w:name="toc 6" w:uiPriority="39"/>
-    <w:lsdException w:name="toc 7" w:uiPriority="39"/>
-    <w:lsdException w:name="toc 8" w:uiPriority="39"/>
-    <w:lsdException w:name="toc 9" w:uiPriority="39"/>
-    <w:lsdException w:name="caption" w:uiPriority="35" w:qFormat="1"/>
-    <w:lsdException w:name="Title" w:semiHidden="0" w:uiPriority="10" w:unhideWhenUsed="0" w:qFormat="1"/>
-    <w:lsdException w:name="Default Paragraph Font" w:uiPriority="1"/>
-    <w:lsdException w:name="Subtitle" w:semiHidden="0" w:uiPriority="11" w:unhideWhenUsed="0" w:qFormat="1"/>
-    <w:lsdException w:name="Strong" w:semiHidden="0" w:uiPriority="22" w:unhideWhenUsed="0" w:qFormat="1"/>
-    <w:lsdException w:name="Emphasis" w:semiHidden="0" w:uiPriority="20" w:unhideWhenUsed="0" w:qFormat="1"/>
-    <w:lsdException w:name="Table Grid" w:semiHidden="0" w:uiPriority="39" w:unhideWhenUsed="0"/>
-    <w:lsdException w:name="Placeholder Text" w:unhideWhenUsed="0"/>
-    <w:lsdException w:name="No Spacing" w:semiHidden="0" w:uiPriority="1" w:unhideWhenUsed="0" w:qFormat="1"/>
-    <w:lsdException w:name="Light Shading" w:semiHidden="0" w:uiPriority="60" w:unhideWhenUsed="0"/>
-    <w:lsdException w:name="Light List" w:semiHidden="0" w:uiPriority="61" w:unhideWhenUsed="0"/>
-    <w:lsdException w:name="Light Grid" w:semiHidden="0" w:uiPriority="62" w:unhideWhenUsed="0"/>
-    <w:lsdException w:name="Medium Shading 1" w:semiHidden="0" w:uiPriority="63" w:unhideWhenUsed="0"/>
-    <w:lsdException w:name="Medium Shading 2" w:semiHidden="0" w:uiPriority="64" w:unhideWhenUsed="0"/>
-    <w:lsdException w:name="Medium List 1" w:semiHidden="0" w:uiPriority="65" w:unhideWhenUsed="0"/>
-    <w:lsdException w:name="Medium List 2" w:semiHidden="0" w:uiPriority="66" w:unhideWhenUsed="0"/>
-    <w:lsdException w:name="Medium Grid 1" w:semiHidden="0" w:uiPriority="67" w:unhideWhenUsed="0"/>
-    <w:lsdException w:name="Medium Grid 2" w:semiHidden="0" w:uiPriority="68" w:unhideWhenUsed="0"/>
-    <w:lsdException w:name="Medium Grid 3" w:semiHidden="0" w:uiPriority="69" w:unhideWhenUsed="0"/>
-    <w:lsdException w:name="Dark List" w:semiHidden="0" w:uiPriority="70" w:unhideWhenUsed="0"/>
-    <w:lsdException w:name="Colorful Shading" w:semiHidden="0" w:uiPriority="71" w:unhideWhenUsed="0"/>
-    <w:lsdException w:name="Colorful List" w:semiHidden="0" w:uiPriority="72" w:unhideWhenUsed="0"/>
-    <w:lsdException w:name="Colorful Grid" w:semiHidden="0" w:uiPriority="73" w:unhideWhenUsed="0"/>
-    <w:lsdException w:name="Light Shading Accent 1" w:semiHidden="0" w:uiPriority="60" w:unhideWhenUsed="0"/>
-    <w:lsdException w:name="Light List Accent 1" w:semiHidden="0" w:uiPriority="61" w:unhideWhenUsed="0"/>
-    <w:lsdException w:name="Light Grid Accent 1" w:semiHidden="0" w:uiPriority="62" w:unhideWhenUsed="0"/>
-    <w:lsdException w:name="Medium Shading 1 Accent 1" w:semiHidden="0" w:uiPriority="63" w:unhideWhenUsed="0"/>
-    <w:lsdException w:name="Medium Shading 2 Accent 1" w:semiHidden="0" w:uiPriority="64" w:unhideWhenUsed="0"/>
-    <w:lsdException w:name="Medium List 1 Accent 1" w:semiHidden="0" w:uiPriority="65" w:unhideWhenUsed="0"/>
-    <w:lsdException w:name="Revision" w:unhideWhenUsed="0"/>
-    <w:lsdException w:name="List Paragraph" w:semiHidden="0" w:uiPriority="34" w:unhideWhenUsed="0" w:qFormat="1"/>
-    <w:lsdException w:name="Quote" w:semiHidden="0" w:uiPriority="29" w:unhideWhenUsed="0" w:qFormat="1"/>
-    <w:lsdException w:name="Intense Quote" w:semiHidden="0" w:uiPriority="30" w:unhideWhenUsed="0" w:qFormat="1"/>
-    <w:lsdException w:name="Medium List 2 Accent 1" w:semiHidden="0" w:uiPriority="66" w:unhideWhenUsed="0"/>
-    <w:lsdException w:name="Medium Grid 1 Accent 1" w:semiHidden="0" w:uiPriority="67" w:unhideWhenUsed="0"/>
-    <w:lsdException w:name="Medium Grid 2 Accent 1" w:semiHidden="0" w:uiPriority="68" w:unhideWhenUsed="0"/>
-    <w:lsdException w:name="Medium Grid 3 Accent 1" w:semiHidden="0" w:uiPriority="69" w:unhideWhenUsed="0"/>
-    <w:lsdException w:name="Dark List Accent 1" w:semiHidden="0" w:uiPriority="70" w:unhideWhenUsed="0"/>
-    <w:lsdException w:name="Colorful Shading Accent 1" w:semiHidden="0" w:uiPriority="71" w:unhideWhenUsed="0"/>
-    <w:lsdException w:name="Colorful List Accent 1" w:semiHidden="0" w:uiPriority="72" w:unhideWhenUsed="0"/>
-    <w:lsdException w:name="Colorful Grid Accent 1" w:semiHidden="0" w:uiPriority="73" w:unhideWhenUsed="0"/>
-    <w:lsdException w:name="Light Shading Accent 2" w:semiHidden="0" w:uiPriority="60" w:unhideWhenUsed="0"/>
-    <w:lsdException w:name="Light List Accent 2" w:semiHidden="0" w:uiPriority="61" w:unhideWhenUsed="0"/>
-    <w:lsdException w:name="Light Grid Accent 2" w:semiHidden="0" w:uiPriority="62" w:unhideWhenUsed="0"/>
-    <w:lsdException w:name="Medium Shading 1 Accent 2" w:semiHidden="0" w:uiPriority="63" w:unhideWhenUsed="0"/>
-    <w:lsdException w:name="Medium Shading 2 Accent 2" w:semiHidden="0" w:uiPriority="64" w:unhideWhenUsed="0"/>
-    <w:lsdException w:name="Medium List 1 Accent 2" w:semiHidden="0" w:uiPriority="65" w:unhideWhenUsed="0"/>
-    <w:lsdException w:name="Medium List 2 Accent 2" w:semiHidden="0" w:uiPriority="66" w:unhideWhenUsed="0"/>
-    <w:lsdException w:name="Medium Grid 1 Accent 2" w:semiHidden="0" w:uiPriority="67" w:unhideWhenUsed="0"/>
-    <w:lsdException w:name="Medium Grid 2 Accent 2" w:semiHidden="0" w:uiPriority="68" w:unhideWhenUsed="0"/>
-    <w:lsdException w:name="Medium Grid 3 Accent 2" w:semiHidden="0" w:uiPriority="69" w:unhideWhenUsed="0"/>
-    <w:lsdException w:name="Dark List Accent 2" w:semiHidden="0" w:uiPriority="70" w:unhideWhenUsed="0"/>
-    <w:lsdException w:name="Colorful Shading Accent 2" w:semiHidden="0" w:uiPriority="71" w:unhideWhenUsed="0"/>
-    <w:lsdException w:name="Colorful List Accent 2" w:semiHidden="0" w:uiPriority="72" w:unhideWhenUsed="0"/>
-    <w:lsdException w:name="Colorful Grid Accent 2" w:semiHidden="0" w:uiPriority="73" w:unhideWhenUsed="0"/>
-    <w:lsdException w:name="Light Shading Accent 3" w:semiHidden="0" w:uiPriority="60" w:unhideWhenUsed="0"/>
-    <w:lsdException w:name="Light List Accent 3" w:semiHidden="0" w:uiPriority="61" w:unhideWhenUsed="0"/>
-    <w:lsdException w:name="Light Grid Accent 3" w:semiHidden="0" w:uiPriority="62" w:unhideWhenUsed="0"/>
-    <w:lsdException w:name="Medium Shading 1 Accent 3" w:semiHidden="0" w:uiPriority="63" w:unhideWhenUsed="0"/>
-    <w:lsdException w:name="Medium Shading 2 Accent 3" w:semiHidden="0" w:uiPriority="64" w:unhideWhenUsed="0"/>
-    <w:lsdException w:name="Medium List 1 Accent 3" w:semiHidden="0" w:uiPriority="65" w:unhideWhenUsed="0"/>
-    <w:lsdException w:name="Medium List 2 Accent 3" w:semiHidden="0" w:uiPriority="66" w:unhideWhenUsed="0"/>
-    <w:lsdException w:name="Medium Grid 1 Accent 3" w:semiHidden="0" w:uiPriority="67" w:unhideWhenUsed="0"/>
-    <w:lsdException w:name="Medium Grid 2 Accent 3" w:semiHidden="0" w:uiPriority="68" w:unhideWhenUsed="0"/>
-    <w:lsdException w:name="Medium Grid 3 Accent 3" w:semiHidden="0" w:uiPriority="69" w:unhideWhenUsed="0"/>
-    <w:lsdException w:name="Dark List Accent 3" w:semiHidden="0" w:uiPriority="70" w:unhideWhenUsed="0"/>
-    <w:lsdException w:name="Colorful Shading Accent 3" w:semiHidden="0" w:uiPriority="71" w:unhideWhenUsed="0"/>
-    <w:lsdException w:name="Colorful List Accent 3" w:semiHidden="0" w:uiPriority="72" w:unhideWhenUsed="0"/>
-    <w:lsdException w:name="Colorful Grid Accent 3" w:semiHidden="0" w:uiPriority="73" w:unhideWhenUsed="0"/>
-    <w:lsdException w:name="Light Shading Accent 4" w:semiHidden="0" w:uiPriority="60" w:unhideWhenUsed="0"/>
-    <w:lsdException w:name="Light List Accent 4" w:semiHidden="0" w:uiPriority="61" w:unhideWhenUsed="0"/>
-    <w:lsdException w:name="Light Grid Accent 4" w:semiHidden="0" w:uiPriority="62" w:unhideWhenUsed="0"/>
-    <w:lsdException w:name="Medium Shading 1 Accent 4" w:semiHidden="0" w:uiPriority="63" w:unhideWhenUsed="0"/>
-    <w:lsdException w:name="Medium Shading 2 Accent 4" w:semiHidden="0" w:uiPriority="64" w:unhideWhenUsed="0"/>
-    <w:lsdException w:name="Medium List 1 Accent 4" w:semiHidden="0" w:uiPriority="65" w:unhideWhenUsed="0"/>
-    <w:lsdException w:name="Medium List 2 Accent 4" w:semiHidden="0" w:uiPriority="66" w:unhideWhenUsed="0"/>
-    <w:lsdException w:name="Medium Grid 1 Accent 4" w:semiHidden="0" w:uiPriority="67" w:unhideWhenUsed="0"/>
-    <w:lsdException w:name="Medium Grid 2 Accent 4" w:semiHidden="0" w:uiPriority="68" w:unhideWhenUsed="0"/>
-    <w:lsdException w:name="Medium Grid 3 Accent 4" w:semiHidden="0" w:uiPriority="69" w:unhideWhenUsed="0"/>
-    <w:lsdException w:name="Dark List Accent 4" w:semiHidden="0" w:uiPriority="70" w:unhideWhenUsed="0"/>
-    <w:lsdException w:name="Colorful Shading Accent 4" w:semiHidden="0" w:uiPriority="71" w:unhideWhenUsed="0"/>
-    <w:lsdException w:name="Colorful List Accent 4" w:semiHidden="0" w:uiPriority="72" w:unhideWhenUsed="0"/>
-    <w:lsdException w:name="Colorful Grid Accent 4" w:semiHidden="0" w:uiPriority="73" w:unhideWhenUsed="0"/>
-    <w:lsdException w:name="Light Shading Accent 5" w:semiHidden="0" w:uiPriority="60" w:unhideWhenUsed="0"/>
-    <w:lsdException w:name="Light List Accent 5" w:semiHidden="0" w:uiPriority="61" w:unhideWhenUsed="0"/>
-    <w:lsdException w:name="Light Grid Accent 5" w:semiHidden="0" w:uiPriority="62" w:unhideWhenUsed="0"/>
-    <w:lsdException w:name="Medium Shading 1 Accent 5" w:semiHidden="0" w:uiPriority="63" w:unhideWhenUsed="0"/>
-    <w:lsdException w:name="Medium Shading 2 Accent 5" w:semiHidden="0" w:uiPriority="64" w:unhideWhenUsed="0"/>
-    <w:lsdException w:name="Medium List 1 Accent 5" w:semiHidden="0" w:uiPriority="65" w:unhideWhenUsed="0"/>
-    <w:lsdException w:name="Medium List 2 Accent 5" w:semiHidden="0" w:uiPriority="66" w:unhideWhenUsed="0"/>
-    <w:lsdException w:name="Medium Grid 1 Accent 5" w:semiHidden="0" w:uiPriority="67" w:unhideWhenUsed="0"/>
-    <w:lsdException w:name="Medium Grid 2 Accent 5" w:semiHidden="0" w:uiPriority="68" w:unhideWhenUsed="0"/>
-    <w:lsdException w:name="Medium Grid 3 Accent 5" w:semiHidden="0" w:uiPriority="69" w:unhideWhenUsed="0"/>
-    <w:lsdException w:name="Dark List Accent 5" w:semiHidden="0" w:uiPriority="70" w:unhideWhenUsed="0"/>
-    <w:lsdException w:name="Colorful Shading Accent 5" w:semiHidden="0" w:uiPriority="71" w:unhideWhenUsed="0"/>
-    <w:lsdException w:name="Colorful List Accent 5" w:semiHidden="0" w:uiPriority="72" w:unhideWhenUsed="0"/>
-    <w:lsdException w:name="Colorful Grid Accent 5" w:semiHidden="0" w:uiPriority="73" w:unhideWhenUsed="0"/>
-    <w:lsdException w:name="Light Shading Accent 6" w:semiHidden="0" w:uiPriority="60" w:unhideWhenUsed="0"/>
-    <w:lsdException w:name="Light List Accent 6" w:semiHidden="0" w:uiPriority="61" w:unhideWhenUsed="0"/>
-    <w:lsdException w:name="Light Grid Accent 6" w:semiHidden="0" w:uiPriority="62" w:unhideWhenUsed="0"/>
-    <w:lsdException w:name="Medium Shading 1 Accent 6" w:semiHidden="0" w:uiPriority="63" w:unhideWhenUsed="0"/>
-    <w:lsdException w:name="Medium Shading 2 Accent 6" w:semiHidden="0" w:uiPriority="64" w:unhideWhenUsed="0"/>
-    <w:lsdException w:name="Medium List 1 Accent 6" w:semiHidden="0" w:uiPriority="65" w:unhideWhenUsed="0"/>
-    <w:lsdException w:name="Medium List 2 Accent 6" w:semiHidden="0" w:uiPriority="66" w:unhideWhenUsed="0"/>
-    <w:lsdException w:name="Medium Grid 1 Accent 6" w:semiHidden="0" w:uiPriority="67" w:unhideWhenUsed="0"/>
-    <w:lsdException w:name="Medium Grid 2 Accent 6" w:semiHidden="0" w:uiPriority="68" w:unhideWhenUsed="0"/>
-    <w:lsdException w:name="Medium Grid 3 Accent 6" w:semiHidden="0" w:uiPriority="69" w:unhideWhenUsed="0"/>
-    <w:lsdException w:name="Dark List Accent 6" w:semiHidden="0" w:uiPriority="70" w:unhideWhenUsed="0"/>
-    <w:lsdException w:name="Colorful Shading Accent 6" w:semiHidden="0" w:uiPriority="71" w:unhideWhenUsed="0"/>
-    <w:lsdException w:name="Colorful List Accent 6" w:semiHidden="0" w:uiPriority="72" w:unhideWhenUsed="0"/>
-    <w:lsdException w:name="Colorful Grid Accent 6" w:semiHidden="0" w:uiPriority="73" w:unhideWhenUsed="0"/>
-    <w:lsdException w:name="Subtle Emphasis" w:semiHidden="0" w:uiPriority="19" w:unhideWhenUsed="0" w:qFormat="1"/>
-    <w:lsdException w:name="Intense Emphasis" w:semiHidden="0" w:uiPriority="21" w:unhideWhenUsed="0" w:qFormat="1"/>
-    <w:lsdException w:name="Subtle Reference" w:semiHidden="0" w:uiPriority="31" w:unhideWhenUsed="0" w:qFormat="1"/>
-    <w:lsdException w:name="Intense Reference" w:semiHidden="0" w:uiPriority="32" w:unhideWhenUsed="0" w:qFormat="1"/>
-    <w:lsdException w:name="Book Title" w:semiHidden="0" w:uiPriority="33" w:unhideWhenUsed="0" w:qFormat="1"/>
-    <w:lsdException w:name="Bibliography" w:uiPriority="37"/>
-    <w:lsdException w:name="TOC Heading" w:uiPriority="39" w:qFormat="1"/>
+  <w:latentStyles w:defLockedState="0" w:defUIPriority="99" w:defSemiHidden="0" w:defUnhideWhenUsed="0" w:defQFormat="0" w:count="376">
+    <w:lsdException w:name="Normal" w:uiPriority="0" w:qFormat="1"/>
+    <w:lsdException w:name="heading 1" w:uiPriority="9" w:qFormat="1"/>
+    <w:lsdException w:name="heading 2" w:semiHidden="1" w:uiPriority="9" w:unhideWhenUsed="1" w:qFormat="1"/>
+    <w:lsdException w:name="heading 3" w:semiHidden="1" w:uiPriority="9" w:unhideWhenUsed="1" w:qFormat="1"/>
+    <w:lsdException w:name="heading 4" w:semiHidden="1" w:uiPriority="9" w:unhideWhenUsed="1" w:qFormat="1"/>
+    <w:lsdException w:name="heading 5" w:semiHidden="1" w:uiPriority="9" w:unhideWhenUsed="1" w:qFormat="1"/>
+    <w:lsdException w:name="heading 6" w:semiHidden="1" w:uiPriority="9" w:unhideWhenUsed="1" w:qFormat="1"/>
+    <w:lsdException w:name="heading 7" w:semiHidden="1" w:uiPriority="9" w:unhideWhenUsed="1" w:qFormat="1"/>
+    <w:lsdException w:name="heading 8" w:semiHidden="1" w:uiPriority="9" w:unhideWhenUsed="1" w:qFormat="1"/>
+    <w:lsdException w:name="heading 9" w:semiHidden="1" w:uiPriority="9" w:unhideWhenUsed="1" w:qFormat="1"/>
+    <w:lsdException w:name="index 1" w:semiHidden="1" w:unhideWhenUsed="1"/>
+    <w:lsdException w:name="index 2" w:semiHidden="1" w:unhideWhenUsed="1"/>
+    <w:lsdException w:name="index 3" w:semiHidden="1" w:unhideWhenUsed="1"/>
+    <w:lsdException w:name="index 4" w:semiHidden="1" w:unhideWhenUsed="1"/>
+    <w:lsdException w:name="index 5" w:semiHidden="1" w:unhideWhenUsed="1"/>
+    <w:lsdException w:name="index 6" w:semiHidden="1" w:unhideWhenUsed="1"/>
+    <w:lsdException w:name="index 7" w:semiHidden="1" w:unhideWhenUsed="1"/>
+    <w:lsdException w:name="index 8" w:semiHidden="1" w:unhideWhenUsed="1"/>
+    <w:lsdException w:name="index 9" w:semiHidden="1" w:unhideWhenUsed="1"/>
+    <w:lsdException w:name="toc 1" w:semiHidden="1" w:uiPriority="39" w:unhideWhenUsed="1"/>
+    <w:lsdException w:name="toc 2" w:semiHidden="1" w:uiPriority="39" w:unhideWhenUsed="1"/>
+    <w:lsdException w:name="toc 3" w:semiHidden="1" w:uiPriority="39" w:unhideWhenUsed="1"/>
+    <w:lsdException w:name="toc 4" w:semiHidden="1" w:uiPriority="39" w:unhideWhenUsed="1"/>
+    <w:lsdException w:name="toc 5" w:semiHidden="1" w:uiPriority="39" w:unhideWhenUsed="1"/>
+    <w:lsdException w:name="toc 6" w:semiHidden="1" w:uiPriority="39" w:unhideWhenUsed="1"/>
+    <w:lsdException w:name="toc 7" w:semiHidden="1" w:uiPriority="39" w:unhideWhenUsed="1"/>
+    <w:lsdException w:name="toc 8" w:semiHidden="1" w:uiPriority="39" w:unhideWhenUsed="1"/>
+    <w:lsdException w:name="toc 9" w:semiHidden="1" w:uiPriority="39" w:unhideWhenUsed="1"/>
+    <w:lsdException w:name="Normal Indent" w:semiHidden="1" w:unhideWhenUsed="1"/>
+    <w:lsdException w:name="footnote text" w:semiHidden="1" w:unhideWhenUsed="1"/>
+    <w:lsdException w:name="annotation text" w:semiHidden="1" w:unhideWhenUsed="1"/>
+    <w:lsdException w:name="header" w:semiHidden="1" w:unhideWhenUsed="1"/>
+    <w:lsdException w:name="footer" w:semiHidden="1" w:unhideWhenUsed="1"/>
+    <w:lsdException w:name="index heading" w:semiHidden="1" w:unhideWhenUsed="1"/>
+    <w:lsdException w:name="caption" w:semiHidden="1" w:uiPriority="35" w:unhideWhenUsed="1" w:qFormat="1"/>
+    <w:lsdException w:name="table of figures" w:semiHidden="1" w:unhideWhenUsed="1"/>
+    <w:lsdException w:name="envelope address" w:semiHidden="1" w:unhideWhenUsed="1"/>
+    <w:lsdException w:name="envelope return" w:semiHidden="1" w:unhideWhenUsed="1"/>
+    <w:lsdException w:name="footnote reference" w:semiHidden="1" w:unhideWhenUsed="1"/>
+    <w:lsdException w:name="annotation reference" w:semiHidden="1" w:unhideWhenUsed="1"/>
+    <w:lsdException w:name="line number" w:semiHidden="1" w:unhideWhenUsed="1"/>
+    <w:lsdException w:name="page number" w:semiHidden="1" w:unhideWhenUsed="1"/>
+    <w:lsdException w:name="endnote reference" w:semiHidden="1" w:unhideWhenUsed="1"/>
+    <w:lsdException w:name="endnote text" w:semiHidden="1" w:unhideWhenUsed="1"/>
+    <w:lsdException w:name="table of authorities" w:semiHidden="1" w:unhideWhenUsed="1"/>
+    <w:lsdException w:name="macro" w:semiHidden="1" w:unhideWhenUsed="1"/>
+    <w:lsdException w:name="toa heading" w:semiHidden="1" w:unhideWhenUsed="1"/>
+    <w:lsdException w:name="List" w:semiHidden="1" w:unhideWhenUsed="1"/>
+    <w:lsdException w:name="List Bullet" w:semiHidden="1" w:unhideWhenUsed="1"/>
+    <w:lsdException w:name="List Number" w:semiHidden="1" w:unhideWhenUsed="1"/>
+    <w:lsdException w:name="List 2" w:semiHidden="1" w:unhideWhenUsed="1"/>
+    <w:lsdException w:name="List 3" w:semiHidden="1" w:unhideWhenUsed="1"/>
+    <w:lsdException w:name="List 4" w:semiHidden="1" w:unhideWhenUsed="1"/>
+    <w:lsdException w:name="List 5" w:semiHidden="1" w:unhideWhenUsed="1"/>
+    <w:lsdException w:name="List Bullet 2" w:semiHidden="1" w:unhideWhenUsed="1"/>
+    <w:lsdException w:name="List Bullet 3" w:semiHidden="1" w:unhideWhenUsed="1"/>
+    <w:lsdException w:name="List Bullet 4" w:semiHidden="1" w:unhideWhenUsed="1"/>
+    <w:lsdException w:name="List Bullet 5" w:semiHidden="1" w:unhideWhenUsed="1"/>
+    <w:lsdException w:name="List Number 2" w:semiHidden="1" w:unhideWhenUsed="1"/>
+    <w:lsdException w:name="List Number 3" w:semiHidden="1" w:unhideWhenUsed="1"/>
+    <w:lsdException w:name="List Number 4" w:semiHidden="1" w:unhideWhenUsed="1"/>
+    <w:lsdException w:name="List Number 5" w:semiHidden="1" w:unhideWhenUsed="1"/>
+    <w:lsdException w:name="Title" w:uiPriority="10" w:qFormat="1"/>
+    <w:lsdException w:name="Closing" w:semiHidden="1" w:unhideWhenUsed="1"/>
+    <w:lsdException w:name="Signature" w:semiHidden="1" w:unhideWhenUsed="1"/>
+    <w:lsdException w:name="Default Paragraph Font" w:semiHidden="1" w:uiPriority="1" w:unhideWhenUsed="1"/>
+    <w:lsdException w:name="Body Text" w:semiHidden="1" w:unhideWhenUsed="1"/>
+    <w:lsdException w:name="Body Text Indent" w:semiHidden="1" w:unhideWhenUsed="1"/>
+    <w:lsdException w:name="List Continue" w:semiHidden="1" w:unhideWhenUsed="1"/>
+    <w:lsdException w:name="List Continue 2" w:semiHidden="1" w:unhideWhenUsed="1"/>
+    <w:lsdException w:name="List Continue 3" w:semiHidden="1" w:unhideWhenUsed="1"/>
+    <w:lsdException w:name="List Continue 4" w:semiHidden="1" w:unhideWhenUsed="1"/>
+    <w:lsdException w:name="List Continue 5" w:semiHidden="1" w:unhideWhenUsed="1"/>
+    <w:lsdException w:name="Message Header" w:semiHidden="1" w:unhideWhenUsed="1"/>
+    <w:lsdException w:name="Subtitle" w:uiPriority="11" w:qFormat="1"/>
+    <w:lsdException w:name="Salutation" w:semiHidden="1" w:unhideWhenUsed="1"/>
+    <w:lsdException w:name="Date" w:semiHidden="1" w:unhideWhenUsed="1"/>
+    <w:lsdException w:name="Body Text First Indent" w:semiHidden="1" w:unhideWhenUsed="1"/>
+    <w:lsdException w:name="Body Text First Indent 2" w:semiHidden="1" w:unhideWhenUsed="1"/>
+    <w:lsdException w:name="Note Heading" w:semiHidden="1" w:unhideWhenUsed="1"/>
+    <w:lsdException w:name="Body Text 2" w:semiHidden="1" w:unhideWhenUsed="1"/>
+    <w:lsdException w:name="Body Text 3" w:semiHidden="1" w:unhideWhenUsed="1"/>
+    <w:lsdException w:name="Body Text Indent 2" w:semiHidden="1" w:unhideWhenUsed="1"/>
+    <w:lsdException w:name="Body Text Indent 3" w:semiHidden="1" w:unhideWhenUsed="1"/>
+    <w:lsdException w:name="Block Text" w:semiHidden="1" w:unhideWhenUsed="1"/>
+    <w:lsdException w:name="Hyperlink" w:semiHidden="1" w:unhideWhenUsed="1"/>
+    <w:lsdException w:name="FollowedHyperlink" w:semiHidden="1" w:unhideWhenUsed="1"/>
+    <w:lsdException w:name="Strong" w:uiPriority="22" w:qFormat="1"/>
+    <w:lsdException w:name="Emphasis" w:uiPriority="20" w:qFormat="1"/>
+    <w:lsdException w:name="Document Map" w:semiHidden="1" w:unhideWhenUsed="1"/>
+    <w:lsdException w:name="Plain Text" w:semiHidden="1" w:unhideWhenUsed="1"/>
+    <w:lsdException w:name="E-mail Signature" w:semiHidden="1" w:unhideWhenUsed="1"/>
+    <w:lsdException w:name="HTML Top of Form" w:semiHidden="1" w:unhideWhenUsed="1"/>
+    <w:lsdException w:name="HTML Bottom of Form" w:semiHidden="1" w:unhideWhenUsed="1"/>
+    <w:lsdException w:name="Normal (Web)" w:semiHidden="1" w:unhideWhenUsed="1"/>
+    <w:lsdException w:name="HTML Acronym" w:semiHidden="1" w:unhideWhenUsed="1"/>
+    <w:lsdException w:name="HTML Address" w:semiHidden="1" w:unhideWhenUsed="1"/>
+    <w:lsdException w:name="HTML Cite" w:semiHidden="1" w:unhideWhenUsed="1"/>
+    <w:lsdException w:name="HTML Code" w:semiHidden="1" w:unhideWhenUsed="1"/>
+    <w:lsdException w:name="HTML Definition" w:semiHidden="1" w:unhideWhenUsed="1"/>
+    <w:lsdException w:name="HTML Keyboard" w:semiHidden="1" w:unhideWhenUsed="1"/>
+    <w:lsdException w:name="HTML Preformatted" w:semiHidden="1" w:unhideWhenUsed="1"/>
+    <w:lsdException w:name="HTML Sample" w:semiHidden="1" w:unhideWhenUsed="1"/>
+    <w:lsdException w:name="HTML Typewriter" w:semiHidden="1" w:unhideWhenUsed="1"/>
+    <w:lsdException w:name="HTML Variable" w:semiHidden="1" w:unhideWhenUsed="1"/>
+    <w:lsdException w:name="Normal Table" w:semiHidden="1" w:unhideWhenUsed="1"/>
+    <w:lsdException w:name="annotation subject" w:semiHidden="1" w:unhideWhenUsed="1"/>
+    <w:lsdException w:name="No List" w:semiHidden="1" w:unhideWhenUsed="1"/>
+    <w:lsdException w:name="Outline List 1" w:semiHidden="1" w:unhideWhenUsed="1"/>
+    <w:lsdException w:name="Outline List 2" w:semiHidden="1" w:unhideWhenUsed="1"/>
+    <w:lsdException w:name="Outline List 3" w:semiHidden="1" w:unhideWhenUsed="1"/>
+    <w:lsdException w:name="Table Simple 1" w:semiHidden="1" w:unhideWhenUsed="1"/>
+    <w:lsdException w:name="Table Simple 2" w:semiHidden="1" w:unhideWhenUsed="1"/>
+    <w:lsdException w:name="Table Simple 3" w:semiHidden="1" w:unhideWhenUsed="1"/>
+    <w:lsdException w:name="Table Classic 1" w:semiHidden="1" w:unhideWhenUsed="1"/>
+    <w:lsdException w:name="Table Classic 2" w:semiHidden="1" w:unhideWhenUsed="1"/>
+    <w:lsdException w:name="Table Classic 3" w:semiHidden="1" w:unhideWhenUsed="1"/>
+    <w:lsdException w:name="Table Classic 4" w:semiHidden="1" w:unhideWhenUsed="1"/>
+    <w:lsdException w:name="Table Colorful 1" w:semiHidden="1" w:unhideWhenUsed="1"/>
+    <w:lsdException w:name="Table Colorful 2" w:semiHidden="1" w:unhideWhenUsed="1"/>
+    <w:lsdException w:name="Table Colorful 3" w:semiHidden="1" w:unhideWhenUsed="1"/>
+    <w:lsdException w:name="Table Columns 1" w:semiHidden="1" w:unhideWhenUsed="1"/>
+    <w:lsdException w:name="Table Columns 2" w:semiHidden="1" w:unhideWhenUsed="1"/>
+    <w:lsdException w:name="Table Columns 3" w:semiHidden="1" w:unhideWhenUsed="1"/>
+    <w:lsdException w:name="Table Columns 4" w:semiHidden="1" w:unhideWhenUsed="1"/>
+    <w:lsdException w:name="Table Columns 5" w:semiHidden="1" w:unhideWhenUsed="1"/>
+    <w:lsdException w:name="Table Grid 1" w:semiHidden="1" w:unhideWhenUsed="1"/>
+    <w:lsdException w:name="Table Grid 2" w:semiHidden="1" w:unhideWhenUsed="1"/>
+    <w:lsdException w:name="Table Grid 3" w:semiHidden="1" w:unhideWhenUsed="1"/>
+    <w:lsdException w:name="Table Grid 4" w:semiHidden="1" w:unhideWhenUsed="1"/>
+    <w:lsdException w:name="Table Grid 5" w:semiHidden="1" w:unhideWhenUsed="1"/>
+    <w:lsdException w:name="Table Grid 6" w:semiHidden="1" w:unhideWhenUsed="1"/>
+    <w:lsdException w:name="Table Grid 7" w:semiHidden="1" w:unhideWhenUsed="1"/>
+    <w:lsdException w:name="Table Grid 8" w:semiHidden="1" w:unhideWhenUsed="1"/>
+    <w:lsdException w:name="Table List 1" w:semiHidden="1" w:unhideWhenUsed="1"/>
+    <w:lsdException w:name="Table List 2" w:semiHidden="1" w:unhideWhenUsed="1"/>
+    <w:lsdException w:name="Table List 3" w:semiHidden="1" w:unhideWhenUsed="1"/>
+    <w:lsdException w:name="Table List 4" w:semiHidden="1" w:unhideWhenUsed="1"/>
+    <w:lsdException w:name="Table List 5" w:semiHidden="1" w:unhideWhenUsed="1"/>
+    <w:lsdException w:name="Table List 6" w:semiHidden="1" w:unhideWhenUsed="1"/>
+    <w:lsdException w:name="Table List 7" w:semiHidden="1" w:unhideWhenUsed="1"/>
+    <w:lsdException w:name="Table List 8" w:semiHidden="1" w:unhideWhenUsed="1"/>
+    <w:lsdException w:name="Table 3D effects 1" w:semiHidden="1" w:unhideWhenUsed="1"/>
+    <w:lsdException w:name="Table 3D effects 2" w:semiHidden="1" w:unhideWhenUsed="1"/>
+    <w:lsdException w:name="Table 3D effects 3" w:semiHidden="1" w:unhideWhenUsed="1"/>
+    <w:lsdException w:name="Table Contemporary" w:semiHidden="1" w:unhideWhenUsed="1"/>
+    <w:lsdException w:name="Table Elegant" w:semiHidden="1" w:unhideWhenUsed="1"/>
+    <w:lsdException w:name="Table Professional" w:semiHidden="1" w:unhideWhenUsed="1"/>
+    <w:lsdException w:name="Table Subtle 1" w:semiHidden="1" w:unhideWhenUsed="1"/>
+    <w:lsdException w:name="Table Subtle 2" w:semiHidden="1" w:unhideWhenUsed="1"/>
+    <w:lsdException w:name="Table Web 1" w:semiHidden="1" w:unhideWhenUsed="1"/>
+    <w:lsdException w:name="Table Web 2" w:semiHidden="1" w:unhideWhenUsed="1"/>
+    <w:lsdException w:name="Table Web 3" w:semiHidden="1" w:unhideWhenUsed="1"/>
+    <w:lsdException w:name="Balloon Text" w:semiHidden="1" w:unhideWhenUsed="1"/>
+    <w:lsdException w:name="Table Grid" w:uiPriority="39"/>
+    <w:lsdException w:name="Table Theme" w:semiHidden="1" w:unhideWhenUsed="1"/>
+    <w:lsdException w:name="Placeholder Text" w:semiHidden="1"/>
+    <w:lsdException w:name="No Spacing" w:uiPriority="1" w:qFormat="1"/>
+    <w:lsdException w:name="Light Shading" w:uiPriority="60"/>
+    <w:lsdException w:name="Light List" w:uiPriority="61"/>
+    <w:lsdException w:name="Light Grid" w:uiPriority="62"/>
+    <w:lsdException w:name="Medium Shading 1" w:uiPriority="63"/>
+    <w:lsdException w:name="Medium Shading 2" w:uiPriority="64"/>
+    <w:lsdException w:name="Medium List 1" w:uiPriority="65"/>
+    <w:lsdException w:name="Medium List 2" w:uiPriority="66"/>
+    <w:lsdException w:name="Medium Grid 1" w:uiPriority="67"/>
+    <w:lsdException w:name="Medium Grid 2" w:uiPriority="68"/>
+    <w:lsdException w:name="Medium Grid 3" w:uiPriority="69"/>
+    <w:lsdException w:name="Dark List" w:uiPriority="70"/>
+    <w:lsdException w:name="Colorful Shading" w:uiPriority="71"/>
+    <w:lsdException w:name="Colorful List" w:uiPriority="72"/>
+    <w:lsdException w:name="Colorful Grid" w:uiPriority="73"/>
+    <w:lsdException w:name="Light Shading Accent 1" w:uiPriority="60"/>
+    <w:lsdException w:name="Light List Accent 1" w:uiPriority="61"/>
+    <w:lsdException w:name="Light Grid Accent 1" w:uiPriority="62"/>
+    <w:lsdException w:name="Medium Shading 1 Accent 1" w:uiPriority="63"/>
+    <w:lsdException w:name="Medium Shading 2 Accent 1" w:uiPriority="64"/>
+    <w:lsdException w:name="Medium List 1 Accent 1" w:uiPriority="65"/>
+    <w:lsdException w:name="Revision" w:semiHidden="1"/>
+    <w:lsdException w:name="List Paragraph" w:uiPriority="34" w:qFormat="1"/>
+    <w:lsdException w:name="Quote" w:uiPriority="29" w:qFormat="1"/>
+    <w:lsdException w:name="Intense Quote" w:uiPriority="30" w:qFormat="1"/>
+    <w:lsdException w:name="Medium List 2 Accent 1" w:uiPriority="66"/>
+    <w:lsdException w:name="Medium Grid 1 Accent 1" w:uiPriority="67"/>
+    <w:lsdException w:name="Medium Grid 2 Accent 1" w:uiPriority="68"/>
+    <w:lsdException w:name="Medium Grid 3 Accent 1" w:uiPriority="69"/>
+    <w:lsdException w:name="Dark List Accent 1" w:uiPriority="70"/>
+    <w:lsdException w:name="Colorful Shading Accent 1" w:uiPriority="71"/>
+    <w:lsdException w:name="Colorful List Accent 1" w:uiPriority="72"/>
+    <w:lsdException w:name="Colorful Grid Accent 1" w:uiPriority="73"/>
+    <w:lsdException w:name="Light Shading Accent 2" w:uiPriority="60"/>
+    <w:lsdException w:name="Light List Accent 2" w:uiPriority="61"/>
+    <w:lsdException w:name="Light Grid Accent 2" w:uiPriority="62"/>
+    <w:lsdException w:name="Medium Shading 1 Accent 2" w:uiPriority="63"/>
+    <w:lsdException w:name="Medium Shading 2 Accent 2" w:uiPriority="64"/>
+    <w:lsdException w:name="Medium List 1 Accent 2" w:uiPriority="65"/>
+    <w:lsdException w:name="Medium List 2 Accent 2" w:uiPriority="66"/>
+    <w:lsdException w:name="Medium Grid 1 Accent 2" w:uiPriority="67"/>
+    <w:lsdException w:name="Medium Grid 2 Accent 2" w:uiPriority="68"/>
+    <w:lsdException w:name="Medium Grid 3 Accent 2" w:uiPriority="69"/>
+    <w:lsdException w:name="Dark List Accent 2" w:uiPriority="70"/>
+    <w:lsdException w:name="Colorful Shading Accent 2" w:uiPriority="71"/>
+    <w:lsdException w:name="Colorful List Accent 2" w:uiPriority="72"/>
+    <w:lsdException w:name="Colorful Grid Accent 2" w:uiPriority="73"/>
+    <w:lsdException w:name="Light Shading Accent 3" w:uiPriority="60"/>
+    <w:lsdException w:name="Light List Accent 3" w:uiPriority="61"/>
+    <w:lsdException w:name="Light Grid Accent 3" w:uiPriority="62"/>
+    <w:lsdException w:name="Medium Shading 1 Accent 3" w:uiPriority="63"/>
+    <w:lsdException w:name="Medium Shading 2 Accent 3" w:uiPriority="64"/>
+    <w:lsdException w:name="Medium List 1 Accent 3" w:uiPriority="65"/>
+    <w:lsdException w:name="Medium List 2 Accent 3" w:uiPriority="66"/>
+    <w:lsdException w:name="Medium Grid 1 Accent 3" w:uiPriority="67"/>
+    <w:lsdException w:name="Medium Grid 2 Accent 3" w:uiPriority="68"/>
+    <w:lsdException w:name="Medium Grid 3 Accent 3" w:uiPriority="69"/>
+    <w:lsdException w:name="Dark List Accent 3" w:uiPriority="70"/>
+    <w:lsdException w:name="Colorful Shading Accent 3" w:uiPriority="71"/>
+    <w:lsdException w:name="Colorful List Accent 3" w:uiPriority="72"/>
+    <w:lsdException w:name="Colorful Grid Accent 3" w:uiPriority="73"/>
+    <w:lsdException w:name="Light Shading Accent 4" w:uiPriority="60"/>
+    <w:lsdException w:name="Light List Accent 4" w:uiPriority="61"/>
+    <w:lsdException w:name="Light Grid Accent 4" w:uiPriority="62"/>
+    <w:lsdException w:name="Medium Shading 1 Accent 4" w:uiPriority="63"/>
+    <w:lsdException w:name="Medium Shading 2 Accent 4" w:uiPriority="64"/>
+    <w:lsdException w:name="Medium List 1 Accent 4" w:uiPriority="65"/>
+    <w:lsdException w:name="Medium List 2 Accent 4" w:uiPriority="66"/>
+    <w:lsdException w:name="Medium Grid 1 Accent 4" w:uiPriority="67"/>
+    <w:lsdException w:name="Medium Grid 2 Accent 4" w:uiPriority="68"/>
+    <w:lsdException w:name="Medium Grid 3 Accent 4" w:uiPriority="69"/>
+    <w:lsdException w:name="Dark List Accent 4" w:uiPriority="70"/>
+    <w:lsdException w:name="Colorful Shading Accent 4" w:uiPriority="71"/>
+    <w:lsdException w:name="Colorful List Accent 4" w:uiPriority="72"/>
+    <w:lsdException w:name="Colorful Grid Accent 4" w:uiPriority="73"/>
+    <w:lsdException w:name="Light Shading Accent 5" w:uiPriority="60"/>
+    <w:lsdException w:name="Light List Accent 5" w:uiPriority="61"/>
+    <w:lsdException w:name="Light Grid Accent 5" w:uiPriority="62"/>
+    <w:lsdException w:name="Medium Shading 1 Accent 5" w:uiPriority="63"/>
+    <w:lsdException w:name="Medium Shading 2 Accent 5" w:uiPriority="64"/>
+    <w:lsdException w:name="Medium List 1 Accent 5" w:uiPriority="65"/>
+    <w:lsdException w:name="Medium List 2 Accent 5" w:uiPriority="66"/>
+    <w:lsdException w:name="Medium Grid 1 Accent 5" w:uiPriority="67"/>
+    <w:lsdException w:name="Medium Grid 2 Accent 5" w:uiPriority="68"/>
+    <w:lsdException w:name="Medium Grid 3 Accent 5" w:uiPriority="69"/>
+    <w:lsdException w:name="Dark List Accent 5" w:uiPriority="70"/>
+    <w:lsdException w:name="Colorful Shading Accent 5" w:uiPriority="71"/>
+    <w:lsdException w:name="Colorful List Accent 5" w:uiPriority="72"/>
+    <w:lsdException w:name="Colorful Grid Accent 5" w:uiPriority="73"/>
+    <w:lsdException w:name="Light Shading Accent 6" w:uiPriority="60"/>
+    <w:lsdException w:name="Light List Accent 6" w:uiPriority="61"/>
+    <w:lsdException w:name="Light Grid Accent 6" w:uiPriority="62"/>
+    <w:lsdException w:name="Medium Shading 1 Accent 6" w:uiPriority="63"/>
+    <w:lsdException w:name="Medium Shading 2 Accent 6" w:uiPriority="64"/>
+    <w:lsdException w:name="Medium List 1 Accent 6" w:uiPriority="65"/>
+    <w:lsdException w:name="Medium List 2 Accent 6" w:uiPriority="66"/>
+    <w:lsdException w:name="Medium Grid 1 Accent 6" w:uiPriority="67"/>
+    <w:lsdException w:name="Medium Grid 2 Accent 6" w:uiPriority="68"/>
+    <w:lsdException w:name="Medium Grid 3 Accent 6" w:uiPriority="69"/>
+    <w:lsdException w:name="Dark List Accent 6" w:uiPriority="70"/>
+    <w:lsdException w:name="Colorful Shading Accent 6" w:uiPriority="71"/>
+    <w:lsdException w:name="Colorful List Accent 6" w:uiPriority="72"/>
+    <w:lsdException w:name="Colorful Grid Accent 6" w:uiPriority="73"/>
+    <w:lsdException w:name="Subtle Emphasis" w:uiPriority="19" w:qFormat="1"/>
+    <w:lsdException w:name="Intense Emphasis" w:uiPriority="21" w:qFormat="1"/>
+    <w:lsdException w:name="Subtle Reference" w:uiPriority="31" w:qFormat="1"/>
+    <w:lsdException w:name="Intense Reference" w:uiPriority="32" w:qFormat="1"/>
+    <w:lsdException w:name="Book Title" w:uiPriority="33" w:qFormat="1"/>
+    <w:lsdException w:name="Bibliography" w:semiHidden="1" w:uiPriority="37" w:unhideWhenUsed="1"/>
+    <w:lsdException w:name="TOC Heading" w:semiHidden="1" w:uiPriority="39" w:unhideWhenUsed="1" w:qFormat="1"/>
+    <w:lsdException w:name="Plain Table 1" w:uiPriority="41"/>
+    <w:lsdException w:name="Plain Table 2" w:uiPriority="42"/>
+    <w:lsdException w:name="Plain Table 3" w:uiPriority="43"/>
+    <w:lsdException w:name="Plain Table 4" w:uiPriority="44"/>
+    <w:lsdException w:name="Plain Table 5" w:uiPriority="45"/>
+    <w:lsdException w:name="Grid Table Light" w:uiPriority="40"/>
+    <w:lsdException w:name="Grid Table 1 Light" w:uiPriority="46"/>
+    <w:lsdException w:name="Grid Table 2" w:uiPriority="47"/>
+    <w:lsdException w:name="Grid Table 3" w:uiPriority="48"/>
+    <w:lsdException w:name="Grid Table 4" w:uiPriority="49"/>
+    <w:lsdException w:name="Grid Table 5 Dark" w:uiPriority="50"/>
+    <w:lsdException w:name="Grid Table 6 Colorful" w:uiPriority="51"/>
+    <w:lsdException w:name="Grid Table 7 Colorful" w:uiPriority="52"/>
+    <w:lsdException w:name="Grid Table 1 Light Accent 1" w:uiPriority="46"/>
+    <w:lsdException w:name="Grid Table 2 Accent 1" w:uiPriority="47"/>
+    <w:lsdException w:name="Grid Table 3 Accent 1" w:uiPriority="48"/>
+    <w:lsdException w:name="Grid Table 4 Accent 1" w:uiPriority="49"/>
+    <w:lsdException w:name="Grid Table 5 Dark Accent 1" w:uiPriority="50"/>
+    <w:lsdException w:name="Grid Table 6 Colorful Accent 1" w:uiPriority="51"/>
+    <w:lsdException w:name="Grid Table 7 Colorful Accent 1" w:uiPriority="52"/>
+    <w:lsdException w:name="Grid Table 1 Light Accent 2" w:uiPriority="46"/>
+    <w:lsdException w:name="Grid Table 2 Accent 2" w:uiPriority="47"/>
+    <w:lsdException w:name="Grid Table 3 Accent 2" w:uiPriority="48"/>
+    <w:lsdException w:name="Grid Table 4 Accent 2" w:uiPriority="49"/>
+    <w:lsdException w:name="Grid Table 5 Dark Accent 2" w:uiPriority="50"/>
+    <w:lsdException w:name="Grid Table 6 Colorful Accent 2" w:uiPriority="51"/>
+    <w:lsdException w:name="Grid Table 7 Colorful Accent 2" w:uiPriority="52"/>
+    <w:lsdException w:name="Grid Table 1 Light Accent 3" w:uiPriority="46"/>
+    <w:lsdException w:name="Grid Table 2 Accent 3" w:uiPriority="47"/>
+    <w:lsdException w:name="Grid Table 3 Accent 3" w:uiPriority="48"/>
+    <w:lsdException w:name="Grid Table 4 Accent 3" w:uiPriority="49"/>
+    <w:lsdException w:name="Grid Table 5 Dark Accent 3" w:uiPriority="50"/>
+    <w:lsdException w:name="Grid Table 6 Colorful Accent 3" w:uiPriority="51"/>
+    <w:lsdException w:name="Grid Table 7 Colorful Accent 3" w:uiPriority="52"/>
+    <w:lsdException w:name="Grid Table 1 Light Accent 4" w:uiPriority="46"/>
+    <w:lsdException w:name="Grid Table 2 Accent 4" w:uiPriority="47"/>
+    <w:lsdException w:name="Grid Table 3 Accent 4" w:uiPriority="48"/>
+    <w:lsdException w:name="Grid Table 4 Accent 4" w:uiPriority="49"/>
+    <w:lsdException w:name="Grid Table 5 Dark Accent 4" w:uiPriority="50"/>
+    <w:lsdException w:name="Grid Table 6 Colorful Accent 4" w:uiPriority="51"/>
+    <w:lsdException w:name="Grid Table 7 Colorful Accent 4" w:uiPriority="52"/>
+    <w:lsdException w:name="Grid Table 1 Light Accent 5" w:uiPriority="46"/>
+    <w:lsdException w:name="Grid Table 2 Accent 5" w:uiPriority="47"/>
+    <w:lsdException w:name="Grid Table 3 Accent 5" w:uiPriority="48"/>
+    <w:lsdException w:name="Grid Table 4 Accent 5" w:uiPriority="49"/>
+    <w:lsdException w:name="Grid Table 5 Dark Accent 5" w:uiPriority="50"/>
+    <w:lsdException w:name="Grid Table 6 Colorful Accent 5" w:uiPriority="51"/>
+    <w:lsdException w:name="Grid Table 7 Colorful Accent 5" w:uiPriority="52"/>
+    <w:lsdException w:name="Grid Table 1 Light Accent 6" w:uiPriority="46"/>
+    <w:lsdException w:name="Grid Table 2 Accent 6" w:uiPriority="47"/>
+    <w:lsdException w:name="Grid Table 3 Accent 6" w:uiPriority="48"/>
+    <w:lsdException w:name="Grid Table 4 Accent 6" w:uiPriority="49"/>
+    <w:lsdException w:name="Grid Table 5 Dark Accent 6" w:uiPriority="50"/>
+    <w:lsdException w:name="Grid Table 6 Colorful Accent 6" w:uiPriority="51"/>
+    <w:lsdException w:name="Grid Table 7 Colorful Accent 6" w:uiPriority="52"/>
+    <w:lsdException w:name="List Table 1 Light" w:uiPriority="46"/>
+    <w:lsdException w:name="List Table 2" w:uiPriority="47"/>
+    <w:lsdException w:name="List Table 3" w:uiPriority="48"/>
+    <w:lsdException w:name="List Table 4" w:uiPriority="49"/>
+    <w:lsdException w:name="List Table 5 Dark" w:uiPriority="50"/>
+    <w:lsdException w:name="List Table 6 Colorful" w:uiPriority="51"/>
+    <w:lsdException w:name="List Table 7 Colorful" w:uiPriority="52"/>
+    <w:lsdException w:name="List Table 1 Light Accent 1" w:uiPriority="46"/>
+    <w:lsdException w:name="List Table 2 Accent 1" w:uiPriority="47"/>
+    <w:lsdException w:name="List Table 3 Accent 1" w:uiPriority="48"/>
+    <w:lsdException w:name="List Table 4 Accent 1" w:uiPriority="49"/>
+    <w:lsdException w:name="List Table 5 Dark Accent 1" w:uiPriority="50"/>
+    <w:lsdException w:name="List Table 6 Colorful Accent 1" w:uiPriority="51"/>
+    <w:lsdException w:name="List Table 7 Colorful Accent 1" w:uiPriority="52"/>
+    <w:lsdException w:name="List Table 1 Light Accent 2" w:uiPriority="46"/>
+    <w:lsdException w:name="List Table 2 Accent 2" w:uiPriority="47"/>
+    <w:lsdException w:name="List Table 3 Accent 2" w:uiPriority="48"/>
+    <w:lsdException w:name="List Table 4 Accent 2" w:uiPriority="49"/>
+    <w:lsdException w:name="List Table 5 Dark Accent 2" w:uiPriority="50"/>
+    <w:lsdException w:name="List Table 6 Colorful Accent 2" w:uiPriority="51"/>
+    <w:lsdException w:name="List Table 7 Colorful Accent 2" w:uiPriority="52"/>
+    <w:lsdException w:name="List Table 1 Light Accent 3" w:uiPriority="46"/>
+    <w:lsdException w:name="List Table 2 Accent 3" w:uiPriority="47"/>
+    <w:lsdException w:name="List Table 3 Accent 3" w:uiPriority="48"/>
+    <w:lsdException w:name="List Table 4 Accent 3" w:uiPriority="49"/>
+    <w:lsdException w:name="List Table 5 Dark Accent 3" w:uiPriority="50"/>
+    <w:lsdException w:name="List Table 6 Colorful Accent 3" w:uiPriority="51"/>
+    <w:lsdException w:name="List Table 7 Colorful Accent 3" w:uiPriority="52"/>
+    <w:lsdException w:name="List Table 1 Light Accent 4" w:uiPriority="46"/>
+    <w:lsdException w:name="List Table 2 Accent 4" w:uiPriority="47"/>
+    <w:lsdException w:name="List Table 3 Accent 4" w:uiPriority="48"/>
+    <w:lsdException w:name="List Table 4 Accent 4" w:uiPriority="49"/>
+    <w:lsdException w:name="List Table 5 Dark Accent 4" w:uiPriority="50"/>
+    <w:lsdException w:name="List Table 6 Colorful Accent 4" w:uiPriority="51"/>
+    <w:lsdException w:name="List Table 7 Colorful Accent 4" w:uiPriority="52"/>
+    <w:lsdException w:name="List Table 1 Light Accent 5" w:uiPriority="46"/>
+    <w:lsdException w:name="List Table 2 Accent 5" w:uiPriority="47"/>
+    <w:lsdException w:name="List Table 3 Accent 5" w:uiPriority="48"/>
+    <w:lsdException w:name="List Table 4 Accent 5" w:uiPriority="49"/>
+    <w:lsdException w:name="List Table 5 Dark Accent 5" w:uiPriority="50"/>
+    <w:lsdException w:name="List Table 6 Colorful Accent 5" w:uiPriority="51"/>
+    <w:lsdException w:name="List Table 7 Colorful Accent 5" w:uiPriority="52"/>
+    <w:lsdException w:name="List Table 1 Light Accent 6" w:uiPriority="46"/>
+    <w:lsdException w:name="List Table 2 Accent 6" w:uiPriority="47"/>
+    <w:lsdException w:name="List Table 3 Accent 6" w:uiPriority="48"/>
+    <w:lsdException w:name="List Table 4 Accent 6" w:uiPriority="49"/>
+    <w:lsdException w:name="List Table 5 Dark Accent 6" w:uiPriority="50"/>
+    <w:lsdException w:name="List Table 6 Colorful Accent 6" w:uiPriority="51"/>
+    <w:lsdException w:name="List Table 7 Colorful Accent 6" w:uiPriority="52"/>
+    <w:lsdException w:name="Mention" w:semiHidden="1" w:unhideWhenUsed="1"/>
+    <w:lsdException w:name="Smart Hyperlink" w:semiHidden="1" w:unhideWhenUsed="1"/>
+    <w:lsdException w:name="Hashtag" w:semiHidden="1" w:unhideWhenUsed="1"/>
+    <w:lsdException w:name="Unresolved Mention" w:semiHidden="1" w:unhideWhenUsed="1"/>
+    <w:lsdException w:name="Smart Link" w:semiHidden="1" w:unhideWhenUsed="1"/>
   </w:latentStyles>
   <w:style w:type="paragraph" w:default="1" w:styleId="Normal">
     <w:name w:val="Normal"/>
@@ -2756,7 +2779,6 @@
   <w:style w:type="character" w:default="1" w:styleId="DefaultParagraphFont">
     <w:name w:val="Default Paragraph Font"/>
     <w:uiPriority w:val="1"/>
-    <w:semiHidden/>
     <w:unhideWhenUsed/>
   </w:style>
   <w:style w:type="table" w:default="1" w:styleId="TableNormal">
@@ -2946,357 +2968,16 @@
     <w:basedOn w:val="DefaultParagraphFont"/>
     <w:rsid w:val="00A8551F"/>
   </w:style>
-</w:styles>
-</file>
-
-<file path=word/stylesWithEffects.xml><?xml version="1.0" encoding="utf-8"?>
-<w:styles xmlns:wpc="http://schemas.microsoft.com/office/word/2010/wordprocessingCanvas" xmlns:mc="http://schemas.openxmlformats.org/markup-compatibility/2006" xmlns:o="urn:schemas-microsoft-com:office:office" xmlns:r="http://schemas.openxmlformats.org/officeDocument/2006/relationships" xmlns:m="http://schemas.openxmlformats.org/officeDocument/2006/math" xmlns:v="urn:schemas-microsoft-com:vml" xmlns:wp14="http://schemas.microsoft.com/office/word/2010/wordprocessingDrawing" xmlns:wp="http://schemas.openxmlformats.org/drawingml/2006/wordprocessingDrawing" xmlns:w10="urn:schemas-microsoft-com:office:word" xmlns:w="http://schemas.openxmlformats.org/wordprocessingml/2006/main" xmlns:w14="http://schemas.microsoft.com/office/word/2010/wordml" xmlns:wpg="http://schemas.microsoft.com/office/word/2010/wordprocessingGroup" xmlns:wpi="http://schemas.microsoft.com/office/word/2010/wordprocessingInk" xmlns:wne="http://schemas.microsoft.com/office/word/2006/wordml" xmlns:wps="http://schemas.microsoft.com/office/word/2010/wordprocessingShape" mc:Ignorable="w14 wp14">
-  <w:docDefaults>
-    <w:rPrDefault>
-      <w:rPr>
-        <w:rFonts w:asciiTheme="minorHAnsi" w:eastAsiaTheme="minorHAnsi" w:hAnsiTheme="minorHAnsi" w:cstheme="minorBidi"/>
-        <w:sz w:val="22"/>
-        <w:szCs w:val="22"/>
-        <w:lang w:val="en-US" w:eastAsia="en-US" w:bidi="ar-SA"/>
-      </w:rPr>
-    </w:rPrDefault>
-    <w:pPrDefault/>
-  </w:docDefaults>
-  <w:latentStyles w:defLockedState="0" w:defUIPriority="99" w:defSemiHidden="1" w:defUnhideWhenUsed="1" w:defQFormat="0" w:count="267">
-    <w:lsdException w:name="Normal" w:semiHidden="0" w:uiPriority="0" w:unhideWhenUsed="0" w:qFormat="1"/>
-    <w:lsdException w:name="heading 1" w:semiHidden="0" w:uiPriority="9" w:unhideWhenUsed="0" w:qFormat="1"/>
-    <w:lsdException w:name="heading 2" w:uiPriority="9" w:qFormat="1"/>
-    <w:lsdException w:name="heading 3" w:uiPriority="9" w:qFormat="1"/>
-    <w:lsdException w:name="heading 4" w:uiPriority="9" w:qFormat="1"/>
-    <w:lsdException w:name="heading 5" w:uiPriority="9" w:qFormat="1"/>
-    <w:lsdException w:name="heading 6" w:uiPriority="9" w:qFormat="1"/>
-    <w:lsdException w:name="heading 7" w:uiPriority="9" w:qFormat="1"/>
-    <w:lsdException w:name="heading 8" w:uiPriority="9" w:qFormat="1"/>
-    <w:lsdException w:name="heading 9" w:uiPriority="9" w:qFormat="1"/>
-    <w:lsdException w:name="toc 1" w:uiPriority="39"/>
-    <w:lsdException w:name="toc 2" w:uiPriority="39"/>
-    <w:lsdException w:name="toc 3" w:uiPriority="39"/>
-    <w:lsdException w:name="toc 4" w:uiPriority="39"/>
-    <w:lsdException w:name="toc 5" w:uiPriority="39"/>
-    <w:lsdException w:name="toc 6" w:uiPriority="39"/>
-    <w:lsdException w:name="toc 7" w:uiPriority="39"/>
-    <w:lsdException w:name="toc 8" w:uiPriority="39"/>
-    <w:lsdException w:name="toc 9" w:uiPriority="39"/>
-    <w:lsdException w:name="caption" w:uiPriority="35" w:qFormat="1"/>
-    <w:lsdException w:name="Title" w:semiHidden="0" w:uiPriority="10" w:unhideWhenUsed="0" w:qFormat="1"/>
-    <w:lsdException w:name="Default Paragraph Font" w:uiPriority="1"/>
-    <w:lsdException w:name="Subtitle" w:semiHidden="0" w:uiPriority="11" w:unhideWhenUsed="0" w:qFormat="1"/>
-    <w:lsdException w:name="Strong" w:semiHidden="0" w:uiPriority="22" w:unhideWhenUsed="0" w:qFormat="1"/>
-    <w:lsdException w:name="Emphasis" w:semiHidden="0" w:uiPriority="20" w:unhideWhenUsed="0" w:qFormat="1"/>
-    <w:lsdException w:name="Table Grid" w:semiHidden="0" w:uiPriority="39" w:unhideWhenUsed="0"/>
-    <w:lsdException w:name="Placeholder Text" w:unhideWhenUsed="0"/>
-    <w:lsdException w:name="No Spacing" w:semiHidden="0" w:uiPriority="1" w:unhideWhenUsed="0" w:qFormat="1"/>
-    <w:lsdException w:name="Light Shading" w:semiHidden="0" w:uiPriority="60" w:unhideWhenUsed="0"/>
-    <w:lsdException w:name="Light List" w:semiHidden="0" w:uiPriority="61" w:unhideWhenUsed="0"/>
-    <w:lsdException w:name="Light Grid" w:semiHidden="0" w:uiPriority="62" w:unhideWhenUsed="0"/>
-    <w:lsdException w:name="Medium Shading 1" w:semiHidden="0" w:uiPriority="63" w:unhideWhenUsed="0"/>
-    <w:lsdException w:name="Medium Shading 2" w:semiHidden="0" w:uiPriority="64" w:unhideWhenUsed="0"/>
-    <w:lsdException w:name="Medium List 1" w:semiHidden="0" w:uiPriority="65" w:unhideWhenUsed="0"/>
-    <w:lsdException w:name="Medium List 2" w:semiHidden="0" w:uiPriority="66" w:unhideWhenUsed="0"/>
-    <w:lsdException w:name="Medium Grid 1" w:semiHidden="0" w:uiPriority="67" w:unhideWhenUsed="0"/>
-    <w:lsdException w:name="Medium Grid 2" w:semiHidden="0" w:uiPriority="68" w:unhideWhenUsed="0"/>
-    <w:lsdException w:name="Medium Grid 3" w:semiHidden="0" w:uiPriority="69" w:unhideWhenUsed="0"/>
-    <w:lsdException w:name="Dark List" w:semiHidden="0" w:uiPriority="70" w:unhideWhenUsed="0"/>
-    <w:lsdException w:name="Colorful Shading" w:semiHidden="0" w:uiPriority="71" w:unhideWhenUsed="0"/>
-    <w:lsdException w:name="Colorful List" w:semiHidden="0" w:uiPriority="72" w:unhideWhenUsed="0"/>
-    <w:lsdException w:name="Colorful Grid" w:semiHidden="0" w:uiPriority="73" w:unhideWhenUsed="0"/>
-    <w:lsdException w:name="Light Shading Accent 1" w:semiHidden="0" w:uiPriority="60" w:unhideWhenUsed="0"/>
-    <w:lsdException w:name="Light List Accent 1" w:semiHidden="0" w:uiPriority="61" w:unhideWhenUsed="0"/>
-    <w:lsdException w:name="Light Grid Accent 1" w:semiHidden="0" w:uiPriority="62" w:unhideWhenUsed="0"/>
-    <w:lsdException w:name="Medium Shading 1 Accent 1" w:semiHidden="0" w:uiPriority="63" w:unhideWhenUsed="0"/>
-    <w:lsdException w:name="Medium Shading 2 Accent 1" w:semiHidden="0" w:uiPriority="64" w:unhideWhenUsed="0"/>
-    <w:lsdException w:name="Medium List 1 Accent 1" w:semiHidden="0" w:uiPriority="65" w:unhideWhenUsed="0"/>
-    <w:lsdException w:name="Revision" w:unhideWhenUsed="0"/>
-    <w:lsdException w:name="List Paragraph" w:semiHidden="0" w:uiPriority="34" w:unhideWhenUsed="0" w:qFormat="1"/>
-    <w:lsdException w:name="Quote" w:semiHidden="0" w:uiPriority="29" w:unhideWhenUsed="0" w:qFormat="1"/>
-    <w:lsdException w:name="Intense Quote" w:semiHidden="0" w:uiPriority="30" w:unhideWhenUsed="0" w:qFormat="1"/>
-    <w:lsdException w:name="Medium List 2 Accent 1" w:semiHidden="0" w:uiPriority="66" w:unhideWhenUsed="0"/>
-    <w:lsdException w:name="Medium Grid 1 Accent 1" w:semiHidden="0" w:uiPriority="67" w:unhideWhenUsed="0"/>
-    <w:lsdException w:name="Medium Grid 2 Accent 1" w:semiHidden="0" w:uiPriority="68" w:unhideWhenUsed="0"/>
-    <w:lsdException w:name="Medium Grid 3 Accent 1" w:semiHidden="0" w:uiPriority="69" w:unhideWhenUsed="0"/>
-    <w:lsdException w:name="Dark List Accent 1" w:semiHidden="0" w:uiPriority="70" w:unhideWhenUsed="0"/>
-    <w:lsdException w:name="Colorful Shading Accent 1" w:semiHidden="0" w:uiPriority="71" w:unhideWhenUsed="0"/>
-    <w:lsdException w:name="Colorful List Accent 1" w:semiHidden="0" w:uiPriority="72" w:unhideWhenUsed="0"/>
-    <w:lsdException w:name="Colorful Grid Accent 1" w:semiHidden="0" w:uiPriority="73" w:unhideWhenUsed="0"/>
-    <w:lsdException w:name="Light Shading Accent 2" w:semiHidden="0" w:uiPriority="60" w:unhideWhenUsed="0"/>
-    <w:lsdException w:name="Light List Accent 2" w:semiHidden="0" w:uiPriority="61" w:unhideWhenUsed="0"/>
-    <w:lsdException w:name="Light Grid Accent 2" w:semiHidden="0" w:uiPriority="62" w:unhideWhenUsed="0"/>
-    <w:lsdException w:name="Medium Shading 1 Accent 2" w:semiHidden="0" w:uiPriority="63" w:unhideWhenUsed="0"/>
-    <w:lsdException w:name="Medium Shading 2 Accent 2" w:semiHidden="0" w:uiPriority="64" w:unhideWhenUsed="0"/>
-    <w:lsdException w:name="Medium List 1 Accent 2" w:semiHidden="0" w:uiPriority="65" w:unhideWhenUsed="0"/>
-    <w:lsdException w:name="Medium List 2 Accent 2" w:semiHidden="0" w:uiPriority="66" w:unhideWhenUsed="0"/>
-    <w:lsdException w:name="Medium Grid 1 Accent 2" w:semiHidden="0" w:uiPriority="67" w:unhideWhenUsed="0"/>
-    <w:lsdException w:name="Medium Grid 2 Accent 2" w:semiHidden="0" w:uiPriority="68" w:unhideWhenUsed="0"/>
-    <w:lsdException w:name="Medium Grid 3 Accent 2" w:semiHidden="0" w:uiPriority="69" w:unhideWhenUsed="0"/>
-    <w:lsdException w:name="Dark List Accent 2" w:semiHidden="0" w:uiPriority="70" w:unhideWhenUsed="0"/>
-    <w:lsdException w:name="Colorful Shading Accent 2" w:semiHidden="0" w:uiPriority="71" w:unhideWhenUsed="0"/>
-    <w:lsdException w:name="Colorful List Accent 2" w:semiHidden="0" w:uiPriority="72" w:unhideWhenUsed="0"/>
-    <w:lsdException w:name="Colorful Grid Accent 2" w:semiHidden="0" w:uiPriority="73" w:unhideWhenUsed="0"/>
-    <w:lsdException w:name="Light Shading Accent 3" w:semiHidden="0" w:uiPriority="60" w:unhideWhenUsed="0"/>
-    <w:lsdException w:name="Light List Accent 3" w:semiHidden="0" w:uiPriority="61" w:unhideWhenUsed="0"/>
-    <w:lsdException w:name="Light Grid Accent 3" w:semiHidden="0" w:uiPriority="62" w:unhideWhenUsed="0"/>
-    <w:lsdException w:name="Medium Shading 1 Accent 3" w:semiHidden="0" w:uiPriority="63" w:unhideWhenUsed="0"/>
-    <w:lsdException w:name="Medium Shading 2 Accent 3" w:semiHidden="0" w:uiPriority="64" w:unhideWhenUsed="0"/>
-    <w:lsdException w:name="Medium List 1 Accent 3" w:semiHidden="0" w:uiPriority="65" w:unhideWhenUsed="0"/>
-    <w:lsdException w:name="Medium List 2 Accent 3" w:semiHidden="0" w:uiPriority="66" w:unhideWhenUsed="0"/>
-    <w:lsdException w:name="Medium Grid 1 Accent 3" w:semiHidden="0" w:uiPriority="67" w:unhideWhenUsed="0"/>
-    <w:lsdException w:name="Medium Grid 2 Accent 3" w:semiHidden="0" w:uiPriority="68" w:unhideWhenUsed="0"/>
-    <w:lsdException w:name="Medium Grid 3 Accent 3" w:semiHidden="0" w:uiPriority="69" w:unhideWhenUsed="0"/>
-    <w:lsdException w:name="Dark List Accent 3" w:semiHidden="0" w:uiPriority="70" w:unhideWhenUsed="0"/>
-    <w:lsdException w:name="Colorful Shading Accent 3" w:semiHidden="0" w:uiPriority="71" w:unhideWhenUsed="0"/>
-    <w:lsdException w:name="Colorful List Accent 3" w:semiHidden="0" w:uiPriority="72" w:unhideWhenUsed="0"/>
-    <w:lsdException w:name="Colorful Grid Accent 3" w:semiHidden="0" w:uiPriority="73" w:unhideWhenUsed="0"/>
-    <w:lsdException w:name="Light Shading Accent 4" w:semiHidden="0" w:uiPriority="60" w:unhideWhenUsed="0"/>
-    <w:lsdException w:name="Light List Accent 4" w:semiHidden="0" w:uiPriority="61" w:unhideWhenUsed="0"/>
-    <w:lsdException w:name="Light Grid Accent 4" w:semiHidden="0" w:uiPriority="62" w:unhideWhenUsed="0"/>
-    <w:lsdException w:name="Medium Shading 1 Accent 4" w:semiHidden="0" w:uiPriority="63" w:unhideWhenUsed="0"/>
-    <w:lsdException w:name="Medium Shading 2 Accent 4" w:semiHidden="0" w:uiPriority="64" w:unhideWhenUsed="0"/>
-    <w:lsdException w:name="Medium List 1 Accent 4" w:semiHidden="0" w:uiPriority="65" w:unhideWhenUsed="0"/>
-    <w:lsdException w:name="Medium List 2 Accent 4" w:semiHidden="0" w:uiPriority="66" w:unhideWhenUsed="0"/>
-    <w:lsdException w:name="Medium Grid 1 Accent 4" w:semiHidden="0" w:uiPriority="67" w:unhideWhenUsed="0"/>
-    <w:lsdException w:name="Medium Grid 2 Accent 4" w:semiHidden="0" w:uiPriority="68" w:unhideWhenUsed="0"/>
-    <w:lsdException w:name="Medium Grid 3 Accent 4" w:semiHidden="0" w:uiPriority="69" w:unhideWhenUsed="0"/>
-    <w:lsdException w:name="Dark List Accent 4" w:semiHidden="0" w:uiPriority="70" w:unhideWhenUsed="0"/>
-    <w:lsdException w:name="Colorful Shading Accent 4" w:semiHidden="0" w:uiPriority="71" w:unhideWhenUsed="0"/>
-    <w:lsdException w:name="Colorful List Accent 4" w:semiHidden="0" w:uiPriority="72" w:unhideWhenUsed="0"/>
-    <w:lsdException w:name="Colorful Grid Accent 4" w:semiHidden="0" w:uiPriority="73" w:unhideWhenUsed="0"/>
-    <w:lsdException w:name="Light Shading Accent 5" w:semiHidden="0" w:uiPriority="60" w:unhideWhenUsed="0"/>
-    <w:lsdException w:name="Light List Accent 5" w:semiHidden="0" w:uiPriority="61" w:unhideWhenUsed="0"/>
-    <w:lsdException w:name="Light Grid Accent 5" w:semiHidden="0" w:uiPriority="62" w:unhideWhenUsed="0"/>
-    <w:lsdException w:name="Medium Shading 1 Accent 5" w:semiHidden="0" w:uiPriority="63" w:unhideWhenUsed="0"/>
-    <w:lsdException w:name="Medium Shading 2 Accent 5" w:semiHidden="0" w:uiPriority="64" w:unhideWhenUsed="0"/>
-    <w:lsdException w:name="Medium List 1 Accent 5" w:semiHidden="0" w:uiPriority="65" w:unhideWhenUsed="0"/>
-    <w:lsdException w:name="Medium List 2 Accent 5" w:semiHidden="0" w:uiPriority="66" w:unhideWhenUsed="0"/>
-    <w:lsdException w:name="Medium Grid 1 Accent 5" w:semiHidden="0" w:uiPriority="67" w:unhideWhenUsed="0"/>
-    <w:lsdException w:name="Medium Grid 2 Accent 5" w:semiHidden="0" w:uiPriority="68" w:unhideWhenUsed="0"/>
-    <w:lsdException w:name="Medium Grid 3 Accent 5" w:semiHidden="0" w:uiPriority="69" w:unhideWhenUsed="0"/>
-    <w:lsdException w:name="Dark List Accent 5" w:semiHidden="0" w:uiPriority="70" w:unhideWhenUsed="0"/>
-    <w:lsdException w:name="Colorful Shading Accent 5" w:semiHidden="0" w:uiPriority="71" w:unhideWhenUsed="0"/>
-    <w:lsdException w:name="Colorful List Accent 5" w:semiHidden="0" w:uiPriority="72" w:unhideWhenUsed="0"/>
-    <w:lsdException w:name="Colorful Grid Accent 5" w:semiHidden="0" w:uiPriority="73" w:unhideWhenUsed="0"/>
-    <w:lsdException w:name="Light Shading Accent 6" w:semiHidden="0" w:uiPriority="60" w:unhideWhenUsed="0"/>
-    <w:lsdException w:name="Light List Accent 6" w:semiHidden="0" w:uiPriority="61" w:unhideWhenUsed="0"/>
-    <w:lsdException w:name="Light Grid Accent 6" w:semiHidden="0" w:uiPriority="62" w:unhideWhenUsed="0"/>
-    <w:lsdException w:name="Medium Shading 1 Accent 6" w:semiHidden="0" w:uiPriority="63" w:unhideWhenUsed="0"/>
-    <w:lsdException w:name="Medium Shading 2 Accent 6" w:semiHidden="0" w:uiPriority="64" w:unhideWhenUsed="0"/>
-    <w:lsdException w:name="Medium List 1 Accent 6" w:semiHidden="0" w:uiPriority="65" w:unhideWhenUsed="0"/>
-    <w:lsdException w:name="Medium List 2 Accent 6" w:semiHidden="0" w:uiPriority="66" w:unhideWhenUsed="0"/>
-    <w:lsdException w:name="Medium Grid 1 Accent 6" w:semiHidden="0" w:uiPriority="67" w:unhideWhenUsed="0"/>
-    <w:lsdException w:name="Medium Grid 2 Accent 6" w:semiHidden="0" w:uiPriority="68" w:unhideWhenUsed="0"/>
-    <w:lsdException w:name="Medium Grid 3 Accent 6" w:semiHidden="0" w:uiPriority="69" w:unhideWhenUsed="0"/>
-    <w:lsdException w:name="Dark List Accent 6" w:semiHidden="0" w:uiPriority="70" w:unhideWhenUsed="0"/>
-    <w:lsdException w:name="Colorful Shading Accent 6" w:semiHidden="0" w:uiPriority="71" w:unhideWhenUsed="0"/>
-    <w:lsdException w:name="Colorful List Accent 6" w:semiHidden="0" w:uiPriority="72" w:unhideWhenUsed="0"/>
-    <w:lsdException w:name="Colorful Grid Accent 6" w:semiHidden="0" w:uiPriority="73" w:unhideWhenUsed="0"/>
-    <w:lsdException w:name="Subtle Emphasis" w:semiHidden="0" w:uiPriority="19" w:unhideWhenUsed="0" w:qFormat="1"/>
-    <w:lsdException w:name="Intense Emphasis" w:semiHidden="0" w:uiPriority="21" w:unhideWhenUsed="0" w:qFormat="1"/>
-    <w:lsdException w:name="Subtle Reference" w:semiHidden="0" w:uiPriority="31" w:unhideWhenUsed="0" w:qFormat="1"/>
-    <w:lsdException w:name="Intense Reference" w:semiHidden="0" w:uiPriority="32" w:unhideWhenUsed="0" w:qFormat="1"/>
-    <w:lsdException w:name="Book Title" w:semiHidden="0" w:uiPriority="33" w:unhideWhenUsed="0" w:qFormat="1"/>
-    <w:lsdException w:name="Bibliography" w:uiPriority="37"/>
-    <w:lsdException w:name="TOC Heading" w:uiPriority="39" w:qFormat="1"/>
-  </w:latentStyles>
-  <w:style w:type="paragraph" w:default="1" w:styleId="Normal">
-    <w:name w:val="Normal"/>
-    <w:qFormat/>
-  </w:style>
-  <w:style w:type="character" w:default="1" w:styleId="DefaultParagraphFont">
-    <w:name w:val="Default Paragraph Font"/>
-    <w:uiPriority w:val="1"/>
-    <w:semiHidden/>
-    <w:unhideWhenUsed/>
-  </w:style>
-  <w:style w:type="table" w:default="1" w:styleId="TableNormal">
-    <w:name w:val="Normal Table"/>
-    <w:uiPriority w:val="99"/>
-    <w:semiHidden/>
-    <w:unhideWhenUsed/>
-    <w:tblPr>
-      <w:tblInd w:w="0" w:type="dxa"/>
-      <w:tblCellMar>
-        <w:top w:w="0" w:type="dxa"/>
-        <w:left w:w="108" w:type="dxa"/>
-        <w:bottom w:w="0" w:type="dxa"/>
-        <w:right w:w="108" w:type="dxa"/>
-      </w:tblCellMar>
-    </w:tblPr>
-  </w:style>
-  <w:style w:type="numbering" w:default="1" w:styleId="NoList">
-    <w:name w:val="No List"/>
-    <w:uiPriority w:val="99"/>
-    <w:semiHidden/>
-    <w:unhideWhenUsed/>
-  </w:style>
-  <w:style w:type="table" w:styleId="TableGrid">
-    <w:name w:val="Table Grid"/>
-    <w:basedOn w:val="TableNormal"/>
-    <w:uiPriority w:val="39"/>
-    <w:rsid w:val="00E11788"/>
-    <w:tblPr>
-      <w:tblBorders>
-        <w:top w:val="single" w:sz="4" w:space="0" w:color="auto"/>
-        <w:left w:val="single" w:sz="4" w:space="0" w:color="auto"/>
-        <w:bottom w:val="single" w:sz="4" w:space="0" w:color="auto"/>
-        <w:right w:val="single" w:sz="4" w:space="0" w:color="auto"/>
-        <w:insideH w:val="single" w:sz="4" w:space="0" w:color="auto"/>
-        <w:insideV w:val="single" w:sz="4" w:space="0" w:color="auto"/>
-      </w:tblBorders>
-    </w:tblPr>
-  </w:style>
-  <w:style w:type="paragraph" w:styleId="Header">
-    <w:name w:val="header"/>
-    <w:basedOn w:val="Normal"/>
-    <w:link w:val="HeaderChar"/>
+  <w:style w:type="character" w:styleId="Hyperlink">
+    <w:name w:val="Hyperlink"/>
+    <w:basedOn w:val="DefaultParagraphFont"/>
     <w:uiPriority w:val="99"/>
     <w:unhideWhenUsed/>
-    <w:rsid w:val="005E1A34"/>
-    <w:pPr>
-      <w:tabs>
-        <w:tab w:val="center" w:pos="4680"/>
-        <w:tab w:val="right" w:pos="9360"/>
-      </w:tabs>
-    </w:pPr>
-  </w:style>
-  <w:style w:type="character" w:customStyle="1" w:styleId="HeaderChar">
-    <w:name w:val="Header Char"/>
-    <w:basedOn w:val="DefaultParagraphFont"/>
-    <w:link w:val="Header"/>
-    <w:uiPriority w:val="99"/>
-    <w:rsid w:val="005E1A34"/>
-  </w:style>
-  <w:style w:type="paragraph" w:styleId="Footer">
-    <w:name w:val="footer"/>
-    <w:basedOn w:val="Normal"/>
-    <w:link w:val="FooterChar"/>
-    <w:uiPriority w:val="99"/>
-    <w:unhideWhenUsed/>
-    <w:rsid w:val="005E1A34"/>
-    <w:pPr>
-      <w:tabs>
-        <w:tab w:val="center" w:pos="4680"/>
-        <w:tab w:val="right" w:pos="9360"/>
-      </w:tabs>
-    </w:pPr>
-  </w:style>
-  <w:style w:type="character" w:customStyle="1" w:styleId="FooterChar">
-    <w:name w:val="Footer Char"/>
-    <w:basedOn w:val="DefaultParagraphFont"/>
-    <w:link w:val="Footer"/>
-    <w:uiPriority w:val="99"/>
-    <w:rsid w:val="005E1A34"/>
-  </w:style>
-  <w:style w:type="character" w:styleId="CommentReference">
-    <w:name w:val="annotation reference"/>
-    <w:basedOn w:val="DefaultParagraphFont"/>
-    <w:uiPriority w:val="99"/>
-    <w:semiHidden/>
-    <w:unhideWhenUsed/>
-    <w:rsid w:val="0025478F"/>
+    <w:rsid w:val="0051053A"/>
     <w:rPr>
-      <w:sz w:val="16"/>
-      <w:szCs w:val="16"/>
+      <w:color w:val="0563C1" w:themeColor="hyperlink"/>
+      <w:u w:val="single"/>
     </w:rPr>
-  </w:style>
-  <w:style w:type="paragraph" w:styleId="CommentText">
-    <w:name w:val="annotation text"/>
-    <w:basedOn w:val="Normal"/>
-    <w:link w:val="CommentTextChar"/>
-    <w:uiPriority w:val="99"/>
-    <w:semiHidden/>
-    <w:unhideWhenUsed/>
-    <w:rsid w:val="0025478F"/>
-    <w:rPr>
-      <w:sz w:val="20"/>
-      <w:szCs w:val="20"/>
-    </w:rPr>
-  </w:style>
-  <w:style w:type="character" w:customStyle="1" w:styleId="CommentTextChar">
-    <w:name w:val="Comment Text Char"/>
-    <w:basedOn w:val="DefaultParagraphFont"/>
-    <w:link w:val="CommentText"/>
-    <w:uiPriority w:val="99"/>
-    <w:semiHidden/>
-    <w:rsid w:val="0025478F"/>
-    <w:rPr>
-      <w:sz w:val="20"/>
-      <w:szCs w:val="20"/>
-    </w:rPr>
-  </w:style>
-  <w:style w:type="paragraph" w:styleId="CommentSubject">
-    <w:name w:val="annotation subject"/>
-    <w:basedOn w:val="CommentText"/>
-    <w:next w:val="CommentText"/>
-    <w:link w:val="CommentSubjectChar"/>
-    <w:uiPriority w:val="99"/>
-    <w:semiHidden/>
-    <w:unhideWhenUsed/>
-    <w:rsid w:val="0025478F"/>
-    <w:rPr>
-      <w:b/>
-      <w:bCs/>
-    </w:rPr>
-  </w:style>
-  <w:style w:type="character" w:customStyle="1" w:styleId="CommentSubjectChar">
-    <w:name w:val="Comment Subject Char"/>
-    <w:basedOn w:val="CommentTextChar"/>
-    <w:link w:val="CommentSubject"/>
-    <w:uiPriority w:val="99"/>
-    <w:semiHidden/>
-    <w:rsid w:val="0025478F"/>
-    <w:rPr>
-      <w:b/>
-      <w:bCs/>
-      <w:sz w:val="20"/>
-      <w:szCs w:val="20"/>
-    </w:rPr>
-  </w:style>
-  <w:style w:type="paragraph" w:styleId="BalloonText">
-    <w:name w:val="Balloon Text"/>
-    <w:basedOn w:val="Normal"/>
-    <w:link w:val="BalloonTextChar"/>
-    <w:uiPriority w:val="99"/>
-    <w:semiHidden/>
-    <w:unhideWhenUsed/>
-    <w:rsid w:val="0025478F"/>
-    <w:rPr>
-      <w:rFonts w:ascii="Segoe UI" w:hAnsi="Segoe UI" w:cs="Segoe UI"/>
-      <w:sz w:val="18"/>
-      <w:szCs w:val="18"/>
-    </w:rPr>
-  </w:style>
-  <w:style w:type="character" w:customStyle="1" w:styleId="BalloonTextChar">
-    <w:name w:val="Balloon Text Char"/>
-    <w:basedOn w:val="DefaultParagraphFont"/>
-    <w:link w:val="BalloonText"/>
-    <w:uiPriority w:val="99"/>
-    <w:semiHidden/>
-    <w:rsid w:val="0025478F"/>
-    <w:rPr>
-      <w:rFonts w:ascii="Segoe UI" w:hAnsi="Segoe UI" w:cs="Segoe UI"/>
-      <w:sz w:val="18"/>
-      <w:szCs w:val="18"/>
-    </w:rPr>
-  </w:style>
-  <w:style w:type="paragraph" w:styleId="ListParagraph">
-    <w:name w:val="List Paragraph"/>
-    <w:basedOn w:val="Normal"/>
-    <w:uiPriority w:val="34"/>
-    <w:qFormat/>
-    <w:rsid w:val="00024A4C"/>
-    <w:pPr>
-      <w:ind w:left="720"/>
-      <w:contextualSpacing/>
-    </w:pPr>
-  </w:style>
-  <w:style w:type="character" w:customStyle="1" w:styleId="lrzxr">
-    <w:name w:val="lrzxr"/>
-    <w:basedOn w:val="DefaultParagraphFont"/>
-    <w:rsid w:val="00A8551F"/>
   </w:style>
 </w:styles>
 </file>
@@ -3590,7 +3271,7 @@
   <a:extraClrSchemeLst/>
   <a:extLst>
     <a:ext uri="{05A4C25C-085E-4340-85A3-A5531E510DB2}">
-      <thm15:themeFamily xmlns="" xmlns:thm15="http://schemas.microsoft.com/office/thememl/2012/main" name="Office Theme" id="{62F939B6-93AF-4DB8-9C6B-D6C7DFDC589F}" vid="{4A3C46E8-61CC-4603-A589-7422A47A8E4A}"/>
+      <thm15:themeFamily xmlns:thm15="http://schemas.microsoft.com/office/thememl/2012/main" name="Office Theme" id="{62F939B6-93AF-4DB8-9C6B-D6C7DFDC589F}" vid="{4A3C46E8-61CC-4603-A589-7422A47A8E4A}"/>
     </a:ext>
   </a:extLst>
 </a:theme>

</xml_diff>